<commit_message>
Added the title page and declaration
</commit_message>
<xml_diff>
--- a/Capstone Project 2026.docx
+++ b/Capstone Project 2026.docx
@@ -2,6 +2,1155 @@
 <file path=word/document.xml><?xml version="1.0" encoding="utf-8"?>
 <w:document xmlns:wpc="http://schemas.microsoft.com/office/word/2010/wordprocessingCanvas" xmlns:cx="http://schemas.microsoft.com/office/drawing/2014/chartex" xmlns:cx1="http://schemas.microsoft.com/office/drawing/2015/9/8/chartex" xmlns:cx2="http://schemas.microsoft.com/office/drawing/2015/10/21/chartex" xmlns:cx3="http://schemas.microsoft.com/office/drawing/2016/5/9/chartex" xmlns:cx4="http://schemas.microsoft.com/office/drawing/2016/5/10/chartex" xmlns:cx5="http://schemas.microsoft.com/office/drawing/2016/5/11/chartex" xmlns:cx6="http://schemas.microsoft.com/office/drawing/2016/5/12/chartex" xmlns:cx7="http://schemas.microsoft.com/office/drawing/2016/5/13/chartex" xmlns:cx8="http://schemas.microsoft.com/office/drawing/2016/5/14/chartex" xmlns:mc="http://schemas.openxmlformats.org/markup-compatibility/2006" xmlns:aink="http://schemas.microsoft.com/office/drawing/2016/ink" xmlns:am3d="http://schemas.microsoft.com/office/drawing/2017/model3d" xmlns:o="urn:schemas-microsoft-com:office:office" xmlns:oel="http://schemas.microsoft.com/office/2019/extlst" xmlns:r="http://schemas.openxmlformats.org/officeDocument/2006/relationships" xmlns:m="http://schemas.openxmlformats.org/officeDocument/2006/math" xmlns:v="urn:schemas-microsoft-com:vml" xmlns:wp14="http://schemas.microsoft.com/office/word/2010/wordprocessingDrawing" xmlns:wp="http://schemas.openxmlformats.org/drawingml/2006/wordprocessingDrawing" xmlns:w10="urn:schemas-microsoft-com:office:word" xmlns:w="http://schemas.openxmlformats.org/wordprocessingml/2006/main" xmlns:w14="http://schemas.microsoft.com/office/word/2010/wordml" xmlns:w15="http://schemas.microsoft.com/office/word/2012/wordml" xmlns:w16cex="http://schemas.microsoft.com/office/word/2018/wordml/cex" xmlns:w16cid="http://schemas.microsoft.com/office/word/2016/wordml/cid" xmlns:w16="http://schemas.microsoft.com/office/word/2018/wordml" xmlns:w16du="http://schemas.microsoft.com/office/word/2023/wordml/word16du" xmlns:w16sdtdh="http://schemas.microsoft.com/office/word/2020/wordml/sdtdatahash" xmlns:w16se="http://schemas.microsoft.com/office/word/2015/wordml/symex" xmlns:wpg="http://schemas.microsoft.com/office/word/2010/wordprocessingGroup" xmlns:wpi="http://schemas.microsoft.com/office/word/2010/wordprocessingInk" xmlns:wne="http://schemas.microsoft.com/office/word/2006/wordml" xmlns:wps="http://schemas.microsoft.com/office/word/2010/wordprocessingShape" mc:Ignorable="w14 w15 w16se w16cid w16 w16cex w16sdtdh w16du wp14">
   <w:body>
+    <w:p>
+      <w:r>
+        <w:rPr>
+          <w:noProof/>
+        </w:rPr>
+        <mc:AlternateContent>
+          <mc:Choice Requires="wpg">
+            <w:drawing>
+              <wp:anchor distT="0" distB="0" distL="114300" distR="114300" simplePos="0" relativeHeight="251659264" behindDoc="0" locked="0" layoutInCell="1" hidden="0" allowOverlap="1" wp14:anchorId="5DFC4DC8" wp14:editId="3340DA68">
+                <wp:simplePos x="0" y="0"/>
+                <wp:positionH relativeFrom="page">
+                  <wp:posOffset>428625</wp:posOffset>
+                </wp:positionH>
+                <wp:positionV relativeFrom="margin">
+                  <wp:posOffset>-1170304</wp:posOffset>
+                </wp:positionV>
+                <wp:extent cx="228600" cy="10403359"/>
+                <wp:effectExtent l="0" t="0" r="0" b="0"/>
+                <wp:wrapNone/>
+                <wp:docPr id="1728545881" name="Group 1728545881"/>
+                <wp:cNvGraphicFramePr/>
+                <a:graphic xmlns:a="http://schemas.openxmlformats.org/drawingml/2006/main">
+                  <a:graphicData uri="http://schemas.microsoft.com/office/word/2010/wordprocessingGroup">
+                    <wpg:wgp>
+                      <wpg:cNvGrpSpPr/>
+                      <wpg:grpSpPr>
+                        <a:xfrm>
+                          <a:off x="0" y="0"/>
+                          <a:ext cx="228600" cy="10403359"/>
+                          <a:chOff x="5231700" y="0"/>
+                          <a:chExt cx="228600" cy="7560000"/>
+                        </a:xfrm>
+                      </wpg:grpSpPr>
+                      <wpg:grpSp>
+                        <wpg:cNvPr id="150243782" name="Group 150243782"/>
+                        <wpg:cNvGrpSpPr/>
+                        <wpg:grpSpPr>
+                          <a:xfrm>
+                            <a:off x="5231700" y="0"/>
+                            <a:ext cx="228600" cy="7560000"/>
+                            <a:chOff x="0" y="0"/>
+                            <a:chExt cx="228600" cy="9144000"/>
+                          </a:xfrm>
+                        </wpg:grpSpPr>
+                        <wps:wsp>
+                          <wps:cNvPr id="1022607563" name="Rectangle 1022607563"/>
+                          <wps:cNvSpPr/>
+                          <wps:spPr>
+                            <a:xfrm>
+                              <a:off x="0" y="0"/>
+                              <a:ext cx="228600" cy="9144000"/>
+                            </a:xfrm>
+                            <a:prstGeom prst="rect">
+                              <a:avLst/>
+                            </a:prstGeom>
+                            <a:noFill/>
+                            <a:ln>
+                              <a:noFill/>
+                            </a:ln>
+                          </wps:spPr>
+                          <wps:txbx>
+                            <w:txbxContent>
+                              <w:p>
+                                <w:pPr>
+                                  <w:spacing w:after="0" w:line="240" w:lineRule="auto"/>
+                                  <w:textDirection w:val="btLr"/>
+                                </w:pPr>
+                              </w:p>
+                            </w:txbxContent>
+                          </wps:txbx>
+                          <wps:bodyPr spcFirstLastPara="1" wrap="square" lIns="91425" tIns="91425" rIns="91425" bIns="91425" anchor="ctr" anchorCtr="0">
+                            <a:noAutofit/>
+                          </wps:bodyPr>
+                        </wps:wsp>
+                        <wps:wsp>
+                          <wps:cNvPr id="645180660" name="Rectangle 645180660"/>
+                          <wps:cNvSpPr/>
+                          <wps:spPr>
+                            <a:xfrm>
+                              <a:off x="0" y="0"/>
+                              <a:ext cx="228600" cy="8782050"/>
+                            </a:xfrm>
+                            <a:prstGeom prst="rect">
+                              <a:avLst/>
+                            </a:prstGeom>
+                            <a:solidFill>
+                              <a:schemeClr val="accent2"/>
+                            </a:solidFill>
+                            <a:ln>
+                              <a:noFill/>
+                            </a:ln>
+                          </wps:spPr>
+                          <wps:txbx>
+                            <w:txbxContent>
+                              <w:p>
+                                <w:pPr>
+                                  <w:spacing w:after="0" w:line="240" w:lineRule="auto"/>
+                                  <w:textDirection w:val="btLr"/>
+                                </w:pPr>
+                              </w:p>
+                            </w:txbxContent>
+                          </wps:txbx>
+                          <wps:bodyPr spcFirstLastPara="1" wrap="square" lIns="91425" tIns="91425" rIns="91425" bIns="91425" anchor="ctr" anchorCtr="0">
+                            <a:noAutofit/>
+                          </wps:bodyPr>
+                        </wps:wsp>
+                        <wps:wsp>
+                          <wps:cNvPr id="300658735" name="Rectangle 300658735"/>
+                          <wps:cNvSpPr/>
+                          <wps:spPr>
+                            <a:xfrm>
+                              <a:off x="0" y="8915400"/>
+                              <a:ext cx="228600" cy="228600"/>
+                            </a:xfrm>
+                            <a:prstGeom prst="rect">
+                              <a:avLst/>
+                            </a:prstGeom>
+                            <a:solidFill>
+                              <a:schemeClr val="accent1"/>
+                            </a:solidFill>
+                            <a:ln>
+                              <a:noFill/>
+                            </a:ln>
+                          </wps:spPr>
+                          <wps:txbx>
+                            <w:txbxContent>
+                              <w:p>
+                                <w:pPr>
+                                  <w:spacing w:after="0" w:line="240" w:lineRule="auto"/>
+                                  <w:textDirection w:val="btLr"/>
+                                </w:pPr>
+                              </w:p>
+                            </w:txbxContent>
+                          </wps:txbx>
+                          <wps:bodyPr spcFirstLastPara="1" wrap="square" lIns="91425" tIns="91425" rIns="91425" bIns="91425" anchor="ctr" anchorCtr="0">
+                            <a:noAutofit/>
+                          </wps:bodyPr>
+                        </wps:wsp>
+                      </wpg:grpSp>
+                    </wpg:wgp>
+                  </a:graphicData>
+                </a:graphic>
+              </wp:anchor>
+            </w:drawing>
+          </mc:Choice>
+          <mc:Fallback>
+            <w:pict>
+              <v:group w14:anchorId="5DFC4DC8" id="Group 1728545881" o:spid="_x0000_s1026" style="position:absolute;margin-left:33.75pt;margin-top:-92.15pt;width:18pt;height:819.15pt;z-index:251659264;mso-position-horizontal-relative:page;mso-position-vertical-relative:margin" coordorigin="52317" coordsize="2286,75600" o:gfxdata="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">
+                <v:group id="Group 150243782" o:spid="_x0000_s1027" style="position:absolute;left:52317;width:2286;height:75600" coordsize="2286,91440" o:gfxdata="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">
+                  <v:rect id="Rectangle 1022607563" o:spid="_x0000_s1028" style="position:absolute;width:2286;height:91440;visibility:visible;mso-wrap-style:square;v-text-anchor:middle" o:gfxdata="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" filled="f" stroked="f">
+                    <v:textbox inset="2.53958mm,2.53958mm,2.53958mm,2.53958mm">
+                      <w:txbxContent>
+                        <w:p>
+                          <w:pPr>
+                            <w:spacing w:after="0" w:line="240" w:lineRule="auto"/>
+                            <w:textDirection w:val="btLr"/>
+                          </w:pPr>
+                        </w:p>
+                      </w:txbxContent>
+                    </v:textbox>
+                  </v:rect>
+                  <v:rect id="Rectangle 645180660" o:spid="_x0000_s1029" style="position:absolute;width:2286;height:87820;visibility:visible;mso-wrap-style:square;v-text-anchor:middle" o:gfxdata="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" fillcolor="#e97132 [3205]" stroked="f">
+                    <v:textbox inset="2.53958mm,2.53958mm,2.53958mm,2.53958mm">
+                      <w:txbxContent>
+                        <w:p>
+                          <w:pPr>
+                            <w:spacing w:after="0" w:line="240" w:lineRule="auto"/>
+                            <w:textDirection w:val="btLr"/>
+                          </w:pPr>
+                        </w:p>
+                      </w:txbxContent>
+                    </v:textbox>
+                  </v:rect>
+                  <v:rect id="Rectangle 300658735" o:spid="_x0000_s1030" style="position:absolute;top:89154;width:2286;height:2286;visibility:visible;mso-wrap-style:square;v-text-anchor:middle" o:gfxdata="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" fillcolor="#156082 [3204]" stroked="f">
+                    <v:textbox inset="2.53958mm,2.53958mm,2.53958mm,2.53958mm">
+                      <w:txbxContent>
+                        <w:p>
+                          <w:pPr>
+                            <w:spacing w:after="0" w:line="240" w:lineRule="auto"/>
+                            <w:textDirection w:val="btLr"/>
+                          </w:pPr>
+                        </w:p>
+                      </w:txbxContent>
+                    </v:textbox>
+                  </v:rect>
+                </v:group>
+                <w10:wrap anchorx="page" anchory="margin"/>
+              </v:group>
+            </w:pict>
+          </mc:Fallback>
+        </mc:AlternateContent>
+      </w:r>
+      <w:r>
+        <w:rPr>
+          <w:noProof/>
+        </w:rPr>
+        <w:drawing>
+          <wp:anchor distT="0" distB="0" distL="114300" distR="114300" simplePos="0" relativeHeight="251660288" behindDoc="0" locked="0" layoutInCell="1" hidden="0" allowOverlap="1" wp14:anchorId="5A079F12" wp14:editId="716E66D4">
+            <wp:simplePos x="0" y="0"/>
+            <wp:positionH relativeFrom="margin">
+              <wp:posOffset>4174490</wp:posOffset>
+            </wp:positionH>
+            <wp:positionV relativeFrom="margin">
+              <wp:posOffset>-276224</wp:posOffset>
+            </wp:positionV>
+            <wp:extent cx="2206625" cy="762000"/>
+            <wp:effectExtent l="0" t="0" r="0" b="0"/>
+            <wp:wrapSquare wrapText="bothSides" distT="0" distB="0" distL="114300" distR="114300"/>
+            <wp:docPr id="1728545883" name="image1.png" descr="A logo for college computing&#10;&#10;Description automatically generated"/>
+            <wp:cNvGraphicFramePr/>
+            <a:graphic xmlns:a="http://schemas.openxmlformats.org/drawingml/2006/main">
+              <a:graphicData uri="http://schemas.openxmlformats.org/drawingml/2006/picture">
+                <pic:pic xmlns:pic="http://schemas.openxmlformats.org/drawingml/2006/picture">
+                  <pic:nvPicPr>
+                    <pic:cNvPr id="0" name="image1.png" descr="A logo for college computing&#10;&#10;Description automatically generated"/>
+                    <pic:cNvPicPr preferRelativeResize="0"/>
+                  </pic:nvPicPr>
+                  <pic:blipFill>
+                    <a:blip r:embed="rId4"/>
+                    <a:srcRect/>
+                    <a:stretch>
+                      <a:fillRect/>
+                    </a:stretch>
+                  </pic:blipFill>
+                  <pic:spPr>
+                    <a:xfrm>
+                      <a:off x="0" y="0"/>
+                      <a:ext cx="2206625" cy="762000"/>
+                    </a:xfrm>
+                    <a:prstGeom prst="rect">
+                      <a:avLst/>
+                    </a:prstGeom>
+                    <a:ln/>
+                  </pic:spPr>
+                </pic:pic>
+              </a:graphicData>
+            </a:graphic>
+          </wp:anchor>
+        </w:drawing>
+      </w:r>
+    </w:p>
+    <w:p>
+      <w:pPr>
+        <w:rPr>
+          <w:b/>
+          <w:color w:val="156082"/>
+          <w:sz w:val="36"/>
+          <w:szCs w:val="36"/>
+        </w:rPr>
+      </w:pPr>
+      <w:r>
+        <w:rPr>
+          <w:b/>
+          <w:color w:val="156082"/>
+          <w:sz w:val="36"/>
+          <w:szCs w:val="36"/>
+        </w:rPr>
+        <w:t>Assessment Cover Page</w:t>
+      </w:r>
+    </w:p>
+    <w:tbl>
+      <w:tblPr>
+        <w:tblW w:w="9015" w:type="dxa"/>
+        <w:tblBorders>
+          <w:insideH w:val="nil"/>
+          <w:insideV w:val="nil"/>
+        </w:tblBorders>
+        <w:tblLayout w:type="fixed"/>
+        <w:tblLook w:val="0400" w:firstRow="0" w:lastRow="0" w:firstColumn="0" w:lastColumn="0" w:noHBand="0" w:noVBand="1"/>
+      </w:tblPr>
+      <w:tblGrid>
+        <w:gridCol w:w="3256"/>
+        <w:gridCol w:w="5759"/>
+      </w:tblGrid>
+      <w:tr>
+        <w:tc>
+          <w:tcPr>
+            <w:tcW w:w="3256" w:type="dxa"/>
+            <w:tcBorders>
+              <w:top w:val="nil"/>
+              <w:left w:val="nil"/>
+              <w:bottom w:val="nil"/>
+              <w:right w:val="nil"/>
+            </w:tcBorders>
+            <w:hideMark/>
+          </w:tcPr>
+          <w:p>
+            <w:pPr>
+              <w:spacing w:line="480" w:lineRule="auto"/>
+              <w:rPr>
+                <w:i/>
+                <w:color w:val="156082"/>
+                <w:sz w:val="32"/>
+                <w:szCs w:val="32"/>
+              </w:rPr>
+            </w:pPr>
+            <w:r>
+              <w:rPr>
+                <w:i/>
+                <w:color w:val="156082"/>
+                <w:sz w:val="32"/>
+                <w:szCs w:val="32"/>
+              </w:rPr>
+              <w:t>Daniel Marciniak</w:t>
+            </w:r>
+          </w:p>
+        </w:tc>
+        <w:tc>
+          <w:tcPr>
+            <w:tcW w:w="5759" w:type="dxa"/>
+            <w:tcBorders>
+              <w:top w:val="nil"/>
+              <w:left w:val="nil"/>
+              <w:bottom w:val="nil"/>
+              <w:right w:val="nil"/>
+            </w:tcBorders>
+          </w:tcPr>
+          <w:p>
+            <w:pPr>
+              <w:spacing w:line="480" w:lineRule="auto"/>
+              <w:rPr>
+                <w:color w:val="000000"/>
+                <w:sz w:val="32"/>
+                <w:szCs w:val="32"/>
+              </w:rPr>
+            </w:pPr>
+          </w:p>
+        </w:tc>
+      </w:tr>
+      <w:tr>
+        <w:tc>
+          <w:tcPr>
+            <w:tcW w:w="3256" w:type="dxa"/>
+            <w:tcBorders>
+              <w:top w:val="nil"/>
+              <w:left w:val="nil"/>
+              <w:bottom w:val="nil"/>
+              <w:right w:val="nil"/>
+            </w:tcBorders>
+            <w:hideMark/>
+          </w:tcPr>
+          <w:p>
+            <w:pPr>
+              <w:spacing w:line="480" w:lineRule="auto"/>
+              <w:rPr>
+                <w:i/>
+                <w:color w:val="156082"/>
+                <w:sz w:val="32"/>
+                <w:szCs w:val="32"/>
+              </w:rPr>
+            </w:pPr>
+            <w:r>
+              <w:rPr>
+                <w:i/>
+                <w:color w:val="156082"/>
+                <w:sz w:val="32"/>
+                <w:szCs w:val="32"/>
+              </w:rPr>
+              <w:t>Student Number</w:t>
+            </w:r>
+          </w:p>
+          <w:p>
+            <w:pPr>
+              <w:spacing w:line="480" w:lineRule="auto"/>
+              <w:rPr>
+                <w:i/>
+                <w:color w:val="156082"/>
+                <w:sz w:val="32"/>
+                <w:szCs w:val="32"/>
+              </w:rPr>
+            </w:pPr>
+            <w:r>
+              <w:rPr>
+                <w:i/>
+                <w:color w:val="156082"/>
+                <w:sz w:val="32"/>
+                <w:szCs w:val="32"/>
+              </w:rPr>
+              <w:t>sba26097</w:t>
+            </w:r>
+          </w:p>
+        </w:tc>
+        <w:tc>
+          <w:tcPr>
+            <w:tcW w:w="5759" w:type="dxa"/>
+            <w:tcBorders>
+              <w:top w:val="nil"/>
+              <w:left w:val="nil"/>
+              <w:bottom w:val="nil"/>
+              <w:right w:val="nil"/>
+            </w:tcBorders>
+          </w:tcPr>
+          <w:p>
+            <w:pPr>
+              <w:spacing w:line="480" w:lineRule="auto"/>
+              <w:rPr>
+                <w:color w:val="000000"/>
+                <w:sz w:val="32"/>
+                <w:szCs w:val="32"/>
+              </w:rPr>
+            </w:pPr>
+          </w:p>
+        </w:tc>
+      </w:tr>
+      <w:tr>
+        <w:tc>
+          <w:tcPr>
+            <w:tcW w:w="3256" w:type="dxa"/>
+            <w:tcBorders>
+              <w:top w:val="nil"/>
+              <w:left w:val="nil"/>
+              <w:bottom w:val="nil"/>
+              <w:right w:val="nil"/>
+            </w:tcBorders>
+            <w:hideMark/>
+          </w:tcPr>
+          <w:p>
+            <w:pPr>
+              <w:spacing w:line="480" w:lineRule="auto"/>
+              <w:rPr>
+                <w:i/>
+                <w:color w:val="156082"/>
+                <w:sz w:val="32"/>
+                <w:szCs w:val="32"/>
+              </w:rPr>
+            </w:pPr>
+            <w:r>
+              <w:rPr>
+                <w:i/>
+                <w:color w:val="156082"/>
+                <w:sz w:val="32"/>
+                <w:szCs w:val="32"/>
+              </w:rPr>
+              <w:t>Module Title</w:t>
+            </w:r>
+          </w:p>
+          <w:p>
+            <w:pPr>
+              <w:spacing w:line="480" w:lineRule="auto"/>
+              <w:rPr>
+                <w:i/>
+                <w:color w:val="156082"/>
+                <w:sz w:val="32"/>
+                <w:szCs w:val="32"/>
+              </w:rPr>
+            </w:pPr>
+            <w:r>
+              <w:rPr>
+                <w:i/>
+                <w:color w:val="156082"/>
+                <w:sz w:val="32"/>
+                <w:szCs w:val="32"/>
+              </w:rPr>
+              <w:t>Strategic Thinking</w:t>
+            </w:r>
+          </w:p>
+        </w:tc>
+        <w:tc>
+          <w:tcPr>
+            <w:tcW w:w="5759" w:type="dxa"/>
+            <w:tcBorders>
+              <w:top w:val="nil"/>
+              <w:left w:val="nil"/>
+              <w:bottom w:val="nil"/>
+              <w:right w:val="nil"/>
+            </w:tcBorders>
+          </w:tcPr>
+          <w:p>
+            <w:pPr>
+              <w:spacing w:line="480" w:lineRule="auto"/>
+              <w:rPr>
+                <w:color w:val="000000"/>
+                <w:sz w:val="32"/>
+                <w:szCs w:val="32"/>
+              </w:rPr>
+            </w:pPr>
+          </w:p>
+        </w:tc>
+      </w:tr>
+      <w:tr>
+        <w:tc>
+          <w:tcPr>
+            <w:tcW w:w="3256" w:type="dxa"/>
+            <w:tcBorders>
+              <w:top w:val="nil"/>
+              <w:left w:val="nil"/>
+              <w:bottom w:val="nil"/>
+              <w:right w:val="nil"/>
+            </w:tcBorders>
+            <w:hideMark/>
+          </w:tcPr>
+          <w:p>
+            <w:pPr>
+              <w:spacing w:line="480" w:lineRule="auto"/>
+              <w:rPr>
+                <w:i/>
+                <w:color w:val="156082"/>
+                <w:sz w:val="32"/>
+                <w:szCs w:val="32"/>
+              </w:rPr>
+            </w:pPr>
+            <w:r>
+              <w:rPr>
+                <w:i/>
+                <w:color w:val="156082"/>
+                <w:sz w:val="32"/>
+                <w:szCs w:val="32"/>
+              </w:rPr>
+              <w:t xml:space="preserve">Assessment Title </w:t>
+            </w:r>
+            <w:r>
+              <w:rPr>
+                <w:i/>
+                <w:color w:val="156082"/>
+                <w:sz w:val="32"/>
+                <w:szCs w:val="32"/>
+              </w:rPr>
+              <w:t xml:space="preserve">Predicting </w:t>
+            </w:r>
+            <w:proofErr w:type="gramStart"/>
+            <w:r>
+              <w:rPr>
+                <w:i/>
+                <w:color w:val="156082"/>
+                <w:sz w:val="32"/>
+                <w:szCs w:val="32"/>
+              </w:rPr>
+              <w:t>Touris</w:t>
+            </w:r>
+            <w:r>
+              <w:rPr>
+                <w:i/>
+                <w:color w:val="156082"/>
+                <w:sz w:val="32"/>
+                <w:szCs w:val="32"/>
+              </w:rPr>
+              <w:t>m  Demand</w:t>
+            </w:r>
+            <w:proofErr w:type="gramEnd"/>
+            <w:r>
+              <w:rPr>
+                <w:i/>
+                <w:color w:val="156082"/>
+                <w:sz w:val="32"/>
+                <w:szCs w:val="32"/>
+              </w:rPr>
+              <w:t xml:space="preserve"> </w:t>
+            </w:r>
+            <w:r>
+              <w:rPr>
+                <w:i/>
+                <w:color w:val="156082"/>
+                <w:sz w:val="32"/>
+                <w:szCs w:val="32"/>
+              </w:rPr>
+              <w:t>by Month and Destination</w:t>
+            </w:r>
+          </w:p>
+          <w:p>
+            <w:pPr>
+              <w:spacing w:line="480" w:lineRule="auto"/>
+              <w:rPr>
+                <w:i/>
+                <w:color w:val="156082"/>
+                <w:sz w:val="32"/>
+                <w:szCs w:val="32"/>
+              </w:rPr>
+            </w:pPr>
+            <w:r>
+              <w:rPr>
+                <w:i/>
+                <w:color w:val="156082"/>
+                <w:sz w:val="32"/>
+                <w:szCs w:val="32"/>
+              </w:rPr>
+              <w:t>Using Machine Learning Techniques</w:t>
+            </w:r>
+          </w:p>
+        </w:tc>
+        <w:tc>
+          <w:tcPr>
+            <w:tcW w:w="5759" w:type="dxa"/>
+            <w:tcBorders>
+              <w:top w:val="nil"/>
+              <w:left w:val="nil"/>
+              <w:bottom w:val="nil"/>
+              <w:right w:val="nil"/>
+            </w:tcBorders>
+          </w:tcPr>
+          <w:p>
+            <w:pPr>
+              <w:spacing w:line="480" w:lineRule="auto"/>
+              <w:rPr>
+                <w:color w:val="000000"/>
+                <w:sz w:val="32"/>
+                <w:szCs w:val="32"/>
+              </w:rPr>
+            </w:pPr>
+          </w:p>
+        </w:tc>
+      </w:tr>
+      <w:tr>
+        <w:tc>
+          <w:tcPr>
+            <w:tcW w:w="3256" w:type="dxa"/>
+            <w:tcBorders>
+              <w:top w:val="nil"/>
+              <w:left w:val="nil"/>
+              <w:bottom w:val="nil"/>
+              <w:right w:val="nil"/>
+            </w:tcBorders>
+            <w:hideMark/>
+          </w:tcPr>
+          <w:p>
+            <w:pPr>
+              <w:spacing w:line="480" w:lineRule="auto"/>
+              <w:rPr>
+                <w:i/>
+                <w:color w:val="156082"/>
+                <w:sz w:val="32"/>
+                <w:szCs w:val="32"/>
+              </w:rPr>
+            </w:pPr>
+            <w:r>
+              <w:rPr>
+                <w:i/>
+                <w:color w:val="156082"/>
+                <w:sz w:val="32"/>
+                <w:szCs w:val="32"/>
+              </w:rPr>
+              <w:t>Lecturer/Supervisor</w:t>
+            </w:r>
+          </w:p>
+          <w:p>
+            <w:pPr>
+              <w:spacing w:line="480" w:lineRule="auto"/>
+              <w:rPr>
+                <w:i/>
+                <w:color w:val="156082"/>
+                <w:sz w:val="32"/>
+                <w:szCs w:val="32"/>
+              </w:rPr>
+            </w:pPr>
+            <w:proofErr w:type="spellStart"/>
+            <w:r>
+              <w:rPr>
+                <w:i/>
+                <w:color w:val="156082"/>
+                <w:sz w:val="32"/>
+                <w:szCs w:val="32"/>
+              </w:rPr>
+              <w:t>Taufique</w:t>
+            </w:r>
+            <w:proofErr w:type="spellEnd"/>
+            <w:r>
+              <w:rPr>
+                <w:i/>
+                <w:color w:val="156082"/>
+                <w:sz w:val="32"/>
+                <w:szCs w:val="32"/>
+              </w:rPr>
+              <w:t xml:space="preserve"> Ahmed</w:t>
+            </w:r>
+          </w:p>
+        </w:tc>
+        <w:tc>
+          <w:tcPr>
+            <w:tcW w:w="5759" w:type="dxa"/>
+            <w:tcBorders>
+              <w:top w:val="nil"/>
+              <w:left w:val="nil"/>
+              <w:bottom w:val="nil"/>
+              <w:right w:val="nil"/>
+            </w:tcBorders>
+          </w:tcPr>
+          <w:p>
+            <w:pPr>
+              <w:spacing w:line="480" w:lineRule="auto"/>
+              <w:rPr>
+                <w:color w:val="000000"/>
+                <w:sz w:val="32"/>
+                <w:szCs w:val="32"/>
+              </w:rPr>
+            </w:pPr>
+          </w:p>
+        </w:tc>
+      </w:tr>
+      <w:tr>
+        <w:tc>
+          <w:tcPr>
+            <w:tcW w:w="3256" w:type="dxa"/>
+            <w:tcBorders>
+              <w:top w:val="nil"/>
+              <w:left w:val="nil"/>
+              <w:bottom w:val="nil"/>
+              <w:right w:val="nil"/>
+            </w:tcBorders>
+            <w:hideMark/>
+          </w:tcPr>
+          <w:p>
+            <w:pPr>
+              <w:spacing w:line="480" w:lineRule="auto"/>
+              <w:rPr>
+                <w:i/>
+                <w:color w:val="156082"/>
+                <w:sz w:val="32"/>
+                <w:szCs w:val="32"/>
+              </w:rPr>
+            </w:pPr>
+            <w:r>
+              <w:rPr>
+                <w:i/>
+                <w:color w:val="156082"/>
+                <w:sz w:val="32"/>
+                <w:szCs w:val="32"/>
+              </w:rPr>
+              <w:t>Assessment Due Date</w:t>
+            </w:r>
+          </w:p>
+          <w:p>
+            <w:pPr>
+              <w:spacing w:line="480" w:lineRule="auto"/>
+              <w:rPr>
+                <w:i/>
+                <w:color w:val="156082"/>
+                <w:sz w:val="32"/>
+                <w:szCs w:val="32"/>
+              </w:rPr>
+            </w:pPr>
+            <w:r>
+              <w:rPr>
+                <w:i/>
+                <w:color w:val="156082"/>
+                <w:sz w:val="32"/>
+                <w:szCs w:val="32"/>
+              </w:rPr>
+              <w:t>25/10/2026</w:t>
+            </w:r>
+          </w:p>
+        </w:tc>
+        <w:tc>
+          <w:tcPr>
+            <w:tcW w:w="5759" w:type="dxa"/>
+            <w:tcBorders>
+              <w:top w:val="nil"/>
+              <w:left w:val="nil"/>
+              <w:bottom w:val="nil"/>
+              <w:right w:val="nil"/>
+            </w:tcBorders>
+          </w:tcPr>
+          <w:p>
+            <w:pPr>
+              <w:spacing w:line="480" w:lineRule="auto"/>
+              <w:rPr>
+                <w:color w:val="000000"/>
+                <w:sz w:val="32"/>
+                <w:szCs w:val="32"/>
+              </w:rPr>
+            </w:pPr>
+          </w:p>
+        </w:tc>
+      </w:tr>
+      <w:tr>
+        <w:tc>
+          <w:tcPr>
+            <w:tcW w:w="3256" w:type="dxa"/>
+            <w:tcBorders>
+              <w:top w:val="nil"/>
+              <w:left w:val="nil"/>
+              <w:bottom w:val="nil"/>
+              <w:right w:val="nil"/>
+            </w:tcBorders>
+            <w:hideMark/>
+          </w:tcPr>
+          <w:p>
+            <w:pPr>
+              <w:spacing w:line="480" w:lineRule="auto"/>
+              <w:rPr>
+                <w:i/>
+                <w:color w:val="156082"/>
+                <w:sz w:val="32"/>
+                <w:szCs w:val="32"/>
+              </w:rPr>
+            </w:pPr>
+            <w:r>
+              <w:rPr>
+                <w:i/>
+                <w:color w:val="156082"/>
+                <w:sz w:val="32"/>
+                <w:szCs w:val="32"/>
+              </w:rPr>
+              <w:lastRenderedPageBreak/>
+              <w:t>Date of Submission</w:t>
+            </w:r>
+          </w:p>
+          <w:p>
+            <w:pPr>
+              <w:spacing w:line="480" w:lineRule="auto"/>
+              <w:rPr>
+                <w:i/>
+                <w:color w:val="156082"/>
+                <w:sz w:val="32"/>
+                <w:szCs w:val="32"/>
+              </w:rPr>
+            </w:pPr>
+            <w:r>
+              <w:rPr>
+                <w:i/>
+                <w:color w:val="156082"/>
+                <w:sz w:val="32"/>
+                <w:szCs w:val="32"/>
+              </w:rPr>
+              <w:t>19/04/2026</w:t>
+            </w:r>
+          </w:p>
+        </w:tc>
+        <w:tc>
+          <w:tcPr>
+            <w:tcW w:w="5759" w:type="dxa"/>
+            <w:tcBorders>
+              <w:top w:val="nil"/>
+              <w:left w:val="nil"/>
+              <w:bottom w:val="nil"/>
+              <w:right w:val="nil"/>
+            </w:tcBorders>
+          </w:tcPr>
+          <w:p>
+            <w:pPr>
+              <w:spacing w:line="480" w:lineRule="auto"/>
+              <w:rPr>
+                <w:color w:val="000000"/>
+                <w:sz w:val="32"/>
+                <w:szCs w:val="32"/>
+              </w:rPr>
+            </w:pPr>
+          </w:p>
+        </w:tc>
+      </w:tr>
+    </w:tbl>
+    <w:p>
+      <w:pPr>
+        <w:rPr>
+          <w:b/>
+          <w:color w:val="156082"/>
+          <w:sz w:val="32"/>
+          <w:szCs w:val="32"/>
+        </w:rPr>
+      </w:pPr>
+      <w:r>
+        <w:rPr>
+          <w:b/>
+          <w:color w:val="156082"/>
+          <w:sz w:val="32"/>
+          <w:szCs w:val="32"/>
+        </w:rPr>
+        <w:t>Use of AI Tools</w:t>
+      </w:r>
+    </w:p>
+    <w:p>
+      <w:pPr>
+        <w:rPr>
+          <w:b/>
+          <w:sz w:val="28"/>
+          <w:szCs w:val="28"/>
+        </w:rPr>
+      </w:pPr>
+      <w:r>
+        <w:rPr>
+          <w:sz w:val="28"/>
+          <w:szCs w:val="28"/>
+        </w:rPr>
+        <w:t xml:space="preserve">I acknowledge the use </w:t>
+      </w:r>
+      <w:r>
+        <w:rPr>
+          <w:sz w:val="28"/>
+          <w:szCs w:val="28"/>
+        </w:rPr>
+        <w:t>of ChatGPT for the purpose of brainstorm, ideas, correct grammar and syntax. I didn’t copy and paste anything from AI directly. I used artificial intelligence as a help tool.</w:t>
+      </w:r>
+      <w:r>
+        <w:rPr>
+          <w:b/>
+          <w:sz w:val="28"/>
+          <w:szCs w:val="28"/>
+        </w:rPr>
+        <w:t xml:space="preserve"> </w:t>
+      </w:r>
+    </w:p>
+    <w:p/>
+    <w:p>
+      <w:pPr>
+        <w:jc w:val="center"/>
+        <w:rPr>
+          <w:b/>
+          <w:sz w:val="32"/>
+        </w:rPr>
+      </w:pPr>
+      <w:r>
+        <w:rPr>
+          <w:noProof/>
+        </w:rPr>
+        <mc:AlternateContent>
+          <mc:Choice Requires="wps">
+            <w:drawing>
+              <wp:anchor distT="0" distB="0" distL="114300" distR="114300" simplePos="0" relativeHeight="251661312" behindDoc="0" locked="0" layoutInCell="1" hidden="0" allowOverlap="1" wp14:anchorId="336BC56F" wp14:editId="4881F4E3">
+                <wp:simplePos x="0" y="0"/>
+                <wp:positionH relativeFrom="margin">
+                  <wp:posOffset>-152400</wp:posOffset>
+                </wp:positionH>
+                <wp:positionV relativeFrom="paragraph">
+                  <wp:posOffset>328295</wp:posOffset>
+                </wp:positionV>
+                <wp:extent cx="5800725" cy="2876550"/>
+                <wp:effectExtent l="19050" t="19050" r="28575" b="19050"/>
+                <wp:wrapNone/>
+                <wp:docPr id="1728545882" name="Rectangle 1728545882"/>
+                <wp:cNvGraphicFramePr/>
+                <a:graphic xmlns:a="http://schemas.openxmlformats.org/drawingml/2006/main">
+                  <a:graphicData uri="http://schemas.microsoft.com/office/word/2010/wordprocessingShape">
+                    <wps:wsp>
+                      <wps:cNvSpPr/>
+                      <wps:spPr>
+                        <a:xfrm>
+                          <a:off x="0" y="0"/>
+                          <a:ext cx="5800725" cy="2876550"/>
+                        </a:xfrm>
+                        <a:prstGeom prst="rect">
+                          <a:avLst/>
+                        </a:prstGeom>
+                        <a:solidFill>
+                          <a:schemeClr val="lt1"/>
+                        </a:solidFill>
+                        <a:ln w="28575" cap="flat" cmpd="sng">
+                          <a:solidFill>
+                            <a:schemeClr val="accent1"/>
+                          </a:solidFill>
+                          <a:prstDash val="solid"/>
+                          <a:round/>
+                          <a:headEnd type="none" w="sm" len="sm"/>
+                          <a:tailEnd type="none" w="sm" len="sm"/>
+                        </a:ln>
+                      </wps:spPr>
+                      <wps:txbx>
+                        <w:txbxContent>
+                          <w:p>
+                            <w:pPr>
+                              <w:spacing w:line="258" w:lineRule="auto"/>
+                              <w:textDirection w:val="btLr"/>
+                            </w:pPr>
+                            <w:r>
+                              <w:rPr>
+                                <w:b/>
+                                <w:color w:val="156082"/>
+                                <w:sz w:val="32"/>
+                              </w:rPr>
+                              <w:t>Declaration</w:t>
+                            </w:r>
+                          </w:p>
+                          <w:p>
+                            <w:pPr>
+                              <w:spacing w:line="258" w:lineRule="auto"/>
+                              <w:textDirection w:val="btLr"/>
+                            </w:pPr>
+                            <w:r>
+                              <w:rPr>
+                                <w:color w:val="000000"/>
+                                <w:sz w:val="28"/>
+                              </w:rPr>
+                              <w:t xml:space="preserve">By submitting this assessment, I confirm that I have read the CCT policy on academic misconduct and understand the implications of submitting work that is not my own or does not appropriately reference material taken from a third party or other source. </w:t>
+                            </w:r>
+                          </w:p>
+                          <w:p>
+                            <w:pPr>
+                              <w:spacing w:line="258" w:lineRule="auto"/>
+                              <w:textDirection w:val="btLr"/>
+                            </w:pPr>
+                            <w:r>
+                              <w:rPr>
+                                <w:color w:val="000000"/>
+                                <w:sz w:val="28"/>
+                              </w:rPr>
+                              <w:t>I declare it to be my own work and that all material from third parties has been appropriately referenced.</w:t>
+                            </w:r>
+                          </w:p>
+                          <w:p>
+                            <w:pPr>
+                              <w:spacing w:line="258" w:lineRule="auto"/>
+                              <w:textDirection w:val="btLr"/>
+                            </w:pPr>
+                            <w:r>
+                              <w:rPr>
+                                <w:color w:val="000000"/>
+                                <w:sz w:val="28"/>
+                              </w:rPr>
+                              <w:t xml:space="preserve"> I further confirm that this work has not previously been submitted for assessment by myself or someone else in CCT College Dublin or any other higher education institution.</w:t>
+                            </w:r>
+                          </w:p>
+                        </w:txbxContent>
+                      </wps:txbx>
+                      <wps:bodyPr spcFirstLastPara="1" wrap="square" lIns="91425" tIns="45700" rIns="91425" bIns="45700" anchor="t" anchorCtr="0">
+                        <a:noAutofit/>
+                      </wps:bodyPr>
+                    </wps:wsp>
+                  </a:graphicData>
+                </a:graphic>
+              </wp:anchor>
+            </w:drawing>
+          </mc:Choice>
+          <mc:Fallback>
+            <w:pict>
+              <v:rect w14:anchorId="336BC56F" id="Rectangle 1728545882" o:spid="_x0000_s1031" style="position:absolute;left:0;text-align:left;margin-left:-12pt;margin-top:25.85pt;width:456.75pt;height:226.5pt;z-index:251661312;visibility:visible;mso-wrap-style:square;mso-wrap-distance-left:9pt;mso-wrap-distance-top:0;mso-wrap-distance-right:9pt;mso-wrap-distance-bottom:0;mso-position-horizontal:absolute;mso-position-horizontal-relative:margin;mso-position-vertical:absolute;mso-position-vertical-relative:text;v-text-anchor:top" o:gfxdata="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" fillcolor="white [3201]" strokecolor="#156082 [3204]" strokeweight="2.25pt">
+                <v:stroke startarrowwidth="narrow" startarrowlength="short" endarrowwidth="narrow" endarrowlength="short" joinstyle="round"/>
+                <v:textbox inset="2.53958mm,1.2694mm,2.53958mm,1.2694mm">
+                  <w:txbxContent>
+                    <w:p>
+                      <w:pPr>
+                        <w:spacing w:line="258" w:lineRule="auto"/>
+                        <w:textDirection w:val="btLr"/>
+                      </w:pPr>
+                      <w:r>
+                        <w:rPr>
+                          <w:b/>
+                          <w:color w:val="156082"/>
+                          <w:sz w:val="32"/>
+                        </w:rPr>
+                        <w:t>Declaration</w:t>
+                      </w:r>
+                    </w:p>
+                    <w:p>
+                      <w:pPr>
+                        <w:spacing w:line="258" w:lineRule="auto"/>
+                        <w:textDirection w:val="btLr"/>
+                      </w:pPr>
+                      <w:r>
+                        <w:rPr>
+                          <w:color w:val="000000"/>
+                          <w:sz w:val="28"/>
+                        </w:rPr>
+                        <w:t xml:space="preserve">By submitting this assessment, I confirm that I have read the CCT policy on academic misconduct and understand the implications of submitting work that is not my own or does not appropriately reference material taken from a third party or other source. </w:t>
+                      </w:r>
+                    </w:p>
+                    <w:p>
+                      <w:pPr>
+                        <w:spacing w:line="258" w:lineRule="auto"/>
+                        <w:textDirection w:val="btLr"/>
+                      </w:pPr>
+                      <w:r>
+                        <w:rPr>
+                          <w:color w:val="000000"/>
+                          <w:sz w:val="28"/>
+                        </w:rPr>
+                        <w:t>I declare it to be my own work and that all material from third parties has been appropriately referenced.</w:t>
+                      </w:r>
+                    </w:p>
+                    <w:p>
+                      <w:pPr>
+                        <w:spacing w:line="258" w:lineRule="auto"/>
+                        <w:textDirection w:val="btLr"/>
+                      </w:pPr>
+                      <w:r>
+                        <w:rPr>
+                          <w:color w:val="000000"/>
+                          <w:sz w:val="28"/>
+                        </w:rPr>
+                        <w:t xml:space="preserve"> I further confirm that this work has not previously been submitted for assessment by myself or someone else in CCT College Dublin or any other higher education institution.</w:t>
+                      </w:r>
+                    </w:p>
+                  </w:txbxContent>
+                </v:textbox>
+                <w10:wrap anchorx="margin"/>
+              </v:rect>
+            </w:pict>
+          </mc:Fallback>
+        </mc:AlternateContent>
+      </w:r>
+    </w:p>
+    <w:p>
+      <w:pPr>
+        <w:jc w:val="center"/>
+        <w:rPr>
+          <w:b/>
+          <w:sz w:val="32"/>
+        </w:rPr>
+      </w:pPr>
+    </w:p>
+    <w:p>
+      <w:pPr>
+        <w:jc w:val="center"/>
+        <w:rPr>
+          <w:b/>
+          <w:sz w:val="32"/>
+        </w:rPr>
+      </w:pPr>
+    </w:p>
+    <w:p>
+      <w:pPr>
+        <w:jc w:val="center"/>
+        <w:rPr>
+          <w:b/>
+          <w:sz w:val="32"/>
+        </w:rPr>
+      </w:pPr>
+    </w:p>
+    <w:p>
+      <w:pPr>
+        <w:jc w:val="center"/>
+        <w:rPr>
+          <w:b/>
+          <w:sz w:val="32"/>
+        </w:rPr>
+      </w:pPr>
+    </w:p>
+    <w:p>
+      <w:pPr>
+        <w:jc w:val="center"/>
+        <w:rPr>
+          <w:b/>
+          <w:sz w:val="32"/>
+        </w:rPr>
+      </w:pPr>
+    </w:p>
+    <w:p>
+      <w:pPr>
+        <w:jc w:val="center"/>
+        <w:rPr>
+          <w:b/>
+          <w:sz w:val="32"/>
+        </w:rPr>
+      </w:pPr>
+    </w:p>
+    <w:p>
+      <w:pPr>
+        <w:jc w:val="center"/>
+        <w:rPr>
+          <w:b/>
+          <w:sz w:val="32"/>
+        </w:rPr>
+      </w:pPr>
+    </w:p>
+    <w:p>
+      <w:pPr>
+        <w:jc w:val="center"/>
+        <w:rPr>
+          <w:b/>
+          <w:sz w:val="32"/>
+        </w:rPr>
+      </w:pPr>
+    </w:p>
     <w:p/>
     <w:sectPr>
       <w:pgSz w:w="11906" w:h="16838"/>
@@ -413,6 +1562,17 @@
   <w:style w:type="paragraph" w:default="1" w:styleId="Normal">
     <w:name w:val="Normal"/>
     <w:qFormat/>
+    <w:rsid w:val="0048181D"/>
+    <w:pPr>
+      <w:spacing w:line="276" w:lineRule="auto"/>
+    </w:pPr>
+    <w:rPr>
+      <w:rFonts w:ascii="Times New Roman" w:eastAsiaTheme="minorEastAsia" w:hAnsi="Times New Roman"/>
+      <w:kern w:val="0"/>
+      <w:szCs w:val="22"/>
+      <w:lang w:val="en-US"/>
+      <w14:ligatures w14:val="none"/>
+    </w:rPr>
   </w:style>
   <w:style w:type="paragraph" w:styleId="Heading1">
     <w:name w:val="heading 1"/>
@@ -425,14 +1585,17 @@
     <w:pPr>
       <w:keepNext/>
       <w:keepLines/>
-      <w:spacing w:before="360" w:after="80"/>
+      <w:spacing w:before="360" w:after="80" w:line="278" w:lineRule="auto"/>
       <w:outlineLvl w:val="0"/>
     </w:pPr>
     <w:rPr>
       <w:rFonts w:asciiTheme="majorHAnsi" w:eastAsiaTheme="majorEastAsia" w:hAnsiTheme="majorHAnsi" w:cstheme="majorBidi"/>
       <w:color w:val="0F4761" w:themeColor="accent1" w:themeShade="BF"/>
+      <w:kern w:val="2"/>
       <w:sz w:val="40"/>
       <w:szCs w:val="40"/>
+      <w:lang w:val="en-IE"/>
+      <w14:ligatures w14:val="standardContextual"/>
     </w:rPr>
   </w:style>
   <w:style w:type="paragraph" w:styleId="Heading2">
@@ -448,14 +1611,17 @@
     <w:pPr>
       <w:keepNext/>
       <w:keepLines/>
-      <w:spacing w:before="160" w:after="80"/>
+      <w:spacing w:before="160" w:after="80" w:line="278" w:lineRule="auto"/>
       <w:outlineLvl w:val="1"/>
     </w:pPr>
     <w:rPr>
       <w:rFonts w:asciiTheme="majorHAnsi" w:eastAsiaTheme="majorEastAsia" w:hAnsiTheme="majorHAnsi" w:cstheme="majorBidi"/>
       <w:color w:val="0F4761" w:themeColor="accent1" w:themeShade="BF"/>
+      <w:kern w:val="2"/>
       <w:sz w:val="32"/>
       <w:szCs w:val="32"/>
+      <w:lang w:val="en-IE"/>
+      <w14:ligatures w14:val="standardContextual"/>
     </w:rPr>
   </w:style>
   <w:style w:type="paragraph" w:styleId="Heading3">
@@ -471,14 +1637,17 @@
     <w:pPr>
       <w:keepNext/>
       <w:keepLines/>
-      <w:spacing w:before="160" w:after="80"/>
+      <w:spacing w:before="160" w:after="80" w:line="278" w:lineRule="auto"/>
       <w:outlineLvl w:val="2"/>
     </w:pPr>
     <w:rPr>
-      <w:rFonts w:eastAsiaTheme="majorEastAsia" w:cstheme="majorBidi"/>
+      <w:rFonts w:asciiTheme="minorHAnsi" w:eastAsiaTheme="majorEastAsia" w:hAnsiTheme="minorHAnsi" w:cstheme="majorBidi"/>
       <w:color w:val="0F4761" w:themeColor="accent1" w:themeShade="BF"/>
+      <w:kern w:val="2"/>
       <w:sz w:val="28"/>
       <w:szCs w:val="28"/>
+      <w:lang w:val="en-IE"/>
+      <w14:ligatures w14:val="standardContextual"/>
     </w:rPr>
   </w:style>
   <w:style w:type="paragraph" w:styleId="Heading4">
@@ -494,14 +1663,18 @@
     <w:pPr>
       <w:keepNext/>
       <w:keepLines/>
-      <w:spacing w:before="80" w:after="40"/>
+      <w:spacing w:before="80" w:after="40" w:line="278" w:lineRule="auto"/>
       <w:outlineLvl w:val="3"/>
     </w:pPr>
     <w:rPr>
-      <w:rFonts w:eastAsiaTheme="majorEastAsia" w:cstheme="majorBidi"/>
+      <w:rFonts w:asciiTheme="minorHAnsi" w:eastAsiaTheme="majorEastAsia" w:hAnsiTheme="minorHAnsi" w:cstheme="majorBidi"/>
       <w:i/>
       <w:iCs/>
       <w:color w:val="0F4761" w:themeColor="accent1" w:themeShade="BF"/>
+      <w:kern w:val="2"/>
+      <w:szCs w:val="24"/>
+      <w:lang w:val="en-IE"/>
+      <w14:ligatures w14:val="standardContextual"/>
     </w:rPr>
   </w:style>
   <w:style w:type="paragraph" w:styleId="Heading5">
@@ -517,12 +1690,16 @@
     <w:pPr>
       <w:keepNext/>
       <w:keepLines/>
-      <w:spacing w:before="80" w:after="40"/>
+      <w:spacing w:before="80" w:after="40" w:line="278" w:lineRule="auto"/>
       <w:outlineLvl w:val="4"/>
     </w:pPr>
     <w:rPr>
-      <w:rFonts w:eastAsiaTheme="majorEastAsia" w:cstheme="majorBidi"/>
+      <w:rFonts w:asciiTheme="minorHAnsi" w:eastAsiaTheme="majorEastAsia" w:hAnsiTheme="minorHAnsi" w:cstheme="majorBidi"/>
       <w:color w:val="0F4761" w:themeColor="accent1" w:themeShade="BF"/>
+      <w:kern w:val="2"/>
+      <w:szCs w:val="24"/>
+      <w:lang w:val="en-IE"/>
+      <w14:ligatures w14:val="standardContextual"/>
     </w:rPr>
   </w:style>
   <w:style w:type="paragraph" w:styleId="Heading6">
@@ -538,14 +1715,18 @@
     <w:pPr>
       <w:keepNext/>
       <w:keepLines/>
-      <w:spacing w:before="40" w:after="0"/>
+      <w:spacing w:before="40" w:after="0" w:line="278" w:lineRule="auto"/>
       <w:outlineLvl w:val="5"/>
     </w:pPr>
     <w:rPr>
-      <w:rFonts w:eastAsiaTheme="majorEastAsia" w:cstheme="majorBidi"/>
+      <w:rFonts w:asciiTheme="minorHAnsi" w:eastAsiaTheme="majorEastAsia" w:hAnsiTheme="minorHAnsi" w:cstheme="majorBidi"/>
       <w:i/>
       <w:iCs/>
       <w:color w:val="595959" w:themeColor="text1" w:themeTint="A6"/>
+      <w:kern w:val="2"/>
+      <w:szCs w:val="24"/>
+      <w:lang w:val="en-IE"/>
+      <w14:ligatures w14:val="standardContextual"/>
     </w:rPr>
   </w:style>
   <w:style w:type="paragraph" w:styleId="Heading7">
@@ -561,12 +1742,16 @@
     <w:pPr>
       <w:keepNext/>
       <w:keepLines/>
-      <w:spacing w:before="40" w:after="0"/>
+      <w:spacing w:before="40" w:after="0" w:line="278" w:lineRule="auto"/>
       <w:outlineLvl w:val="6"/>
     </w:pPr>
     <w:rPr>
-      <w:rFonts w:eastAsiaTheme="majorEastAsia" w:cstheme="majorBidi"/>
+      <w:rFonts w:asciiTheme="minorHAnsi" w:eastAsiaTheme="majorEastAsia" w:hAnsiTheme="minorHAnsi" w:cstheme="majorBidi"/>
       <w:color w:val="595959" w:themeColor="text1" w:themeTint="A6"/>
+      <w:kern w:val="2"/>
+      <w:szCs w:val="24"/>
+      <w:lang w:val="en-IE"/>
+      <w14:ligatures w14:val="standardContextual"/>
     </w:rPr>
   </w:style>
   <w:style w:type="paragraph" w:styleId="Heading8">
@@ -582,14 +1767,18 @@
     <w:pPr>
       <w:keepNext/>
       <w:keepLines/>
-      <w:spacing w:after="0"/>
+      <w:spacing w:after="0" w:line="278" w:lineRule="auto"/>
       <w:outlineLvl w:val="7"/>
     </w:pPr>
     <w:rPr>
-      <w:rFonts w:eastAsiaTheme="majorEastAsia" w:cstheme="majorBidi"/>
+      <w:rFonts w:asciiTheme="minorHAnsi" w:eastAsiaTheme="majorEastAsia" w:hAnsiTheme="minorHAnsi" w:cstheme="majorBidi"/>
       <w:i/>
       <w:iCs/>
       <w:color w:val="272727" w:themeColor="text1" w:themeTint="D8"/>
+      <w:kern w:val="2"/>
+      <w:szCs w:val="24"/>
+      <w:lang w:val="en-IE"/>
+      <w14:ligatures w14:val="standardContextual"/>
     </w:rPr>
   </w:style>
   <w:style w:type="paragraph" w:styleId="Heading9">
@@ -605,12 +1794,16 @@
     <w:pPr>
       <w:keepNext/>
       <w:keepLines/>
-      <w:spacing w:after="0"/>
+      <w:spacing w:after="0" w:line="278" w:lineRule="auto"/>
       <w:outlineLvl w:val="8"/>
     </w:pPr>
     <w:rPr>
-      <w:rFonts w:eastAsiaTheme="majorEastAsia" w:cstheme="majorBidi"/>
+      <w:rFonts w:asciiTheme="minorHAnsi" w:eastAsiaTheme="majorEastAsia" w:hAnsiTheme="minorHAnsi" w:cstheme="majorBidi"/>
       <w:color w:val="272727" w:themeColor="text1" w:themeTint="D8"/>
+      <w:kern w:val="2"/>
+      <w:szCs w:val="24"/>
+      <w:lang w:val="en-IE"/>
+      <w14:ligatures w14:val="standardContextual"/>
     </w:rPr>
   </w:style>
   <w:style w:type="character" w:default="1" w:styleId="DefaultParagraphFont">
@@ -777,6 +1970,8 @@
       <w:kern w:val="28"/>
       <w:sz w:val="56"/>
       <w:szCs w:val="56"/>
+      <w:lang w:val="en-IE"/>
+      <w14:ligatures w14:val="standardContextual"/>
     </w:rPr>
   </w:style>
   <w:style w:type="character" w:customStyle="1" w:styleId="TitleChar">
@@ -805,13 +2000,17 @@
       <w:numPr>
         <w:ilvl w:val="1"/>
       </w:numPr>
+      <w:spacing w:line="278" w:lineRule="auto"/>
     </w:pPr>
     <w:rPr>
-      <w:rFonts w:eastAsiaTheme="majorEastAsia" w:cstheme="majorBidi"/>
+      <w:rFonts w:asciiTheme="minorHAnsi" w:eastAsiaTheme="majorEastAsia" w:hAnsiTheme="minorHAnsi" w:cstheme="majorBidi"/>
       <w:color w:val="595959" w:themeColor="text1" w:themeTint="A6"/>
       <w:spacing w:val="15"/>
+      <w:kern w:val="2"/>
       <w:sz w:val="28"/>
       <w:szCs w:val="28"/>
+      <w:lang w:val="en-IE"/>
+      <w14:ligatures w14:val="standardContextual"/>
     </w:rPr>
   </w:style>
   <w:style w:type="character" w:customStyle="1" w:styleId="SubtitleChar">
@@ -837,13 +2036,18 @@
     <w:qFormat/>
     <w:rsid w:val="008F6EFF"/>
     <w:pPr>
-      <w:spacing w:before="160"/>
+      <w:spacing w:before="160" w:line="278" w:lineRule="auto"/>
       <w:jc w:val="center"/>
     </w:pPr>
     <w:rPr>
+      <w:rFonts w:asciiTheme="minorHAnsi" w:eastAsiaTheme="minorHAnsi" w:hAnsiTheme="minorHAnsi"/>
       <w:i/>
       <w:iCs/>
       <w:color w:val="404040" w:themeColor="text1" w:themeTint="BF"/>
+      <w:kern w:val="2"/>
+      <w:szCs w:val="24"/>
+      <w:lang w:val="en-IE"/>
+      <w14:ligatures w14:val="standardContextual"/>
     </w:rPr>
   </w:style>
   <w:style w:type="character" w:customStyle="1" w:styleId="QuoteChar">
@@ -865,9 +2069,17 @@
     <w:qFormat/>
     <w:rsid w:val="008F6EFF"/>
     <w:pPr>
+      <w:spacing w:line="278" w:lineRule="auto"/>
       <w:ind w:left="720"/>
       <w:contextualSpacing/>
     </w:pPr>
+    <w:rPr>
+      <w:rFonts w:asciiTheme="minorHAnsi" w:eastAsiaTheme="minorHAnsi" w:hAnsiTheme="minorHAnsi"/>
+      <w:kern w:val="2"/>
+      <w:szCs w:val="24"/>
+      <w:lang w:val="en-IE"/>
+      <w14:ligatures w14:val="standardContextual"/>
+    </w:rPr>
   </w:style>
   <w:style w:type="character" w:styleId="IntenseEmphasis">
     <w:name w:val="Intense Emphasis"/>
@@ -894,14 +2106,19 @@
         <w:top w:val="single" w:sz="4" w:space="10" w:color="0F4761" w:themeColor="accent1" w:themeShade="BF"/>
         <w:bottom w:val="single" w:sz="4" w:space="10" w:color="0F4761" w:themeColor="accent1" w:themeShade="BF"/>
       </w:pBdr>
-      <w:spacing w:before="360" w:after="360"/>
+      <w:spacing w:before="360" w:after="360" w:line="278" w:lineRule="auto"/>
       <w:ind w:left="864" w:right="864"/>
       <w:jc w:val="center"/>
     </w:pPr>
     <w:rPr>
+      <w:rFonts w:asciiTheme="minorHAnsi" w:eastAsiaTheme="minorHAnsi" w:hAnsiTheme="minorHAnsi"/>
       <w:i/>
       <w:iCs/>
       <w:color w:val="0F4761" w:themeColor="accent1" w:themeShade="BF"/>
+      <w:kern w:val="2"/>
+      <w:szCs w:val="24"/>
+      <w:lang w:val="en-IE"/>
+      <w14:ligatures w14:val="standardContextual"/>
     </w:rPr>
   </w:style>
   <w:style w:type="character" w:customStyle="1" w:styleId="IntenseQuoteChar">

</xml_diff>

<commit_message>
sba26097_CA1_ Chapter 8,9 plus final content table
</commit_message>
<xml_diff>
--- a/Capstone Project 2026.docx
+++ b/Capstone Project 2026.docx
@@ -624,6 +624,7 @@
                 <w:szCs w:val="32"/>
               </w:rPr>
             </w:pPr>
+            <w:proofErr w:type="spellStart"/>
             <w:r>
               <w:rPr>
                 <w:i/>
@@ -631,7 +632,17 @@
                 <w:sz w:val="32"/>
                 <w:szCs w:val="32"/>
               </w:rPr>
-              <w:t>Taufique Ahmed</w:t>
+              <w:t>Taufique</w:t>
+            </w:r>
+            <w:proofErr w:type="spellEnd"/>
+            <w:r>
+              <w:rPr>
+                <w:i/>
+                <w:color w:val="156082"/>
+                <w:sz w:val="32"/>
+                <w:szCs w:val="32"/>
+              </w:rPr>
+              <w:t xml:space="preserve"> Ahmed</w:t>
             </w:r>
           </w:p>
         </w:tc>
@@ -1262,56 +1273,1540 @@
     <w:p/>
     <w:p/>
     <w:p/>
+    <w:p>
+      <w:pPr>
+        <w:rPr>
+          <w:del w:id="12" w:author="Microsoft Office User" w:date="2026-10-22T13:31:00Z" w16du:dateUtc="2026-10-22T12:31:00Z"/>
+        </w:rPr>
+      </w:pPr>
+    </w:p>
+    <w:p>
+      <w:pPr>
+        <w:rPr>
+          <w:del w:id="13" w:author="Microsoft Office User" w:date="2026-10-22T13:31:00Z" w16du:dateUtc="2026-10-22T12:31:00Z"/>
+        </w:rPr>
+      </w:pPr>
+    </w:p>
+    <w:p>
+      <w:pPr>
+        <w:rPr>
+          <w:del w:id="14" w:author="Microsoft Office User" w:date="2026-10-22T13:31:00Z" w16du:dateUtc="2026-10-22T12:31:00Z"/>
+        </w:rPr>
+      </w:pPr>
+    </w:p>
+    <w:p>
+      <w:pPr>
+        <w:rPr>
+          <w:del w:id="15" w:author="Microsoft Office User" w:date="2026-10-22T13:31:00Z" w16du:dateUtc="2026-10-22T12:31:00Z"/>
+        </w:rPr>
+      </w:pPr>
+    </w:p>
     <w:p/>
-    <w:p/>
-    <w:p/>
-    <w:p/>
-    <w:p/>
-    <w:p>
-      <w:r>
-        <w:t>Table of content page for later reserved</w:t>
-      </w:r>
-    </w:p>
-    <w:p/>
-    <w:p/>
-    <w:p/>
-    <w:p/>
-    <w:p/>
-    <w:p/>
-    <w:p/>
-    <w:p/>
-    <w:p/>
-    <w:p/>
-    <w:p/>
-    <w:p/>
-    <w:p/>
-    <w:p/>
-    <w:p/>
-    <w:p/>
-    <w:p/>
-    <w:p/>
-    <w:p/>
-    <w:p/>
-    <w:p/>
-    <w:p/>
-    <w:p/>
-    <w:p/>
-    <w:p/>
-    <w:p>
-      <w:pPr>
-        <w:rPr>
-          <w:del w:id="12" w:author="Microsoft Office User" w:date="2026-10-19T16:41:00Z" w16du:dateUtc="2026-10-19T15:41:00Z"/>
-        </w:rPr>
-      </w:pPr>
-    </w:p>
-    <w:p>
-      <w:pPr>
-        <w:rPr>
-          <w:del w:id="13" w:author="Microsoft Office User" w:date="2026-10-19T16:41:00Z" w16du:dateUtc="2026-10-19T15:41:00Z"/>
-        </w:rPr>
-      </w:pPr>
-    </w:p>
-    <w:p/>
+    <w:customXmlInsRangeStart w:id="16" w:author="Microsoft Office User" w:date="2026-10-22T13:30:00Z"/>
+    <w:sdt>
+      <w:sdtPr>
+        <w:rPr>
+          <w:rFonts w:ascii="Times New Roman" w:eastAsiaTheme="minorEastAsia" w:hAnsi="Times New Roman" w:cstheme="minorBidi"/>
+          <w:b/>
+          <w:bCs/>
+          <w:color w:val="auto"/>
+          <w:sz w:val="24"/>
+          <w:szCs w:val="22"/>
+          <w:lang w:val="pl-PL"/>
+        </w:rPr>
+        <w:id w:val="960234858"/>
+        <w:docPartObj>
+          <w:docPartGallery w:val="Table of Contents"/>
+          <w:docPartUnique/>
+        </w:docPartObj>
+      </w:sdtPr>
+      <w:sdtEndPr>
+        <w:rPr>
+          <w:b w:val="0"/>
+          <w:bCs w:val="0"/>
+          <w:lang w:val="en-US"/>
+        </w:rPr>
+      </w:sdtEndPr>
+      <w:sdtContent>
+        <w:customXmlInsRangeEnd w:id="16"/>
+        <w:p>
+          <w:pPr>
+            <w:pStyle w:val="Heading1"/>
+            <w:rPr>
+              <w:ins w:id="17" w:author="Microsoft Office User" w:date="2026-10-22T13:30:00Z" w16du:dateUtc="2026-10-22T12:30:00Z"/>
+              <w:rFonts w:ascii="Times New Roman" w:eastAsiaTheme="minorEastAsia" w:hAnsi="Times New Roman" w:cstheme="minorBidi"/>
+              <w:b/>
+              <w:bCs/>
+              <w:color w:val="auto"/>
+              <w:sz w:val="24"/>
+              <w:szCs w:val="22"/>
+              <w:lang w:val="pl-PL"/>
+            </w:rPr>
+          </w:pPr>
+          <w:ins w:id="18" w:author="Microsoft Office User" w:date="2026-10-22T13:30:00Z" w16du:dateUtc="2026-10-22T12:30:00Z">
+            <w:r>
+              <w:t>Table of Contents</w:t>
+            </w:r>
+          </w:ins>
+        </w:p>
+        <w:p>
+          <w:pPr>
+            <w:pStyle w:val="TOC1"/>
+            <w:tabs>
+              <w:tab w:val="right" w:leader="dot" w:pos="8630"/>
+            </w:tabs>
+            <w:rPr>
+              <w:ins w:id="19" w:author="Microsoft Office User" w:date="2026-10-22T13:30:00Z" w16du:dateUtc="2026-10-22T12:30:00Z"/>
+              <w:noProof/>
+            </w:rPr>
+          </w:pPr>
+          <w:ins w:id="20" w:author="Microsoft Office User" w:date="2026-10-22T13:30:00Z" w16du:dateUtc="2026-10-22T12:30:00Z">
+            <w:r>
+              <w:fldChar w:fldCharType="begin"/>
+            </w:r>
+            <w:r>
+              <w:instrText xml:space="preserve"> TOC \o "1-3" \h \z \u </w:instrText>
+            </w:r>
+            <w:r>
+              <w:fldChar w:fldCharType="separate"/>
+            </w:r>
+            <w:r>
+              <w:rPr>
+                <w:noProof/>
+              </w:rPr>
+              <w:fldChar w:fldCharType="begin"/>
+            </w:r>
+            <w:r>
+              <w:rPr>
+                <w:noProof/>
+              </w:rPr>
+              <w:instrText>HYPERLINK \l "_Toc243051546"</w:instrText>
+            </w:r>
+          </w:ins>
+          <w:ins w:id="21" w:author="Microsoft Office User" w:date="2026-10-22T13:32:00Z" w16du:dateUtc="2026-10-22T12:32:00Z">
+            <w:r>
+              <w:rPr>
+                <w:noProof/>
+              </w:rPr>
+            </w:r>
+          </w:ins>
+          <w:ins w:id="22" w:author="Microsoft Office User" w:date="2026-10-22T13:30:00Z" w16du:dateUtc="2026-10-22T12:30:00Z">
+            <w:r>
+              <w:rPr>
+                <w:noProof/>
+              </w:rPr>
+              <w:fldChar w:fldCharType="separate"/>
+            </w:r>
+            <w:r>
+              <w:rPr>
+                <w:rStyle w:val="Hyperlink"/>
+                <w:noProof/>
+              </w:rPr>
+              <w:t>1. Project T</w:t>
+            </w:r>
+            <w:r>
+              <w:rPr>
+                <w:rStyle w:val="Hyperlink"/>
+                <w:noProof/>
+              </w:rPr>
+              <w:t>i</w:t>
+            </w:r>
+            <w:r>
+              <w:rPr>
+                <w:rStyle w:val="Hyperlink"/>
+                <w:noProof/>
+              </w:rPr>
+              <w:t>tle</w:t>
+            </w:r>
+            <w:r>
+              <w:rPr>
+                <w:noProof/>
+                <w:webHidden/>
+              </w:rPr>
+              <w:tab/>
+            </w:r>
+            <w:r>
+              <w:rPr>
+                <w:noProof/>
+                <w:webHidden/>
+              </w:rPr>
+              <w:fldChar w:fldCharType="begin"/>
+            </w:r>
+            <w:r>
+              <w:rPr>
+                <w:noProof/>
+                <w:webHidden/>
+              </w:rPr>
+              <w:instrText xml:space="preserve"> PAGEREF _Toc243051546 \h </w:instrText>
+            </w:r>
+            <w:r>
+              <w:rPr>
+                <w:noProof/>
+                <w:webHidden/>
+              </w:rPr>
+            </w:r>
+            <w:r>
+              <w:rPr>
+                <w:noProof/>
+                <w:webHidden/>
+              </w:rPr>
+              <w:fldChar w:fldCharType="separate"/>
+            </w:r>
+          </w:ins>
+          <w:ins w:id="23" w:author="Microsoft Office User" w:date="2026-10-22T13:32:00Z" w16du:dateUtc="2026-10-22T12:32:00Z">
+            <w:r>
+              <w:rPr>
+                <w:noProof/>
+                <w:webHidden/>
+              </w:rPr>
+              <w:t>4</w:t>
+            </w:r>
+          </w:ins>
+          <w:ins w:id="24" w:author="Microsoft Office User" w:date="2026-10-22T13:30:00Z" w16du:dateUtc="2026-10-22T12:30:00Z">
+            <w:r>
+              <w:rPr>
+                <w:noProof/>
+                <w:webHidden/>
+              </w:rPr>
+              <w:fldChar w:fldCharType="end"/>
+            </w:r>
+            <w:r>
+              <w:rPr>
+                <w:noProof/>
+              </w:rPr>
+              <w:fldChar w:fldCharType="end"/>
+            </w:r>
+          </w:ins>
+        </w:p>
+        <w:p>
+          <w:pPr>
+            <w:pStyle w:val="TOC1"/>
+            <w:tabs>
+              <w:tab w:val="right" w:leader="dot" w:pos="8630"/>
+            </w:tabs>
+            <w:rPr>
+              <w:ins w:id="25" w:author="Microsoft Office User" w:date="2026-10-22T13:30:00Z" w16du:dateUtc="2026-10-22T12:30:00Z"/>
+              <w:noProof/>
+            </w:rPr>
+          </w:pPr>
+          <w:ins w:id="26" w:author="Microsoft Office User" w:date="2026-10-22T13:30:00Z" w16du:dateUtc="2026-10-22T12:30:00Z">
+            <w:r>
+              <w:rPr>
+                <w:noProof/>
+              </w:rPr>
+              <w:fldChar w:fldCharType="begin"/>
+            </w:r>
+            <w:r>
+              <w:rPr>
+                <w:noProof/>
+              </w:rPr>
+              <w:instrText>HYPERLINK \l "_Toc243051547"</w:instrText>
+            </w:r>
+          </w:ins>
+          <w:ins w:id="27" w:author="Microsoft Office User" w:date="2026-10-22T13:32:00Z" w16du:dateUtc="2026-10-22T12:32:00Z">
+            <w:r>
+              <w:rPr>
+                <w:noProof/>
+              </w:rPr>
+            </w:r>
+          </w:ins>
+          <w:ins w:id="28" w:author="Microsoft Office User" w:date="2026-10-22T13:30:00Z" w16du:dateUtc="2026-10-22T12:30:00Z">
+            <w:r>
+              <w:rPr>
+                <w:noProof/>
+              </w:rPr>
+              <w:fldChar w:fldCharType="separate"/>
+            </w:r>
+            <w:r>
+              <w:rPr>
+                <w:rStyle w:val="Hyperlink"/>
+                <w:noProof/>
+              </w:rPr>
+              <w:t>2. Introduction</w:t>
+            </w:r>
+            <w:r>
+              <w:rPr>
+                <w:noProof/>
+                <w:webHidden/>
+              </w:rPr>
+              <w:tab/>
+            </w:r>
+            <w:r>
+              <w:rPr>
+                <w:noProof/>
+                <w:webHidden/>
+              </w:rPr>
+              <w:fldChar w:fldCharType="begin"/>
+            </w:r>
+            <w:r>
+              <w:rPr>
+                <w:noProof/>
+                <w:webHidden/>
+              </w:rPr>
+              <w:instrText xml:space="preserve"> PAGEREF _Toc243051547 \h </w:instrText>
+            </w:r>
+            <w:r>
+              <w:rPr>
+                <w:noProof/>
+                <w:webHidden/>
+              </w:rPr>
+            </w:r>
+            <w:r>
+              <w:rPr>
+                <w:noProof/>
+                <w:webHidden/>
+              </w:rPr>
+              <w:fldChar w:fldCharType="separate"/>
+            </w:r>
+          </w:ins>
+          <w:ins w:id="29" w:author="Microsoft Office User" w:date="2026-10-22T13:32:00Z" w16du:dateUtc="2026-10-22T12:32:00Z">
+            <w:r>
+              <w:rPr>
+                <w:noProof/>
+                <w:webHidden/>
+              </w:rPr>
+              <w:t>4</w:t>
+            </w:r>
+          </w:ins>
+          <w:ins w:id="30" w:author="Microsoft Office User" w:date="2026-10-22T13:30:00Z" w16du:dateUtc="2026-10-22T12:30:00Z">
+            <w:r>
+              <w:rPr>
+                <w:noProof/>
+                <w:webHidden/>
+              </w:rPr>
+              <w:fldChar w:fldCharType="end"/>
+            </w:r>
+            <w:r>
+              <w:rPr>
+                <w:noProof/>
+              </w:rPr>
+              <w:fldChar w:fldCharType="end"/>
+            </w:r>
+          </w:ins>
+        </w:p>
+        <w:p>
+          <w:pPr>
+            <w:pStyle w:val="TOC1"/>
+            <w:tabs>
+              <w:tab w:val="right" w:leader="dot" w:pos="8630"/>
+            </w:tabs>
+            <w:rPr>
+              <w:ins w:id="31" w:author="Microsoft Office User" w:date="2026-10-22T13:30:00Z" w16du:dateUtc="2026-10-22T12:30:00Z"/>
+              <w:noProof/>
+            </w:rPr>
+          </w:pPr>
+          <w:ins w:id="32" w:author="Microsoft Office User" w:date="2026-10-22T13:30:00Z" w16du:dateUtc="2026-10-22T12:30:00Z">
+            <w:r>
+              <w:rPr>
+                <w:noProof/>
+              </w:rPr>
+              <w:fldChar w:fldCharType="begin"/>
+            </w:r>
+            <w:r>
+              <w:rPr>
+                <w:noProof/>
+              </w:rPr>
+              <w:instrText>HYPERLINK \l "_Toc243051548"</w:instrText>
+            </w:r>
+          </w:ins>
+          <w:ins w:id="33" w:author="Microsoft Office User" w:date="2026-10-22T13:32:00Z" w16du:dateUtc="2026-10-22T12:32:00Z">
+            <w:r>
+              <w:rPr>
+                <w:noProof/>
+              </w:rPr>
+            </w:r>
+          </w:ins>
+          <w:ins w:id="34" w:author="Microsoft Office User" w:date="2026-10-22T13:30:00Z" w16du:dateUtc="2026-10-22T12:30:00Z">
+            <w:r>
+              <w:rPr>
+                <w:noProof/>
+              </w:rPr>
+              <w:fldChar w:fldCharType="separate"/>
+            </w:r>
+            <w:r>
+              <w:rPr>
+                <w:rStyle w:val="Hyperlink"/>
+                <w:noProof/>
+              </w:rPr>
+              <w:t>3. Problem Definition</w:t>
+            </w:r>
+            <w:r>
+              <w:rPr>
+                <w:noProof/>
+                <w:webHidden/>
+              </w:rPr>
+              <w:tab/>
+            </w:r>
+            <w:r>
+              <w:rPr>
+                <w:noProof/>
+                <w:webHidden/>
+              </w:rPr>
+              <w:fldChar w:fldCharType="begin"/>
+            </w:r>
+            <w:r>
+              <w:rPr>
+                <w:noProof/>
+                <w:webHidden/>
+              </w:rPr>
+              <w:instrText xml:space="preserve"> PAGEREF _Toc243051548 \h </w:instrText>
+            </w:r>
+            <w:r>
+              <w:rPr>
+                <w:noProof/>
+                <w:webHidden/>
+              </w:rPr>
+            </w:r>
+            <w:r>
+              <w:rPr>
+                <w:noProof/>
+                <w:webHidden/>
+              </w:rPr>
+              <w:fldChar w:fldCharType="separate"/>
+            </w:r>
+          </w:ins>
+          <w:ins w:id="35" w:author="Microsoft Office User" w:date="2026-10-22T13:32:00Z" w16du:dateUtc="2026-10-22T12:32:00Z">
+            <w:r>
+              <w:rPr>
+                <w:noProof/>
+                <w:webHidden/>
+              </w:rPr>
+              <w:t>4</w:t>
+            </w:r>
+          </w:ins>
+          <w:ins w:id="36" w:author="Microsoft Office User" w:date="2026-10-22T13:30:00Z" w16du:dateUtc="2026-10-22T12:30:00Z">
+            <w:r>
+              <w:rPr>
+                <w:noProof/>
+                <w:webHidden/>
+              </w:rPr>
+              <w:fldChar w:fldCharType="end"/>
+            </w:r>
+            <w:r>
+              <w:rPr>
+                <w:noProof/>
+              </w:rPr>
+              <w:fldChar w:fldCharType="end"/>
+            </w:r>
+          </w:ins>
+        </w:p>
+        <w:p>
+          <w:pPr>
+            <w:pStyle w:val="TOC1"/>
+            <w:tabs>
+              <w:tab w:val="right" w:leader="dot" w:pos="8630"/>
+            </w:tabs>
+            <w:rPr>
+              <w:ins w:id="37" w:author="Microsoft Office User" w:date="2026-10-22T13:30:00Z" w16du:dateUtc="2026-10-22T12:30:00Z"/>
+              <w:noProof/>
+            </w:rPr>
+          </w:pPr>
+          <w:ins w:id="38" w:author="Microsoft Office User" w:date="2026-10-22T13:30:00Z" w16du:dateUtc="2026-10-22T12:30:00Z">
+            <w:r>
+              <w:rPr>
+                <w:noProof/>
+              </w:rPr>
+              <w:fldChar w:fldCharType="begin"/>
+            </w:r>
+            <w:r>
+              <w:rPr>
+                <w:noProof/>
+              </w:rPr>
+              <w:instrText>HYPERLINK \l "_Toc243051549"</w:instrText>
+            </w:r>
+          </w:ins>
+          <w:ins w:id="39" w:author="Microsoft Office User" w:date="2026-10-22T13:32:00Z" w16du:dateUtc="2026-10-22T12:32:00Z">
+            <w:r>
+              <w:rPr>
+                <w:noProof/>
+              </w:rPr>
+            </w:r>
+          </w:ins>
+          <w:ins w:id="40" w:author="Microsoft Office User" w:date="2026-10-22T13:30:00Z" w16du:dateUtc="2026-10-22T12:30:00Z">
+            <w:r>
+              <w:rPr>
+                <w:noProof/>
+              </w:rPr>
+              <w:fldChar w:fldCharType="separate"/>
+            </w:r>
+            <w:r>
+              <w:rPr>
+                <w:rStyle w:val="Hyperlink"/>
+                <w:noProof/>
+              </w:rPr>
+              <w:t>4. Aim and Objectives</w:t>
+            </w:r>
+            <w:r>
+              <w:rPr>
+                <w:noProof/>
+                <w:webHidden/>
+              </w:rPr>
+              <w:tab/>
+            </w:r>
+            <w:r>
+              <w:rPr>
+                <w:noProof/>
+                <w:webHidden/>
+              </w:rPr>
+              <w:fldChar w:fldCharType="begin"/>
+            </w:r>
+            <w:r>
+              <w:rPr>
+                <w:noProof/>
+                <w:webHidden/>
+              </w:rPr>
+              <w:instrText xml:space="preserve"> PAGEREF _Toc243051549 \h </w:instrText>
+            </w:r>
+            <w:r>
+              <w:rPr>
+                <w:noProof/>
+                <w:webHidden/>
+              </w:rPr>
+            </w:r>
+            <w:r>
+              <w:rPr>
+                <w:noProof/>
+                <w:webHidden/>
+              </w:rPr>
+              <w:fldChar w:fldCharType="separate"/>
+            </w:r>
+          </w:ins>
+          <w:ins w:id="41" w:author="Microsoft Office User" w:date="2026-10-22T13:32:00Z" w16du:dateUtc="2026-10-22T12:32:00Z">
+            <w:r>
+              <w:rPr>
+                <w:noProof/>
+                <w:webHidden/>
+              </w:rPr>
+              <w:t>5</w:t>
+            </w:r>
+          </w:ins>
+          <w:ins w:id="42" w:author="Microsoft Office User" w:date="2026-10-22T13:30:00Z" w16du:dateUtc="2026-10-22T12:30:00Z">
+            <w:r>
+              <w:rPr>
+                <w:noProof/>
+                <w:webHidden/>
+              </w:rPr>
+              <w:fldChar w:fldCharType="end"/>
+            </w:r>
+            <w:r>
+              <w:rPr>
+                <w:noProof/>
+              </w:rPr>
+              <w:fldChar w:fldCharType="end"/>
+            </w:r>
+          </w:ins>
+        </w:p>
+        <w:p>
+          <w:pPr>
+            <w:pStyle w:val="TOC1"/>
+            <w:tabs>
+              <w:tab w:val="right" w:leader="dot" w:pos="8630"/>
+            </w:tabs>
+            <w:rPr>
+              <w:ins w:id="43" w:author="Microsoft Office User" w:date="2026-10-22T13:30:00Z" w16du:dateUtc="2026-10-22T12:30:00Z"/>
+              <w:noProof/>
+            </w:rPr>
+          </w:pPr>
+          <w:ins w:id="44" w:author="Microsoft Office User" w:date="2026-10-22T13:30:00Z" w16du:dateUtc="2026-10-22T12:30:00Z">
+            <w:r>
+              <w:rPr>
+                <w:noProof/>
+              </w:rPr>
+              <w:fldChar w:fldCharType="begin"/>
+            </w:r>
+            <w:r>
+              <w:rPr>
+                <w:noProof/>
+              </w:rPr>
+              <w:instrText>HYPERLINK \l "_Toc243051550"</w:instrText>
+            </w:r>
+          </w:ins>
+          <w:ins w:id="45" w:author="Microsoft Office User" w:date="2026-10-22T13:32:00Z" w16du:dateUtc="2026-10-22T12:32:00Z">
+            <w:r>
+              <w:rPr>
+                <w:noProof/>
+              </w:rPr>
+            </w:r>
+          </w:ins>
+          <w:ins w:id="46" w:author="Microsoft Office User" w:date="2026-10-22T13:30:00Z" w16du:dateUtc="2026-10-22T12:30:00Z">
+            <w:r>
+              <w:rPr>
+                <w:noProof/>
+              </w:rPr>
+              <w:fldChar w:fldCharType="separate"/>
+            </w:r>
+            <w:r>
+              <w:rPr>
+                <w:rStyle w:val="Hyperlink"/>
+                <w:noProof/>
+              </w:rPr>
+              <w:t>5. Scope</w:t>
+            </w:r>
+            <w:r>
+              <w:rPr>
+                <w:noProof/>
+                <w:webHidden/>
+              </w:rPr>
+              <w:tab/>
+            </w:r>
+            <w:r>
+              <w:rPr>
+                <w:noProof/>
+                <w:webHidden/>
+              </w:rPr>
+              <w:fldChar w:fldCharType="begin"/>
+            </w:r>
+            <w:r>
+              <w:rPr>
+                <w:noProof/>
+                <w:webHidden/>
+              </w:rPr>
+              <w:instrText xml:space="preserve"> PAGEREF _Toc243051550 \h </w:instrText>
+            </w:r>
+            <w:r>
+              <w:rPr>
+                <w:noProof/>
+                <w:webHidden/>
+              </w:rPr>
+            </w:r>
+            <w:r>
+              <w:rPr>
+                <w:noProof/>
+                <w:webHidden/>
+              </w:rPr>
+              <w:fldChar w:fldCharType="separate"/>
+            </w:r>
+          </w:ins>
+          <w:ins w:id="47" w:author="Microsoft Office User" w:date="2026-10-22T13:32:00Z" w16du:dateUtc="2026-10-22T12:32:00Z">
+            <w:r>
+              <w:rPr>
+                <w:noProof/>
+                <w:webHidden/>
+              </w:rPr>
+              <w:t>5</w:t>
+            </w:r>
+          </w:ins>
+          <w:ins w:id="48" w:author="Microsoft Office User" w:date="2026-10-22T13:30:00Z" w16du:dateUtc="2026-10-22T12:30:00Z">
+            <w:r>
+              <w:rPr>
+                <w:noProof/>
+                <w:webHidden/>
+              </w:rPr>
+              <w:fldChar w:fldCharType="end"/>
+            </w:r>
+            <w:r>
+              <w:rPr>
+                <w:noProof/>
+              </w:rPr>
+              <w:fldChar w:fldCharType="end"/>
+            </w:r>
+          </w:ins>
+        </w:p>
+        <w:p>
+          <w:pPr>
+            <w:pStyle w:val="TOC1"/>
+            <w:tabs>
+              <w:tab w:val="right" w:leader="dot" w:pos="8630"/>
+            </w:tabs>
+            <w:rPr>
+              <w:ins w:id="49" w:author="Microsoft Office User" w:date="2026-10-22T13:30:00Z" w16du:dateUtc="2026-10-22T12:30:00Z"/>
+              <w:noProof/>
+            </w:rPr>
+          </w:pPr>
+          <w:ins w:id="50" w:author="Microsoft Office User" w:date="2026-10-22T13:30:00Z" w16du:dateUtc="2026-10-22T12:30:00Z">
+            <w:r>
+              <w:rPr>
+                <w:noProof/>
+              </w:rPr>
+              <w:fldChar w:fldCharType="begin"/>
+            </w:r>
+            <w:r>
+              <w:rPr>
+                <w:noProof/>
+              </w:rPr>
+              <w:instrText>HYPERLINK \l "_Toc243051551"</w:instrText>
+            </w:r>
+          </w:ins>
+          <w:ins w:id="51" w:author="Microsoft Office User" w:date="2026-10-22T13:32:00Z" w16du:dateUtc="2026-10-22T12:32:00Z">
+            <w:r>
+              <w:rPr>
+                <w:noProof/>
+              </w:rPr>
+            </w:r>
+          </w:ins>
+          <w:ins w:id="52" w:author="Microsoft Office User" w:date="2026-10-22T13:30:00Z" w16du:dateUtc="2026-10-22T12:30:00Z">
+            <w:r>
+              <w:rPr>
+                <w:noProof/>
+              </w:rPr>
+              <w:fldChar w:fldCharType="separate"/>
+            </w:r>
+            <w:r>
+              <w:rPr>
+                <w:rStyle w:val="Hyperlink"/>
+                <w:noProof/>
+              </w:rPr>
+              <w:t>6. Methodolo</w:t>
+            </w:r>
+            <w:r>
+              <w:rPr>
+                <w:rStyle w:val="Hyperlink"/>
+                <w:noProof/>
+              </w:rPr>
+              <w:t>g</w:t>
+            </w:r>
+            <w:r>
+              <w:rPr>
+                <w:rStyle w:val="Hyperlink"/>
+                <w:noProof/>
+              </w:rPr>
+              <w:t>y</w:t>
+            </w:r>
+            <w:r>
+              <w:rPr>
+                <w:noProof/>
+                <w:webHidden/>
+              </w:rPr>
+              <w:tab/>
+            </w:r>
+            <w:r>
+              <w:rPr>
+                <w:noProof/>
+                <w:webHidden/>
+              </w:rPr>
+              <w:fldChar w:fldCharType="begin"/>
+            </w:r>
+            <w:r>
+              <w:rPr>
+                <w:noProof/>
+                <w:webHidden/>
+              </w:rPr>
+              <w:instrText xml:space="preserve"> PAGEREF _Toc243051551 \h </w:instrText>
+            </w:r>
+            <w:r>
+              <w:rPr>
+                <w:noProof/>
+                <w:webHidden/>
+              </w:rPr>
+            </w:r>
+            <w:r>
+              <w:rPr>
+                <w:noProof/>
+                <w:webHidden/>
+              </w:rPr>
+              <w:fldChar w:fldCharType="separate"/>
+            </w:r>
+          </w:ins>
+          <w:ins w:id="53" w:author="Microsoft Office User" w:date="2026-10-22T13:32:00Z" w16du:dateUtc="2026-10-22T12:32:00Z">
+            <w:r>
+              <w:rPr>
+                <w:noProof/>
+                <w:webHidden/>
+              </w:rPr>
+              <w:t>6</w:t>
+            </w:r>
+          </w:ins>
+          <w:ins w:id="54" w:author="Microsoft Office User" w:date="2026-10-22T13:30:00Z" w16du:dateUtc="2026-10-22T12:30:00Z">
+            <w:r>
+              <w:rPr>
+                <w:noProof/>
+                <w:webHidden/>
+              </w:rPr>
+              <w:fldChar w:fldCharType="end"/>
+            </w:r>
+            <w:r>
+              <w:rPr>
+                <w:noProof/>
+              </w:rPr>
+              <w:fldChar w:fldCharType="end"/>
+            </w:r>
+          </w:ins>
+        </w:p>
+        <w:p>
+          <w:pPr>
+            <w:pStyle w:val="TOC1"/>
+            <w:tabs>
+              <w:tab w:val="right" w:leader="dot" w:pos="8630"/>
+            </w:tabs>
+            <w:rPr>
+              <w:ins w:id="55" w:author="Microsoft Office User" w:date="2026-10-22T13:30:00Z" w16du:dateUtc="2026-10-22T12:30:00Z"/>
+              <w:noProof/>
+            </w:rPr>
+          </w:pPr>
+          <w:ins w:id="56" w:author="Microsoft Office User" w:date="2026-10-22T13:30:00Z" w16du:dateUtc="2026-10-22T12:30:00Z">
+            <w:r>
+              <w:rPr>
+                <w:noProof/>
+              </w:rPr>
+              <w:fldChar w:fldCharType="begin"/>
+            </w:r>
+            <w:r>
+              <w:rPr>
+                <w:noProof/>
+              </w:rPr>
+              <w:instrText>HYPERLINK \l "_Toc243051552"</w:instrText>
+            </w:r>
+          </w:ins>
+          <w:ins w:id="57" w:author="Microsoft Office User" w:date="2026-10-22T13:32:00Z" w16du:dateUtc="2026-10-22T12:32:00Z">
+            <w:r>
+              <w:rPr>
+                <w:noProof/>
+              </w:rPr>
+            </w:r>
+          </w:ins>
+          <w:ins w:id="58" w:author="Microsoft Office User" w:date="2026-10-22T13:30:00Z" w16du:dateUtc="2026-10-22T12:30:00Z">
+            <w:r>
+              <w:rPr>
+                <w:noProof/>
+              </w:rPr>
+              <w:fldChar w:fldCharType="separate"/>
+            </w:r>
+            <w:r>
+              <w:rPr>
+                <w:rStyle w:val="Hyperlink"/>
+                <w:noProof/>
+              </w:rPr>
+              <w:t>7. Data Sources</w:t>
+            </w:r>
+            <w:r>
+              <w:rPr>
+                <w:noProof/>
+                <w:webHidden/>
+              </w:rPr>
+              <w:tab/>
+            </w:r>
+            <w:r>
+              <w:rPr>
+                <w:noProof/>
+                <w:webHidden/>
+              </w:rPr>
+              <w:fldChar w:fldCharType="begin"/>
+            </w:r>
+            <w:r>
+              <w:rPr>
+                <w:noProof/>
+                <w:webHidden/>
+              </w:rPr>
+              <w:instrText xml:space="preserve"> PAGEREF _Toc243051552 \h </w:instrText>
+            </w:r>
+            <w:r>
+              <w:rPr>
+                <w:noProof/>
+                <w:webHidden/>
+              </w:rPr>
+            </w:r>
+            <w:r>
+              <w:rPr>
+                <w:noProof/>
+                <w:webHidden/>
+              </w:rPr>
+              <w:fldChar w:fldCharType="separate"/>
+            </w:r>
+          </w:ins>
+          <w:ins w:id="59" w:author="Microsoft Office User" w:date="2026-10-22T13:32:00Z" w16du:dateUtc="2026-10-22T12:32:00Z">
+            <w:r>
+              <w:rPr>
+                <w:noProof/>
+                <w:webHidden/>
+              </w:rPr>
+              <w:t>7</w:t>
+            </w:r>
+          </w:ins>
+          <w:ins w:id="60" w:author="Microsoft Office User" w:date="2026-10-22T13:30:00Z" w16du:dateUtc="2026-10-22T12:30:00Z">
+            <w:r>
+              <w:rPr>
+                <w:noProof/>
+                <w:webHidden/>
+              </w:rPr>
+              <w:fldChar w:fldCharType="end"/>
+            </w:r>
+            <w:r>
+              <w:rPr>
+                <w:noProof/>
+              </w:rPr>
+              <w:fldChar w:fldCharType="end"/>
+            </w:r>
+          </w:ins>
+        </w:p>
+        <w:p>
+          <w:pPr>
+            <w:pStyle w:val="TOC1"/>
+            <w:tabs>
+              <w:tab w:val="right" w:leader="dot" w:pos="8630"/>
+            </w:tabs>
+            <w:rPr>
+              <w:ins w:id="61" w:author="Microsoft Office User" w:date="2026-10-22T13:30:00Z" w16du:dateUtc="2026-10-22T12:30:00Z"/>
+              <w:noProof/>
+            </w:rPr>
+          </w:pPr>
+          <w:ins w:id="62" w:author="Microsoft Office User" w:date="2026-10-22T13:30:00Z" w16du:dateUtc="2026-10-22T12:30:00Z">
+            <w:r>
+              <w:rPr>
+                <w:noProof/>
+              </w:rPr>
+              <w:fldChar w:fldCharType="begin"/>
+            </w:r>
+            <w:r>
+              <w:rPr>
+                <w:noProof/>
+              </w:rPr>
+              <w:instrText>HYPERLINK \l "_Toc243051553"</w:instrText>
+            </w:r>
+          </w:ins>
+          <w:ins w:id="63" w:author="Microsoft Office User" w:date="2026-10-22T13:32:00Z" w16du:dateUtc="2026-10-22T12:32:00Z">
+            <w:r>
+              <w:rPr>
+                <w:noProof/>
+              </w:rPr>
+            </w:r>
+          </w:ins>
+          <w:ins w:id="64" w:author="Microsoft Office User" w:date="2026-10-22T13:30:00Z" w16du:dateUtc="2026-10-22T12:30:00Z">
+            <w:r>
+              <w:rPr>
+                <w:noProof/>
+              </w:rPr>
+              <w:fldChar w:fldCharType="separate"/>
+            </w:r>
+            <w:r>
+              <w:rPr>
+                <w:rStyle w:val="Hyperlink"/>
+                <w:noProof/>
+              </w:rPr>
+              <w:t>8. Expected Deliverables</w:t>
+            </w:r>
+            <w:r>
+              <w:rPr>
+                <w:noProof/>
+                <w:webHidden/>
+              </w:rPr>
+              <w:tab/>
+            </w:r>
+            <w:r>
+              <w:rPr>
+                <w:noProof/>
+                <w:webHidden/>
+              </w:rPr>
+              <w:fldChar w:fldCharType="begin"/>
+            </w:r>
+            <w:r>
+              <w:rPr>
+                <w:noProof/>
+                <w:webHidden/>
+              </w:rPr>
+              <w:instrText xml:space="preserve"> PAGEREF _Toc243051553 \h </w:instrText>
+            </w:r>
+            <w:r>
+              <w:rPr>
+                <w:noProof/>
+                <w:webHidden/>
+              </w:rPr>
+            </w:r>
+            <w:r>
+              <w:rPr>
+                <w:noProof/>
+                <w:webHidden/>
+              </w:rPr>
+              <w:fldChar w:fldCharType="separate"/>
+            </w:r>
+          </w:ins>
+          <w:ins w:id="65" w:author="Microsoft Office User" w:date="2026-10-22T13:32:00Z" w16du:dateUtc="2026-10-22T12:32:00Z">
+            <w:r>
+              <w:rPr>
+                <w:noProof/>
+                <w:webHidden/>
+              </w:rPr>
+              <w:t>7</w:t>
+            </w:r>
+          </w:ins>
+          <w:ins w:id="66" w:author="Microsoft Office User" w:date="2026-10-22T13:30:00Z" w16du:dateUtc="2026-10-22T12:30:00Z">
+            <w:r>
+              <w:rPr>
+                <w:noProof/>
+                <w:webHidden/>
+              </w:rPr>
+              <w:fldChar w:fldCharType="end"/>
+            </w:r>
+            <w:r>
+              <w:rPr>
+                <w:noProof/>
+              </w:rPr>
+              <w:fldChar w:fldCharType="end"/>
+            </w:r>
+          </w:ins>
+        </w:p>
+        <w:p>
+          <w:pPr>
+            <w:pStyle w:val="TOC1"/>
+            <w:tabs>
+              <w:tab w:val="right" w:leader="dot" w:pos="8630"/>
+            </w:tabs>
+            <w:rPr>
+              <w:ins w:id="67" w:author="Microsoft Office User" w:date="2026-10-22T13:30:00Z" w16du:dateUtc="2026-10-22T12:30:00Z"/>
+              <w:noProof/>
+            </w:rPr>
+          </w:pPr>
+          <w:ins w:id="68" w:author="Microsoft Office User" w:date="2026-10-22T13:30:00Z" w16du:dateUtc="2026-10-22T12:30:00Z">
+            <w:r>
+              <w:rPr>
+                <w:noProof/>
+              </w:rPr>
+              <w:fldChar w:fldCharType="begin"/>
+            </w:r>
+            <w:r>
+              <w:rPr>
+                <w:noProof/>
+              </w:rPr>
+              <w:instrText>HYPERLINK \l "_Toc243051554"</w:instrText>
+            </w:r>
+          </w:ins>
+          <w:ins w:id="69" w:author="Microsoft Office User" w:date="2026-10-22T13:32:00Z" w16du:dateUtc="2026-10-22T12:32:00Z">
+            <w:r>
+              <w:rPr>
+                <w:noProof/>
+              </w:rPr>
+            </w:r>
+          </w:ins>
+          <w:ins w:id="70" w:author="Microsoft Office User" w:date="2026-10-22T13:30:00Z" w16du:dateUtc="2026-10-22T12:30:00Z">
+            <w:r>
+              <w:rPr>
+                <w:noProof/>
+              </w:rPr>
+              <w:fldChar w:fldCharType="separate"/>
+            </w:r>
+            <w:r>
+              <w:rPr>
+                <w:rStyle w:val="Hyperlink"/>
+                <w:noProof/>
+              </w:rPr>
+              <w:t>9. Project Timeline</w:t>
+            </w:r>
+            <w:r>
+              <w:rPr>
+                <w:noProof/>
+                <w:webHidden/>
+              </w:rPr>
+              <w:tab/>
+            </w:r>
+            <w:r>
+              <w:rPr>
+                <w:noProof/>
+                <w:webHidden/>
+              </w:rPr>
+              <w:fldChar w:fldCharType="begin"/>
+            </w:r>
+            <w:r>
+              <w:rPr>
+                <w:noProof/>
+                <w:webHidden/>
+              </w:rPr>
+              <w:instrText xml:space="preserve"> PAGEREF _Toc243051554 \h </w:instrText>
+            </w:r>
+            <w:r>
+              <w:rPr>
+                <w:noProof/>
+                <w:webHidden/>
+              </w:rPr>
+            </w:r>
+            <w:r>
+              <w:rPr>
+                <w:noProof/>
+                <w:webHidden/>
+              </w:rPr>
+              <w:fldChar w:fldCharType="separate"/>
+            </w:r>
+          </w:ins>
+          <w:ins w:id="71" w:author="Microsoft Office User" w:date="2026-10-22T13:32:00Z" w16du:dateUtc="2026-10-22T12:32:00Z">
+            <w:r>
+              <w:rPr>
+                <w:noProof/>
+                <w:webHidden/>
+              </w:rPr>
+              <w:t>8</w:t>
+            </w:r>
+          </w:ins>
+          <w:ins w:id="72" w:author="Microsoft Office User" w:date="2026-10-22T13:30:00Z" w16du:dateUtc="2026-10-22T12:30:00Z">
+            <w:r>
+              <w:rPr>
+                <w:noProof/>
+                <w:webHidden/>
+              </w:rPr>
+              <w:fldChar w:fldCharType="end"/>
+            </w:r>
+            <w:r>
+              <w:rPr>
+                <w:noProof/>
+              </w:rPr>
+              <w:fldChar w:fldCharType="end"/>
+            </w:r>
+          </w:ins>
+        </w:p>
+        <w:p>
+          <w:pPr>
+            <w:pStyle w:val="TOC1"/>
+            <w:tabs>
+              <w:tab w:val="right" w:leader="dot" w:pos="8630"/>
+            </w:tabs>
+            <w:rPr>
+              <w:ins w:id="73" w:author="Microsoft Office User" w:date="2026-10-22T13:30:00Z" w16du:dateUtc="2026-10-22T12:30:00Z"/>
+              <w:noProof/>
+            </w:rPr>
+          </w:pPr>
+          <w:ins w:id="74" w:author="Microsoft Office User" w:date="2026-10-22T13:30:00Z" w16du:dateUtc="2026-10-22T12:30:00Z">
+            <w:r>
+              <w:rPr>
+                <w:noProof/>
+              </w:rPr>
+              <w:fldChar w:fldCharType="begin"/>
+            </w:r>
+            <w:r>
+              <w:rPr>
+                <w:noProof/>
+              </w:rPr>
+              <w:instrText>HYPERLINK \l "_Toc243051555"</w:instrText>
+            </w:r>
+          </w:ins>
+          <w:ins w:id="75" w:author="Microsoft Office User" w:date="2026-10-22T13:32:00Z" w16du:dateUtc="2026-10-22T12:32:00Z">
+            <w:r>
+              <w:rPr>
+                <w:noProof/>
+              </w:rPr>
+            </w:r>
+          </w:ins>
+          <w:ins w:id="76" w:author="Microsoft Office User" w:date="2026-10-22T13:30:00Z" w16du:dateUtc="2026-10-22T12:30:00Z">
+            <w:r>
+              <w:rPr>
+                <w:noProof/>
+              </w:rPr>
+              <w:fldChar w:fldCharType="separate"/>
+            </w:r>
+            <w:r>
+              <w:rPr>
+                <w:rStyle w:val="Hyperlink"/>
+                <w:noProof/>
+              </w:rPr>
+              <w:t>10. Ethical and Legal Considerations</w:t>
+            </w:r>
+            <w:r>
+              <w:rPr>
+                <w:noProof/>
+                <w:webHidden/>
+              </w:rPr>
+              <w:tab/>
+            </w:r>
+            <w:r>
+              <w:rPr>
+                <w:noProof/>
+                <w:webHidden/>
+              </w:rPr>
+              <w:fldChar w:fldCharType="begin"/>
+            </w:r>
+            <w:r>
+              <w:rPr>
+                <w:noProof/>
+                <w:webHidden/>
+              </w:rPr>
+              <w:instrText xml:space="preserve"> PAGEREF _Toc243051555 \h </w:instrText>
+            </w:r>
+            <w:r>
+              <w:rPr>
+                <w:noProof/>
+                <w:webHidden/>
+              </w:rPr>
+            </w:r>
+            <w:r>
+              <w:rPr>
+                <w:noProof/>
+                <w:webHidden/>
+              </w:rPr>
+              <w:fldChar w:fldCharType="separate"/>
+            </w:r>
+          </w:ins>
+          <w:ins w:id="77" w:author="Microsoft Office User" w:date="2026-10-22T13:32:00Z" w16du:dateUtc="2026-10-22T12:32:00Z">
+            <w:r>
+              <w:rPr>
+                <w:noProof/>
+                <w:webHidden/>
+              </w:rPr>
+              <w:t>8</w:t>
+            </w:r>
+          </w:ins>
+          <w:ins w:id="78" w:author="Microsoft Office User" w:date="2026-10-22T13:30:00Z" w16du:dateUtc="2026-10-22T12:30:00Z">
+            <w:r>
+              <w:rPr>
+                <w:noProof/>
+                <w:webHidden/>
+              </w:rPr>
+              <w:fldChar w:fldCharType="end"/>
+            </w:r>
+            <w:r>
+              <w:rPr>
+                <w:noProof/>
+              </w:rPr>
+              <w:fldChar w:fldCharType="end"/>
+            </w:r>
+          </w:ins>
+        </w:p>
+        <w:p>
+          <w:pPr>
+            <w:pStyle w:val="TOC1"/>
+            <w:tabs>
+              <w:tab w:val="right" w:leader="dot" w:pos="8630"/>
+            </w:tabs>
+            <w:rPr>
+              <w:ins w:id="79" w:author="Microsoft Office User" w:date="2026-10-22T13:30:00Z" w16du:dateUtc="2026-10-22T12:30:00Z"/>
+              <w:noProof/>
+            </w:rPr>
+          </w:pPr>
+          <w:ins w:id="80" w:author="Microsoft Office User" w:date="2026-10-22T13:30:00Z" w16du:dateUtc="2026-10-22T12:30:00Z">
+            <w:r>
+              <w:rPr>
+                <w:noProof/>
+              </w:rPr>
+              <w:fldChar w:fldCharType="begin"/>
+            </w:r>
+            <w:r>
+              <w:rPr>
+                <w:noProof/>
+              </w:rPr>
+              <w:instrText>HYPERLINK \l "_Toc243051556"</w:instrText>
+            </w:r>
+          </w:ins>
+          <w:ins w:id="81" w:author="Microsoft Office User" w:date="2026-10-22T13:32:00Z" w16du:dateUtc="2026-10-22T12:32:00Z">
+            <w:r>
+              <w:rPr>
+                <w:noProof/>
+              </w:rPr>
+            </w:r>
+          </w:ins>
+          <w:ins w:id="82" w:author="Microsoft Office User" w:date="2026-10-22T13:30:00Z" w16du:dateUtc="2026-10-22T12:30:00Z">
+            <w:r>
+              <w:rPr>
+                <w:noProof/>
+              </w:rPr>
+              <w:fldChar w:fldCharType="separate"/>
+            </w:r>
+            <w:r>
+              <w:rPr>
+                <w:rStyle w:val="Hyperlink"/>
+                <w:noProof/>
+              </w:rPr>
+              <w:t>Refere</w:t>
+            </w:r>
+            <w:r>
+              <w:rPr>
+                <w:rStyle w:val="Hyperlink"/>
+                <w:noProof/>
+              </w:rPr>
+              <w:t>n</w:t>
+            </w:r>
+            <w:r>
+              <w:rPr>
+                <w:rStyle w:val="Hyperlink"/>
+                <w:noProof/>
+              </w:rPr>
+              <w:t>ces</w:t>
+            </w:r>
+            <w:r>
+              <w:rPr>
+                <w:noProof/>
+                <w:webHidden/>
+              </w:rPr>
+              <w:tab/>
+            </w:r>
+            <w:r>
+              <w:rPr>
+                <w:noProof/>
+                <w:webHidden/>
+              </w:rPr>
+              <w:fldChar w:fldCharType="begin"/>
+            </w:r>
+            <w:r>
+              <w:rPr>
+                <w:noProof/>
+                <w:webHidden/>
+              </w:rPr>
+              <w:instrText xml:space="preserve"> PAGEREF _Toc243051556 \h </w:instrText>
+            </w:r>
+            <w:r>
+              <w:rPr>
+                <w:noProof/>
+                <w:webHidden/>
+              </w:rPr>
+            </w:r>
+            <w:r>
+              <w:rPr>
+                <w:noProof/>
+                <w:webHidden/>
+              </w:rPr>
+              <w:fldChar w:fldCharType="separate"/>
+            </w:r>
+          </w:ins>
+          <w:ins w:id="83" w:author="Microsoft Office User" w:date="2026-10-22T13:32:00Z" w16du:dateUtc="2026-10-22T12:32:00Z">
+            <w:r>
+              <w:rPr>
+                <w:noProof/>
+                <w:webHidden/>
+              </w:rPr>
+              <w:t>9</w:t>
+            </w:r>
+          </w:ins>
+          <w:ins w:id="84" w:author="Microsoft Office User" w:date="2026-10-22T13:30:00Z" w16du:dateUtc="2026-10-22T12:30:00Z">
+            <w:r>
+              <w:rPr>
+                <w:noProof/>
+                <w:webHidden/>
+              </w:rPr>
+              <w:fldChar w:fldCharType="end"/>
+            </w:r>
+            <w:r>
+              <w:rPr>
+                <w:noProof/>
+              </w:rPr>
+              <w:fldChar w:fldCharType="end"/>
+            </w:r>
+          </w:ins>
+        </w:p>
+        <w:p>
+          <w:pPr>
+            <w:rPr>
+              <w:ins w:id="85" w:author="Microsoft Office User" w:date="2026-10-22T13:30:00Z" w16du:dateUtc="2026-10-22T12:30:00Z"/>
+            </w:rPr>
+          </w:pPr>
+          <w:ins w:id="86" w:author="Microsoft Office User" w:date="2026-10-22T13:30:00Z" w16du:dateUtc="2026-10-22T12:30:00Z">
+            <w:r>
+              <w:rPr>
+                <w:b/>
+                <w:bCs/>
+              </w:rPr>
+              <w:fldChar w:fldCharType="end"/>
+            </w:r>
+          </w:ins>
+        </w:p>
+        <w:customXmlInsRangeStart w:id="87" w:author="Microsoft Office User" w:date="2026-10-22T13:30:00Z"/>
+      </w:sdtContent>
+    </w:sdt>
+    <w:customXmlInsRangeEnd w:id="87"/>
+    <w:p>
+      <w:pPr>
+        <w:rPr>
+          <w:ins w:id="88" w:author="Microsoft Office User" w:date="2026-10-22T13:30:00Z" w16du:dateUtc="2026-10-22T12:30:00Z"/>
+        </w:rPr>
+      </w:pPr>
+      <w:ins w:id="89" w:author="Microsoft Office User" w:date="2026-10-22T13:30:00Z" w16du:dateUtc="2026-10-22T12:30:00Z">
+        <w:r>
+          <w:br w:type="page"/>
+        </w:r>
+      </w:ins>
+    </w:p>
+    <w:p>
+      <w:pPr>
+        <w:rPr>
+          <w:del w:id="90" w:author="Microsoft Office User" w:date="2026-10-22T13:30:00Z" w16du:dateUtc="2026-10-22T12:30:00Z"/>
+        </w:rPr>
+      </w:pPr>
+      <w:del w:id="91" w:author="Microsoft Office User" w:date="2026-10-22T13:30:00Z" w16du:dateUtc="2026-10-22T12:30:00Z">
+        <w:r>
+          <w:lastRenderedPageBreak/>
+          <w:delText>Table of content page for later reserved</w:delText>
+        </w:r>
+      </w:del>
+    </w:p>
+    <w:p>
+      <w:pPr>
+        <w:rPr>
+          <w:del w:id="92" w:author="Microsoft Office User" w:date="2026-10-22T13:31:00Z" w16du:dateUtc="2026-10-22T12:31:00Z"/>
+        </w:rPr>
+      </w:pPr>
+    </w:p>
+    <w:p>
+      <w:pPr>
+        <w:rPr>
+          <w:del w:id="93" w:author="Microsoft Office User" w:date="2026-10-22T13:31:00Z" w16du:dateUtc="2026-10-22T12:31:00Z"/>
+        </w:rPr>
+      </w:pPr>
+    </w:p>
+    <w:p>
+      <w:pPr>
+        <w:rPr>
+          <w:del w:id="94" w:author="Microsoft Office User" w:date="2026-10-22T13:31:00Z" w16du:dateUtc="2026-10-22T12:31:00Z"/>
+        </w:rPr>
+      </w:pPr>
+    </w:p>
+    <w:p>
+      <w:pPr>
+        <w:rPr>
+          <w:del w:id="95" w:author="Microsoft Office User" w:date="2026-10-22T13:31:00Z" w16du:dateUtc="2026-10-22T12:31:00Z"/>
+        </w:rPr>
+      </w:pPr>
+    </w:p>
+    <w:p>
+      <w:pPr>
+        <w:rPr>
+          <w:del w:id="96" w:author="Microsoft Office User" w:date="2026-10-22T13:31:00Z" w16du:dateUtc="2026-10-22T12:31:00Z"/>
+        </w:rPr>
+      </w:pPr>
+    </w:p>
+    <w:p>
+      <w:pPr>
+        <w:rPr>
+          <w:del w:id="97" w:author="Microsoft Office User" w:date="2026-10-22T13:31:00Z" w16du:dateUtc="2026-10-22T12:31:00Z"/>
+        </w:rPr>
+      </w:pPr>
+    </w:p>
+    <w:p>
+      <w:pPr>
+        <w:rPr>
+          <w:del w:id="98" w:author="Microsoft Office User" w:date="2026-10-22T13:31:00Z" w16du:dateUtc="2026-10-22T12:31:00Z"/>
+        </w:rPr>
+      </w:pPr>
+    </w:p>
+    <w:p>
+      <w:pPr>
+        <w:rPr>
+          <w:del w:id="99" w:author="Microsoft Office User" w:date="2026-10-22T13:31:00Z" w16du:dateUtc="2026-10-22T12:31:00Z"/>
+        </w:rPr>
+      </w:pPr>
+    </w:p>
+    <w:p>
+      <w:pPr>
+        <w:rPr>
+          <w:del w:id="100" w:author="Microsoft Office User" w:date="2026-10-22T13:31:00Z" w16du:dateUtc="2026-10-22T12:31:00Z"/>
+        </w:rPr>
+      </w:pPr>
+    </w:p>
+    <w:p>
+      <w:pPr>
+        <w:rPr>
+          <w:del w:id="101" w:author="Microsoft Office User" w:date="2026-10-22T13:31:00Z" w16du:dateUtc="2026-10-22T12:31:00Z"/>
+        </w:rPr>
+      </w:pPr>
+    </w:p>
+    <w:p>
+      <w:pPr>
+        <w:rPr>
+          <w:del w:id="102" w:author="Microsoft Office User" w:date="2026-10-22T13:31:00Z" w16du:dateUtc="2026-10-22T12:31:00Z"/>
+        </w:rPr>
+      </w:pPr>
+    </w:p>
+    <w:p>
+      <w:pPr>
+        <w:rPr>
+          <w:del w:id="103" w:author="Microsoft Office User" w:date="2026-10-22T13:31:00Z" w16du:dateUtc="2026-10-22T12:31:00Z"/>
+        </w:rPr>
+      </w:pPr>
+    </w:p>
+    <w:p>
+      <w:pPr>
+        <w:rPr>
+          <w:del w:id="104" w:author="Microsoft Office User" w:date="2026-10-22T13:31:00Z" w16du:dateUtc="2026-10-22T12:31:00Z"/>
+        </w:rPr>
+      </w:pPr>
+    </w:p>
+    <w:p>
+      <w:pPr>
+        <w:rPr>
+          <w:del w:id="105" w:author="Microsoft Office User" w:date="2026-10-22T13:31:00Z" w16du:dateUtc="2026-10-22T12:31:00Z"/>
+        </w:rPr>
+      </w:pPr>
+    </w:p>
+    <w:p>
+      <w:pPr>
+        <w:rPr>
+          <w:del w:id="106" w:author="Microsoft Office User" w:date="2026-10-22T13:31:00Z" w16du:dateUtc="2026-10-22T12:31:00Z"/>
+        </w:rPr>
+      </w:pPr>
+    </w:p>
+    <w:p>
+      <w:pPr>
+        <w:rPr>
+          <w:del w:id="107" w:author="Microsoft Office User" w:date="2026-10-22T13:31:00Z" w16du:dateUtc="2026-10-22T12:31:00Z"/>
+        </w:rPr>
+      </w:pPr>
+    </w:p>
+    <w:p>
+      <w:pPr>
+        <w:rPr>
+          <w:del w:id="108" w:author="Microsoft Office User" w:date="2026-10-22T13:31:00Z" w16du:dateUtc="2026-10-22T12:31:00Z"/>
+        </w:rPr>
+      </w:pPr>
+    </w:p>
+    <w:p>
+      <w:pPr>
+        <w:rPr>
+          <w:del w:id="109" w:author="Microsoft Office User" w:date="2026-10-22T13:31:00Z" w16du:dateUtc="2026-10-22T12:31:00Z"/>
+        </w:rPr>
+      </w:pPr>
+    </w:p>
+    <w:p>
+      <w:pPr>
+        <w:rPr>
+          <w:del w:id="110" w:author="Microsoft Office User" w:date="2026-10-22T13:31:00Z" w16du:dateUtc="2026-10-22T12:31:00Z"/>
+        </w:rPr>
+      </w:pPr>
+    </w:p>
+    <w:p>
+      <w:pPr>
+        <w:rPr>
+          <w:del w:id="111" w:author="Microsoft Office User" w:date="2026-10-22T13:31:00Z" w16du:dateUtc="2026-10-22T12:31:00Z"/>
+        </w:rPr>
+      </w:pPr>
+    </w:p>
+    <w:p>
+      <w:pPr>
+        <w:rPr>
+          <w:del w:id="112" w:author="Microsoft Office User" w:date="2026-10-22T13:31:00Z" w16du:dateUtc="2026-10-22T12:31:00Z"/>
+        </w:rPr>
+      </w:pPr>
+    </w:p>
+    <w:p>
+      <w:pPr>
+        <w:rPr>
+          <w:del w:id="113" w:author="Microsoft Office User" w:date="2026-10-22T13:31:00Z" w16du:dateUtc="2026-10-22T12:31:00Z"/>
+        </w:rPr>
+      </w:pPr>
+    </w:p>
+    <w:p>
+      <w:pPr>
+        <w:rPr>
+          <w:del w:id="114" w:author="Microsoft Office User" w:date="2026-10-22T13:31:00Z" w16du:dateUtc="2026-10-22T12:31:00Z"/>
+        </w:rPr>
+      </w:pPr>
+    </w:p>
+    <w:p>
+      <w:pPr>
+        <w:rPr>
+          <w:del w:id="115" w:author="Microsoft Office User" w:date="2026-10-22T13:31:00Z" w16du:dateUtc="2026-10-22T12:31:00Z"/>
+        </w:rPr>
+      </w:pPr>
+    </w:p>
+    <w:p>
+      <w:pPr>
+        <w:rPr>
+          <w:del w:id="116" w:author="Microsoft Office User" w:date="2026-10-22T13:31:00Z" w16du:dateUtc="2026-10-22T12:31:00Z"/>
+        </w:rPr>
+      </w:pPr>
+    </w:p>
+    <w:p>
+      <w:pPr>
+        <w:rPr>
+          <w:del w:id="117" w:author="Microsoft Office User" w:date="2026-10-19T16:41:00Z" w16du:dateUtc="2026-10-19T15:41:00Z"/>
+        </w:rPr>
+      </w:pPr>
+    </w:p>
+    <w:p>
+      <w:pPr>
+        <w:rPr>
+          <w:del w:id="118" w:author="Microsoft Office User" w:date="2026-10-19T16:41:00Z" w16du:dateUtc="2026-10-19T15:41:00Z"/>
+        </w:rPr>
+      </w:pPr>
+    </w:p>
+    <w:p>
+      <w:pPr>
+        <w:rPr>
+          <w:del w:id="119" w:author="Microsoft Office User" w:date="2026-10-22T13:31:00Z" w16du:dateUtc="2026-10-22T12:31:00Z"/>
+        </w:rPr>
+      </w:pPr>
+    </w:p>
     <w:p>
       <w:pPr>
         <w:keepNext/>
@@ -1320,7 +2815,7 @@
         <w:jc w:val="both"/>
         <w:outlineLvl w:val="0"/>
         <w:rPr>
-          <w:ins w:id="14" w:author="Microsoft Office User" w:date="2026-10-19T16:49:00Z" w16du:dateUtc="2026-10-19T15:49:00Z"/>
+          <w:ins w:id="120" w:author="Microsoft Office User" w:date="2026-10-19T16:49:00Z" w16du:dateUtc="2026-10-19T15:49:00Z"/>
           <w:rFonts w:ascii="Calibri" w:eastAsia="MS Gothic" w:hAnsi="Calibri" w:cs="Times New Roman"/>
           <w:b/>
           <w:bCs/>
@@ -1328,7 +2823,7 @@
           <w:sz w:val="28"/>
           <w:szCs w:val="28"/>
         </w:rPr>
-        <w:pPrChange w:id="15" w:author="Microsoft Office User" w:date="2026-10-19T19:07:00Z" w16du:dateUtc="2026-10-19T18:07:00Z">
+        <w:pPrChange w:id="121" w:author="Microsoft Office User" w:date="2026-10-19T19:07:00Z" w16du:dateUtc="2026-10-19T18:07:00Z">
           <w:pPr>
             <w:keepNext/>
             <w:keepLines/>
@@ -1337,8 +2832,8 @@
           </w:pPr>
         </w:pPrChange>
       </w:pPr>
-      <w:bookmarkStart w:id="16" w:name="_Toc243051546"/>
-      <w:ins w:id="17" w:author="Microsoft Office User" w:date="2026-10-19T16:49:00Z" w16du:dateUtc="2026-10-19T15:49:00Z">
+      <w:bookmarkStart w:id="122" w:name="_Toc243051546"/>
+      <w:ins w:id="123" w:author="Microsoft Office User" w:date="2026-10-19T16:49:00Z" w16du:dateUtc="2026-10-19T15:49:00Z">
         <w:r>
           <w:rPr>
             <w:rFonts w:ascii="Calibri" w:eastAsia="MS Gothic" w:hAnsi="Calibri" w:cs="Times New Roman"/>
@@ -1356,17 +2851,17 @@
       <w:pPr>
         <w:jc w:val="both"/>
         <w:rPr>
-          <w:del w:id="18" w:author="Microsoft Office User" w:date="2026-10-19T16:49:00Z" w16du:dateUtc="2026-10-19T15:49:00Z"/>
+          <w:del w:id="124" w:author="Microsoft Office User" w:date="2026-10-19T16:49:00Z" w16du:dateUtc="2026-10-19T15:49:00Z"/>
           <w:b/>
           <w:bCs/>
           <w:sz w:val="28"/>
           <w:szCs w:val="24"/>
         </w:rPr>
-        <w:pPrChange w:id="19" w:author="Microsoft Office User" w:date="2026-10-19T19:07:00Z" w16du:dateUtc="2026-10-19T18:07:00Z">
+        <w:pPrChange w:id="125" w:author="Microsoft Office User" w:date="2026-10-19T19:07:00Z" w16du:dateUtc="2026-10-19T18:07:00Z">
           <w:pPr/>
         </w:pPrChange>
       </w:pPr>
-      <w:ins w:id="20" w:author="Microsoft Office User" w:date="2026-10-19T16:49:00Z" w16du:dateUtc="2026-10-19T15:49:00Z">
+      <w:ins w:id="126" w:author="Microsoft Office User" w:date="2026-10-19T16:49:00Z" w16du:dateUtc="2026-10-19T15:49:00Z">
         <w:r>
           <w:rPr>
             <w:b/>
@@ -1377,7 +2872,7 @@
           <w:tab/>
         </w:r>
       </w:ins>
-      <w:del w:id="21" w:author="Microsoft Office User" w:date="2026-10-19T16:49:00Z" w16du:dateUtc="2026-10-19T15:49:00Z">
+      <w:del w:id="127" w:author="Microsoft Office User" w:date="2026-10-19T16:49:00Z" w16du:dateUtc="2026-10-19T15:49:00Z">
         <w:r>
           <w:rPr>
             <w:b/>
@@ -1387,16 +2882,16 @@
           </w:rPr>
           <w:delText>1. Project Title</w:delText>
         </w:r>
-        <w:bookmarkEnd w:id="16"/>
+        <w:bookmarkEnd w:id="122"/>
       </w:del>
     </w:p>
     <w:p>
       <w:pPr>
         <w:jc w:val="both"/>
         <w:rPr>
-          <w:ins w:id="22" w:author="Microsoft Office User" w:date="2026-10-19T16:37:00Z" w16du:dateUtc="2026-10-19T15:37:00Z"/>
-        </w:rPr>
-        <w:pPrChange w:id="23" w:author="Microsoft Office User" w:date="2026-10-19T19:07:00Z" w16du:dateUtc="2026-10-19T18:07:00Z">
+          <w:ins w:id="128" w:author="Microsoft Office User" w:date="2026-10-19T16:37:00Z" w16du:dateUtc="2026-10-19T15:37:00Z"/>
+        </w:rPr>
+        <w:pPrChange w:id="129" w:author="Microsoft Office User" w:date="2026-10-19T19:07:00Z" w16du:dateUtc="2026-10-19T18:07:00Z">
           <w:pPr/>
         </w:pPrChange>
       </w:pPr>
@@ -1412,7 +2907,7 @@
         <w:jc w:val="both"/>
         <w:outlineLvl w:val="0"/>
         <w:rPr>
-          <w:ins w:id="24" w:author="Microsoft Office User" w:date="2026-10-19T16:48:00Z" w16du:dateUtc="2026-10-19T15:48:00Z"/>
+          <w:ins w:id="130" w:author="Microsoft Office User" w:date="2026-10-19T16:48:00Z" w16du:dateUtc="2026-10-19T15:48:00Z"/>
           <w:rFonts w:ascii="Calibri" w:eastAsia="MS Gothic" w:hAnsi="Calibri" w:cs="Times New Roman"/>
           <w:b/>
           <w:bCs/>
@@ -1420,7 +2915,7 @@
           <w:sz w:val="28"/>
           <w:szCs w:val="28"/>
         </w:rPr>
-        <w:pPrChange w:id="25" w:author="Microsoft Office User" w:date="2026-10-19T19:07:00Z" w16du:dateUtc="2026-10-19T18:07:00Z">
+        <w:pPrChange w:id="131" w:author="Microsoft Office User" w:date="2026-10-19T19:07:00Z" w16du:dateUtc="2026-10-19T18:07:00Z">
           <w:pPr>
             <w:keepNext/>
             <w:keepLines/>
@@ -1429,8 +2924,8 @@
           </w:pPr>
         </w:pPrChange>
       </w:pPr>
-      <w:bookmarkStart w:id="26" w:name="_Toc243051547"/>
-      <w:ins w:id="27" w:author="Microsoft Office User" w:date="2026-10-19T16:48:00Z" w16du:dateUtc="2026-10-19T15:48:00Z">
+      <w:bookmarkStart w:id="132" w:name="_Toc243051547"/>
+      <w:ins w:id="133" w:author="Microsoft Office User" w:date="2026-10-19T16:48:00Z" w16du:dateUtc="2026-10-19T15:48:00Z">
         <w:r>
           <w:rPr>
             <w:rFonts w:ascii="Calibri" w:eastAsia="MS Gothic" w:hAnsi="Calibri" w:cs="Times New Roman"/>
@@ -1442,7 +2937,7 @@
           </w:rPr>
           <w:t>2. Introduction</w:t>
         </w:r>
-        <w:bookmarkEnd w:id="26"/>
+        <w:bookmarkEnd w:id="132"/>
       </w:ins>
     </w:p>
     <w:p>
@@ -1451,16 +2946,30 @@
         <w:ind w:firstLine="720"/>
         <w:jc w:val="both"/>
         <w:rPr>
-          <w:ins w:id="28" w:author="Microsoft Office User" w:date="2026-10-19T16:48:00Z" w16du:dateUtc="2026-10-19T15:48:00Z"/>
+          <w:ins w:id="134" w:author="Microsoft Office User" w:date="2026-10-19T16:48:00Z" w16du:dateUtc="2026-10-19T15:48:00Z"/>
           <w:rFonts w:eastAsia="MS Mincho" w:cs="Times New Roman"/>
         </w:rPr>
       </w:pPr>
-      <w:ins w:id="29" w:author="Microsoft Office User" w:date="2026-10-19T16:48:00Z" w16du:dateUtc="2026-10-19T15:48:00Z">
+      <w:ins w:id="135" w:author="Microsoft Office User" w:date="2026-10-19T16:48:00Z" w16du:dateUtc="2026-10-19T15:48:00Z">
         <w:r>
           <w:rPr>
             <w:rFonts w:eastAsia="MS Mincho" w:cs="Times New Roman"/>
           </w:rPr>
-          <w:t>Tourism remains one of the most important economic sectors in the European Union, supporting employment, regional development and a substantial share of GDP. EU residents undertake more than 1.2 billion trips each year, yet demand is characterised by pronounced seasonality and clear differences between domestic and foreign destinations. Hotels, airlines, local authorities and tourism boards must therefore manage capacity, pricing, staffing and infrastructure in conditions of considerable uncertainty.</w:t>
+          <w:t xml:space="preserve">Tourism remains one of the most important economic sectors in the European Union, supporting employment, regional development and a substantial share of GDP. EU residents undertake more than 1.2 billion trips each year, yet demand is </w:t>
+        </w:r>
+        <w:proofErr w:type="spellStart"/>
+        <w:r>
+          <w:rPr>
+            <w:rFonts w:eastAsia="MS Mincho" w:cs="Times New Roman"/>
+          </w:rPr>
+          <w:t>characterised</w:t>
+        </w:r>
+        <w:proofErr w:type="spellEnd"/>
+        <w:r>
+          <w:rPr>
+            <w:rFonts w:eastAsia="MS Mincho" w:cs="Times New Roman"/>
+          </w:rPr>
+          <w:t xml:space="preserve"> by pronounced seasonality and clear differences between domestic and foreign destinations. Hotels, airlines, local authorities and tourism boards must therefore manage capacity, pricing, staffing and infrastructure in conditions of considerable uncertainty.</w:t>
         </w:r>
       </w:ins>
     </w:p>
@@ -1470,16 +2979,44 @@
         <w:ind w:firstLine="720"/>
         <w:jc w:val="both"/>
         <w:rPr>
-          <w:ins w:id="30" w:author="Microsoft Office User" w:date="2026-10-19T16:48:00Z" w16du:dateUtc="2026-10-19T15:48:00Z"/>
+          <w:ins w:id="136" w:author="Microsoft Office User" w:date="2026-10-19T16:48:00Z" w16du:dateUtc="2026-10-19T15:48:00Z"/>
           <w:rFonts w:eastAsia="MS Mincho" w:cs="Times New Roman"/>
         </w:rPr>
       </w:pPr>
-      <w:ins w:id="31" w:author="Microsoft Office User" w:date="2026-10-19T16:48:00Z" w16du:dateUtc="2026-10-19T15:48:00Z">
+      <w:ins w:id="137" w:author="Microsoft Office User" w:date="2026-10-19T16:48:00Z" w16du:dateUtc="2026-10-19T15:48:00Z">
         <w:r>
           <w:rPr>
             <w:rFonts w:eastAsia="MS Mincho" w:cs="Times New Roman"/>
           </w:rPr>
-          <w:t>This proposal outlines a project that will develop machine learning models to forecast tourism demand by month and destination. The work will draw on publicly available Eurostat data on trips by month of departure (dataset tour_dem_ttmd). By analysing historical patterns and producing reliable forecasts, the project addresses a concrete business problem in the tourism and hospitality sector and follows the tourism-related example suggested in the assessment guidelines. Accurate predictions can improve resource allocation, support more effective pricing decisions and help stakeholders plan for both peak and off-peak periods, while also contributing to efforts to distribute tourism more evenly throughout the year.</w:t>
+          <w:t xml:space="preserve">This proposal outlines a project that will develop machine learning models to forecast tourism demand by month and destination. The work will draw on publicly available Eurostat data on trips by month of departure (dataset </w:t>
+        </w:r>
+        <w:proofErr w:type="spellStart"/>
+        <w:r>
+          <w:rPr>
+            <w:rFonts w:eastAsia="MS Mincho" w:cs="Times New Roman"/>
+          </w:rPr>
+          <w:t>tour_dem_ttmd</w:t>
+        </w:r>
+        <w:proofErr w:type="spellEnd"/>
+        <w:r>
+          <w:rPr>
+            <w:rFonts w:eastAsia="MS Mincho" w:cs="Times New Roman"/>
+          </w:rPr>
+          <w:t xml:space="preserve">). By </w:t>
+        </w:r>
+        <w:proofErr w:type="spellStart"/>
+        <w:r>
+          <w:rPr>
+            <w:rFonts w:eastAsia="MS Mincho" w:cs="Times New Roman"/>
+          </w:rPr>
+          <w:t>analysing</w:t>
+        </w:r>
+        <w:proofErr w:type="spellEnd"/>
+        <w:r>
+          <w:rPr>
+            <w:rFonts w:eastAsia="MS Mincho" w:cs="Times New Roman"/>
+          </w:rPr>
+          <w:t xml:space="preserve"> historical patterns and producing reliable forecasts, the project addresses a concrete business problem in the tourism and hospitality sector and follows the tourism-related example suggested in the assessment guidelines. Accurate predictions can improve resource allocation, support more effective pricing decisions and help stakeholders plan for both peak and off-peak periods, while also contributing to efforts to distribute tourism more evenly throughout the year.</w:t>
         </w:r>
       </w:ins>
     </w:p>
@@ -1491,7 +3028,7 @@
         <w:jc w:val="both"/>
         <w:outlineLvl w:val="0"/>
         <w:rPr>
-          <w:ins w:id="32" w:author="Microsoft Office User" w:date="2026-10-19T19:06:00Z" w16du:dateUtc="2026-10-19T18:06:00Z"/>
+          <w:ins w:id="138" w:author="Microsoft Office User" w:date="2026-10-19T19:06:00Z" w16du:dateUtc="2026-10-19T18:06:00Z"/>
           <w:rFonts w:ascii="Calibri" w:eastAsia="MS Gothic" w:hAnsi="Calibri" w:cs="Times New Roman"/>
           <w:b/>
           <w:bCs/>
@@ -1499,7 +3036,7 @@
           <w:sz w:val="28"/>
           <w:szCs w:val="28"/>
         </w:rPr>
-        <w:pPrChange w:id="33" w:author="Microsoft Office User" w:date="2026-10-19T19:07:00Z" w16du:dateUtc="2026-10-19T18:07:00Z">
+        <w:pPrChange w:id="139" w:author="Microsoft Office User" w:date="2026-10-19T19:07:00Z" w16du:dateUtc="2026-10-19T18:07:00Z">
           <w:pPr>
             <w:keepNext/>
             <w:keepLines/>
@@ -1508,8 +3045,8 @@
           </w:pPr>
         </w:pPrChange>
       </w:pPr>
-      <w:bookmarkStart w:id="34" w:name="_Toc243051548"/>
-      <w:ins w:id="35" w:author="Microsoft Office User" w:date="2026-10-19T19:06:00Z" w16du:dateUtc="2026-10-19T18:06:00Z">
+      <w:bookmarkStart w:id="140" w:name="_Toc243051548"/>
+      <w:ins w:id="141" w:author="Microsoft Office User" w:date="2026-10-19T19:06:00Z" w16du:dateUtc="2026-10-19T18:06:00Z">
         <w:r>
           <w:rPr>
             <w:rFonts w:ascii="Calibri" w:eastAsia="MS Gothic" w:hAnsi="Calibri" w:cs="Times New Roman"/>
@@ -1521,7 +3058,7 @@
           </w:rPr>
           <w:t>3. Problem Definition</w:t>
         </w:r>
-        <w:bookmarkEnd w:id="34"/>
+        <w:bookmarkEnd w:id="140"/>
       </w:ins>
     </w:p>
     <w:p>
@@ -1530,16 +3067,30 @@
         <w:ind w:firstLine="720"/>
         <w:jc w:val="both"/>
         <w:rPr>
-          <w:ins w:id="36" w:author="Microsoft Office User" w:date="2026-10-19T19:06:00Z" w16du:dateUtc="2026-10-19T18:06:00Z"/>
+          <w:ins w:id="142" w:author="Microsoft Office User" w:date="2026-10-19T19:06:00Z" w16du:dateUtc="2026-10-19T18:06:00Z"/>
           <w:rFonts w:eastAsia="MS Mincho" w:cs="Times New Roman"/>
         </w:rPr>
       </w:pPr>
-      <w:ins w:id="37" w:author="Microsoft Office User" w:date="2026-10-19T19:06:00Z" w16du:dateUtc="2026-10-19T18:06:00Z">
+      <w:ins w:id="143" w:author="Microsoft Office User" w:date="2026-10-19T19:06:00Z" w16du:dateUtc="2026-10-19T18:06:00Z">
         <w:r>
           <w:rPr>
             <w:rFonts w:eastAsia="MS Mincho" w:cs="Times New Roman"/>
           </w:rPr>
-          <w:t>The central business problem is the strong seasonal variation and destination-specific fluctuation in tourism demand. Visitor numbers rise sharply in the summer months and fall significantly outside the peak season, creating operational difficulties for accommodation providers, transport operators and destination managers. During July and August many businesses face overcapacity and staffing shortages, while in shoulder and low seasons they experience underutilisation and reduced revenue. Without reliable forecasts, pricing remains largely reactive, marketing campaigns are timed less effectively, and longer-term investment decisions rest on incomplete information.</w:t>
+          <w:t xml:space="preserve">The central business problem is the strong seasonal variation and destination-specific fluctuation in tourism demand. Visitor numbers rise sharply in the summer months and fall significantly outside the peak season, creating operational difficulties for accommodation providers, transport operators and destination managers. During July and August many businesses face overcapacity and staffing shortages, while in shoulder and low seasons they experience </w:t>
+        </w:r>
+        <w:proofErr w:type="spellStart"/>
+        <w:r>
+          <w:rPr>
+            <w:rFonts w:eastAsia="MS Mincho" w:cs="Times New Roman"/>
+          </w:rPr>
+          <w:t>underutilisation</w:t>
+        </w:r>
+        <w:proofErr w:type="spellEnd"/>
+        <w:r>
+          <w:rPr>
+            <w:rFonts w:eastAsia="MS Mincho" w:cs="Times New Roman"/>
+          </w:rPr>
+          <w:t xml:space="preserve"> and reduced revenue. Without reliable forecasts, pricing remains largely reactive, marketing campaigns are timed less effectively, and longer-term investment decisions rest on incomplete information.</w:t>
         </w:r>
       </w:ins>
     </w:p>
@@ -1549,11 +3100,11 @@
         <w:ind w:firstLine="720"/>
         <w:jc w:val="both"/>
         <w:rPr>
-          <w:ins w:id="38" w:author="Microsoft Office User" w:date="2026-10-19T19:06:00Z" w16du:dateUtc="2026-10-19T18:06:00Z"/>
+          <w:ins w:id="144" w:author="Microsoft Office User" w:date="2026-10-19T19:06:00Z" w16du:dateUtc="2026-10-19T18:06:00Z"/>
           <w:rFonts w:eastAsia="MS Mincho" w:cs="Times New Roman"/>
         </w:rPr>
       </w:pPr>
-      <w:ins w:id="39" w:author="Microsoft Office User" w:date="2026-10-19T19:06:00Z" w16du:dateUtc="2026-10-19T18:06:00Z">
+      <w:ins w:id="145" w:author="Microsoft Office User" w:date="2026-10-19T19:06:00Z" w16du:dateUtc="2026-10-19T18:06:00Z">
         <w:r>
           <w:rPr>
             <w:rFonts w:eastAsia="MS Mincho" w:cs="Times New Roman"/>
@@ -1561,7 +3112,7 @@
           <w:t xml:space="preserve">Data </w:t>
         </w:r>
       </w:ins>
-      <w:ins w:id="40" w:author="Microsoft Office User" w:date="2026-10-19T20:46:00Z" w16du:dateUtc="2026-10-19T19:46:00Z">
+      <w:ins w:id="146" w:author="Microsoft Office User" w:date="2026-10-19T20:46:00Z" w16du:dateUtc="2026-10-19T19:46:00Z">
         <w:r>
           <w:rPr>
             <w:rFonts w:eastAsia="MS Mincho" w:cs="Times New Roman"/>
@@ -1569,29 +3120,29 @@
           <w:t>a</w:t>
         </w:r>
       </w:ins>
-      <w:ins w:id="41" w:author="Microsoft Office User" w:date="2026-10-19T19:06:00Z" w16du:dateUtc="2026-10-19T18:06:00Z">
+      <w:ins w:id="147" w:author="Microsoft Office User" w:date="2026-10-19T19:06:00Z" w16du:dateUtc="2026-10-19T18:06:00Z">
         <w:r>
           <w:rPr>
             <w:rFonts w:eastAsia="MS Mincho" w:cs="Times New Roman"/>
           </w:rPr>
-          <w:t xml:space="preserve">nalytics and predictive modelling offer a practical response. Historical trip data contain clear seasonal structure and relationships between destinations, trip purpose and duration. Time-series and machine learning techniques can capture these patterns and produce </w:t>
+          <w:t xml:space="preserve">nalytics and predictive modelling offer a practical response. Historical trip data contain clear seasonal structure and relationships between destinations, trip purpose and duration. Time-series and machine learning techniques can capture these patterns and produce forecasts that allow operators and policymakers to anticipate demand rather than simply react </w:t>
         </w:r>
         <w:r>
           <w:rPr>
             <w:rFonts w:eastAsia="MS Mincho" w:cs="Times New Roman"/>
           </w:rPr>
           <w:lastRenderedPageBreak/>
-          <w:t>forecasts that allow operators and policymakers to anticipate demand rather than simply react to it. In this way the project contributes directly to more efficient operations and better-informed planning in the European tourism sector.</w:t>
-        </w:r>
-      </w:ins>
-    </w:p>
-    <w:p>
-      <w:pPr>
-        <w:rPr>
-          <w:del w:id="42" w:author="Microsoft Office User" w:date="2026-10-19T16:38:00Z" w16du:dateUtc="2026-10-19T15:38:00Z"/>
-        </w:rPr>
-      </w:pPr>
-      <w:ins w:id="43" w:author="Microsoft Office User" w:date="2026-10-19T20:32:00Z" w16du:dateUtc="2026-10-19T19:32:00Z">
+          <w:t>to it. In this way the project contributes directly to more efficient operations and better-informed planning in the European tourism sector.</w:t>
+        </w:r>
+      </w:ins>
+    </w:p>
+    <w:p>
+      <w:pPr>
+        <w:rPr>
+          <w:del w:id="148" w:author="Microsoft Office User" w:date="2026-10-19T16:38:00Z" w16du:dateUtc="2026-10-19T15:38:00Z"/>
+        </w:rPr>
+      </w:pPr>
+      <w:ins w:id="149" w:author="Microsoft Office User" w:date="2026-10-19T20:32:00Z" w16du:dateUtc="2026-10-19T19:32:00Z">
         <w:r>
           <w:t>NBBN</w:t>
         </w:r>
@@ -1600,7 +3151,7 @@
     <w:p>
       <w:pPr>
         <w:rPr>
-          <w:ins w:id="44" w:author="Microsoft Office User" w:date="2026-10-19T20:32:00Z" w16du:dateUtc="2026-10-19T19:32:00Z"/>
+          <w:ins w:id="150" w:author="Microsoft Office User" w:date="2026-10-19T20:32:00Z" w16du:dateUtc="2026-10-19T19:32:00Z"/>
         </w:rPr>
       </w:pPr>
     </w:p>
@@ -1611,7 +3162,7 @@
         <w:spacing w:before="480" w:after="0"/>
         <w:outlineLvl w:val="0"/>
         <w:rPr>
-          <w:ins w:id="45" w:author="Microsoft Office User" w:date="2026-10-19T20:34:00Z" w16du:dateUtc="2026-10-19T19:34:00Z"/>
+          <w:ins w:id="151" w:author="Microsoft Office User" w:date="2026-10-19T20:34:00Z" w16du:dateUtc="2026-10-19T19:34:00Z"/>
           <w:rFonts w:ascii="Calibri" w:eastAsia="MS Gothic" w:hAnsi="Calibri" w:cs="Times New Roman"/>
           <w:b/>
           <w:bCs/>
@@ -1620,8 +3171,8 @@
           <w:szCs w:val="28"/>
         </w:rPr>
       </w:pPr>
-      <w:bookmarkStart w:id="46" w:name="_Toc243051549"/>
-      <w:ins w:id="47" w:author="Microsoft Office User" w:date="2026-10-19T20:34:00Z" w16du:dateUtc="2026-10-19T19:34:00Z">
+      <w:bookmarkStart w:id="152" w:name="_Toc243051549"/>
+      <w:ins w:id="153" w:author="Microsoft Office User" w:date="2026-10-19T20:34:00Z" w16du:dateUtc="2026-10-19T19:34:00Z">
         <w:r>
           <w:rPr>
             <w:rFonts w:ascii="Calibri" w:eastAsia="MS Gothic" w:hAnsi="Calibri" w:cs="Times New Roman"/>
@@ -1633,7 +3184,7 @@
           </w:rPr>
           <w:t>4. Aim and Objectives</w:t>
         </w:r>
-        <w:bookmarkEnd w:id="46"/>
+        <w:bookmarkEnd w:id="152"/>
       </w:ins>
     </w:p>
     <w:p>
@@ -1642,11 +3193,11 @@
         <w:ind w:firstLine="720"/>
         <w:jc w:val="both"/>
         <w:rPr>
-          <w:ins w:id="48" w:author="Microsoft Office User" w:date="2026-10-19T20:34:00Z" w16du:dateUtc="2026-10-19T19:34:00Z"/>
+          <w:ins w:id="154" w:author="Microsoft Office User" w:date="2026-10-19T20:34:00Z" w16du:dateUtc="2026-10-19T19:34:00Z"/>
           <w:rFonts w:eastAsia="MS Mincho" w:cs="Times New Roman"/>
         </w:rPr>
       </w:pPr>
-      <w:ins w:id="49" w:author="Microsoft Office User" w:date="2026-10-19T20:34:00Z" w16du:dateUtc="2026-10-19T19:34:00Z">
+      <w:ins w:id="155" w:author="Microsoft Office User" w:date="2026-10-19T20:34:00Z" w16du:dateUtc="2026-10-19T19:34:00Z">
         <w:r>
           <w:rPr>
             <w:rFonts w:eastAsia="MS Mincho" w:cs="Times New Roman"/>
@@ -1661,16 +3212,60 @@
         <w:ind w:firstLine="720"/>
         <w:jc w:val="both"/>
         <w:rPr>
-          <w:ins w:id="50" w:author="Microsoft Office User" w:date="2026-10-19T20:34:00Z" w16du:dateUtc="2026-10-19T19:34:00Z"/>
+          <w:ins w:id="156" w:author="Microsoft Office User" w:date="2026-10-19T20:34:00Z" w16du:dateUtc="2026-10-19T19:34:00Z"/>
           <w:rFonts w:eastAsia="MS Mincho" w:cs="Times New Roman"/>
         </w:rPr>
       </w:pPr>
-      <w:ins w:id="51" w:author="Microsoft Office User" w:date="2026-10-19T20:34:00Z" w16du:dateUtc="2026-10-19T19:34:00Z">
+      <w:ins w:id="157" w:author="Microsoft Office User" w:date="2026-10-19T20:34:00Z" w16du:dateUtc="2026-10-19T19:34:00Z">
         <w:r>
           <w:rPr>
             <w:rFonts w:eastAsia="MS Mincho" w:cs="Times New Roman"/>
           </w:rPr>
-          <w:t>To achieve this aim the project will first collect, clean and prepare the tour_dem_ttmd dataset so that it is suitable for time-series analysis. Exploratory data analysis will then be carried out to identify seasonal patterns, longer-term trends and relationships between destinations and other trip characteristics. On this foundation several predictive approaches will be designed and compared, including classical time-series methods such as SARIMA and more flexible techniques such as Prophet and recurrent neural networks. Model performance will be assessed using standard error metrics on hold-out data, after which forecasts for future months will be generated and interpreted. Finally, the project will translate the analytical results into practical insights and visualisations that tourism businesses and authorities can use when managing seasonality and capacity.</w:t>
+          <w:t xml:space="preserve">To achieve </w:t>
+        </w:r>
+        <w:proofErr w:type="gramStart"/>
+        <w:r>
+          <w:rPr>
+            <w:rFonts w:eastAsia="MS Mincho" w:cs="Times New Roman"/>
+          </w:rPr>
+          <w:t>this</w:t>
+        </w:r>
+        <w:proofErr w:type="gramEnd"/>
+        <w:r>
+          <w:rPr>
+            <w:rFonts w:eastAsia="MS Mincho" w:cs="Times New Roman"/>
+          </w:rPr>
+          <w:t xml:space="preserve"> aim the project will first collect, clean and prepare the </w:t>
+        </w:r>
+        <w:proofErr w:type="spellStart"/>
+        <w:r>
+          <w:rPr>
+            <w:rFonts w:eastAsia="MS Mincho" w:cs="Times New Roman"/>
+          </w:rPr>
+          <w:t>tour_dem_ttmd</w:t>
+        </w:r>
+        <w:proofErr w:type="spellEnd"/>
+        <w:r>
+          <w:rPr>
+            <w:rFonts w:eastAsia="MS Mincho" w:cs="Times New Roman"/>
+          </w:rPr>
+          <w:t xml:space="preserve"> dataset so that it is suitable for time-series analysis. Exploratory data analysis will then be carried out to identify seasonal patterns, longer-term trends and relationships between destinations and other trip characteristics. On this foundation several predictive approaches will be designed and compared, including classical time-series methods such as SARIMA and more flexible techniques such as Prophet and recurrent neural networks. Model performance will be assessed using standard error metrics on hold-out data, after which forecasts for future months will be generated and interpreted. Finally, the project will translate the analytical results into practical insights and </w:t>
+        </w:r>
+      </w:ins>
+      <w:ins w:id="158" w:author="Microsoft Office User" w:date="2026-10-22T13:32:00Z" w16du:dateUtc="2026-10-22T12:32:00Z">
+        <w:r>
+          <w:rPr>
+            <w:rFonts w:eastAsia="MS Mincho" w:cs="Times New Roman"/>
+          </w:rPr>
+          <w:t>visualizations</w:t>
+        </w:r>
+      </w:ins>
+      <w:ins w:id="159" w:author="Microsoft Office User" w:date="2026-10-19T20:34:00Z" w16du:dateUtc="2026-10-19T19:34:00Z">
+        <w:r>
+          <w:rPr>
+            <w:rFonts w:eastAsia="MS Mincho" w:cs="Times New Roman"/>
+          </w:rPr>
+          <w:t xml:space="preserve"> that tourism businesses and authorities can use when managing seasonality and capacity.</w:t>
         </w:r>
       </w:ins>
     </w:p>
@@ -1680,24 +3275,56 @@
         <w:ind w:firstLine="720"/>
         <w:jc w:val="both"/>
         <w:rPr>
-          <w:ins w:id="52" w:author="Microsoft Office User" w:date="2026-10-19T20:32:00Z" w16du:dateUtc="2026-10-19T19:32:00Z"/>
+          <w:ins w:id="160" w:author="Microsoft Office User" w:date="2026-10-19T20:32:00Z" w16du:dateUtc="2026-10-19T19:32:00Z"/>
           <w:rFonts w:eastAsia="MS Mincho" w:cs="Times New Roman"/>
-          <w:rPrChange w:id="53" w:author="Microsoft Office User" w:date="2026-10-19T20:35:00Z" w16du:dateUtc="2026-10-19T19:35:00Z">
+          <w:rPrChange w:id="161" w:author="Microsoft Office User" w:date="2026-10-19T20:35:00Z" w16du:dateUtc="2026-10-19T19:35:00Z">
             <w:rPr>
-              <w:ins w:id="54" w:author="Microsoft Office User" w:date="2026-10-19T20:32:00Z" w16du:dateUtc="2026-10-19T19:32:00Z"/>
+              <w:ins w:id="162" w:author="Microsoft Office User" w:date="2026-10-19T20:32:00Z" w16du:dateUtc="2026-10-19T19:32:00Z"/>
             </w:rPr>
           </w:rPrChange>
         </w:rPr>
-        <w:pPrChange w:id="55" w:author="Microsoft Office User" w:date="2026-10-19T20:35:00Z" w16du:dateUtc="2026-10-19T19:35:00Z">
+        <w:pPrChange w:id="163" w:author="Microsoft Office User" w:date="2026-10-19T20:35:00Z" w16du:dateUtc="2026-10-19T19:35:00Z">
           <w:pPr/>
         </w:pPrChange>
       </w:pPr>
-      <w:ins w:id="56" w:author="Microsoft Office User" w:date="2026-10-19T20:34:00Z" w16du:dateUtc="2026-10-19T19:34:00Z">
+      <w:ins w:id="164" w:author="Microsoft Office User" w:date="2026-10-19T20:34:00Z" w16du:dateUtc="2026-10-19T19:34:00Z">
         <w:r>
           <w:rPr>
             <w:rFonts w:eastAsia="MS Mincho" w:cs="Times New Roman"/>
           </w:rPr>
-          <w:t>The underlying business hypothesis is that sufficiently accurate monthly forecasts by destination will enable tourism organisations to improve operational efficiency, optimise pricing and staffing, and develop strategies that reduce the negative effects of strong seasonality.</w:t>
+          <w:t xml:space="preserve">The underlying business hypothesis is that sufficiently accurate monthly forecasts by destination will enable tourism </w:t>
+        </w:r>
+      </w:ins>
+      <w:ins w:id="165" w:author="Microsoft Office User" w:date="2026-10-22T13:32:00Z" w16du:dateUtc="2026-10-22T12:32:00Z">
+        <w:r>
+          <w:rPr>
+            <w:rFonts w:eastAsia="MS Mincho" w:cs="Times New Roman"/>
+          </w:rPr>
+          <w:t>organizations</w:t>
+        </w:r>
+      </w:ins>
+      <w:ins w:id="166" w:author="Microsoft Office User" w:date="2026-10-19T20:34:00Z" w16du:dateUtc="2026-10-19T19:34:00Z">
+        <w:r>
+          <w:rPr>
+            <w:rFonts w:eastAsia="MS Mincho" w:cs="Times New Roman"/>
+          </w:rPr>
+          <w:t xml:space="preserve"> to improve operational efficiency, </w:t>
+        </w:r>
+      </w:ins>
+      <w:ins w:id="167" w:author="Microsoft Office User" w:date="2026-10-22T13:32:00Z" w16du:dateUtc="2026-10-22T12:32:00Z">
+        <w:r>
+          <w:rPr>
+            <w:rFonts w:eastAsia="MS Mincho" w:cs="Times New Roman"/>
+          </w:rPr>
+          <w:t>optimize</w:t>
+        </w:r>
+      </w:ins>
+      <w:ins w:id="168" w:author="Microsoft Office User" w:date="2026-10-19T20:34:00Z" w16du:dateUtc="2026-10-19T19:34:00Z">
+        <w:r>
+          <w:rPr>
+            <w:rFonts w:eastAsia="MS Mincho" w:cs="Times New Roman"/>
+          </w:rPr>
+          <w:t xml:space="preserve"> pricing and staffing, and develop strategies that reduce the negative effects of strong seasonality.</w:t>
         </w:r>
       </w:ins>
     </w:p>
@@ -1705,7 +3332,7 @@
       <w:pPr>
         <w:pStyle w:val="Heading1"/>
         <w:rPr>
-          <w:ins w:id="57" w:author="Microsoft Office User" w:date="2026-10-19T20:39:00Z" w16du:dateUtc="2026-10-19T19:39:00Z"/>
+          <w:ins w:id="169" w:author="Microsoft Office User" w:date="2026-10-19T20:39:00Z" w16du:dateUtc="2026-10-19T19:39:00Z"/>
           <w:rFonts w:ascii="Calibri" w:eastAsia="MS Gothic" w:hAnsi="Calibri" w:cs="Times New Roman"/>
           <w:b/>
           <w:bCs/>
@@ -1714,8 +3341,8 @@
           <w:szCs w:val="28"/>
         </w:rPr>
       </w:pPr>
-      <w:bookmarkStart w:id="58" w:name="_Toc243051550"/>
-      <w:ins w:id="59" w:author="Microsoft Office User" w:date="2026-10-19T20:39:00Z" w16du:dateUtc="2026-10-19T19:39:00Z">
+      <w:bookmarkStart w:id="170" w:name="_Toc243051550"/>
+      <w:ins w:id="171" w:author="Microsoft Office User" w:date="2026-10-19T20:39:00Z" w16du:dateUtc="2026-10-19T19:39:00Z">
         <w:r>
           <w:rPr>
             <w:rFonts w:ascii="Calibri" w:eastAsia="MS Gothic" w:hAnsi="Calibri" w:cs="Times New Roman"/>
@@ -1727,7 +3354,7 @@
           </w:rPr>
           <w:t>5. Scope</w:t>
         </w:r>
-        <w:bookmarkEnd w:id="58"/>
+        <w:bookmarkEnd w:id="170"/>
       </w:ins>
     </w:p>
     <w:p>
@@ -1736,68 +3363,81 @@
         <w:ind w:firstLine="720"/>
         <w:jc w:val="both"/>
         <w:rPr>
-          <w:ins w:id="60" w:author="Microsoft Office User" w:date="2026-10-20T16:48:00Z" w16du:dateUtc="2026-10-20T15:48:00Z"/>
-        </w:rPr>
-      </w:pPr>
-      <w:ins w:id="61" w:author="Microsoft Office User" w:date="2026-10-19T20:40:00Z" w16du:dateUtc="2026-10-19T19:40:00Z">
-        <w:r>
-          <w:t xml:space="preserve">The project will analyse </w:t>
-        </w:r>
-      </w:ins>
-      <w:ins w:id="62" w:author="Microsoft Office User" w:date="2026-10-20T16:43:00Z" w16du:dateUtc="2026-10-20T15:43:00Z">
-        <w:r>
-          <w:t>Eurostat tour_dem_ttmd</w:t>
-        </w:r>
+          <w:ins w:id="172" w:author="Microsoft Office User" w:date="2026-10-20T16:48:00Z" w16du:dateUtc="2026-10-20T15:48:00Z"/>
+        </w:rPr>
+      </w:pPr>
+      <w:ins w:id="173" w:author="Microsoft Office User" w:date="2026-10-19T20:40:00Z" w16du:dateUtc="2026-10-19T19:40:00Z">
+        <w:r>
+          <w:t xml:space="preserve">The project will </w:t>
+        </w:r>
+        <w:proofErr w:type="spellStart"/>
+        <w:r>
+          <w:t>analyse</w:t>
+        </w:r>
+        <w:proofErr w:type="spellEnd"/>
+        <w:r>
+          <w:t xml:space="preserve"> </w:t>
+        </w:r>
+      </w:ins>
+      <w:ins w:id="174" w:author="Microsoft Office User" w:date="2026-10-20T16:43:00Z" w16du:dateUtc="2026-10-20T15:43:00Z">
+        <w:r>
+          <w:t xml:space="preserve">Eurostat </w:t>
+        </w:r>
+        <w:proofErr w:type="spellStart"/>
+        <w:r>
+          <w:t>tour_dem_ttmd</w:t>
+        </w:r>
+        <w:proofErr w:type="spellEnd"/>
         <w:r>
           <w:t xml:space="preserve"> data for the p</w:t>
         </w:r>
       </w:ins>
-      <w:ins w:id="63" w:author="Microsoft Office User" w:date="2026-10-20T16:44:00Z" w16du:dateUtc="2026-10-20T15:44:00Z">
+      <w:ins w:id="175" w:author="Microsoft Office User" w:date="2026-10-20T16:44:00Z" w16du:dateUtc="2026-10-20T15:44:00Z">
         <w:r>
           <w:t>eriod 2012-2024, covering EU and selected European reporting countries. The focus will be on the number of trips broken by the mont</w:t>
         </w:r>
       </w:ins>
-      <w:ins w:id="64" w:author="Microsoft Office User" w:date="2026-10-20T16:45:00Z" w16du:dateUtc="2026-10-20T15:45:00Z">
+      <w:ins w:id="176" w:author="Microsoft Office User" w:date="2026-10-20T16:45:00Z" w16du:dateUtc="2026-10-20T15:45:00Z">
         <w:r>
           <w:t xml:space="preserve">h of departure, destination type (domestic and foreign), purpose and duration where these dimensions are </w:t>
         </w:r>
       </w:ins>
-      <w:ins w:id="65" w:author="Microsoft Office User" w:date="2026-10-20T16:46:00Z" w16du:dateUtc="2026-10-20T15:46:00Z">
+      <w:ins w:id="177" w:author="Microsoft Office User" w:date="2026-10-20T16:46:00Z" w16du:dateUtc="2026-10-20T15:46:00Z">
         <w:r>
           <w:t>available. Forecasting models will be developed for monthly demand at both aggregate and selected destination levels, and the work will include a comparison o</w:t>
         </w:r>
       </w:ins>
-      <w:ins w:id="66" w:author="Microsoft Office User" w:date="2026-10-21T16:36:00Z" w16du:dateUtc="2026-10-21T15:36:00Z">
+      <w:ins w:id="178" w:author="Microsoft Office User" w:date="2026-10-21T16:36:00Z" w16du:dateUtc="2026-10-21T15:36:00Z">
         <w:r>
           <w:t>f</w:t>
         </w:r>
       </w:ins>
-      <w:ins w:id="67" w:author="Microsoft Office User" w:date="2026-10-20T16:46:00Z" w16du:dateUtc="2026-10-20T15:46:00Z">
+      <w:ins w:id="179" w:author="Microsoft Office User" w:date="2026-10-20T16:46:00Z" w16du:dateUtc="2026-10-20T15:46:00Z">
         <w:r>
           <w:t xml:space="preserve"> at least three</w:t>
         </w:r>
       </w:ins>
-      <w:ins w:id="68" w:author="Microsoft Office User" w:date="2026-10-20T16:47:00Z" w16du:dateUtc="2026-10-20T15:47:00Z">
+      <w:ins w:id="180" w:author="Microsoft Office User" w:date="2026-10-20T16:47:00Z" w16du:dateUtc="2026-10-20T15:47:00Z">
         <w:r>
           <w:t xml:space="preserve"> modelling approaches together with supporting </w:t>
         </w:r>
       </w:ins>
-      <w:ins w:id="69" w:author="Microsoft Office User" w:date="2026-10-20T16:48:00Z" w16du:dateUtc="2026-10-20T15:48:00Z">
+      <w:ins w:id="181" w:author="Microsoft Office User" w:date="2026-10-20T16:48:00Z" w16du:dateUtc="2026-10-20T15:48:00Z">
         <w:r>
           <w:t>visualizations</w:t>
         </w:r>
       </w:ins>
-      <w:ins w:id="70" w:author="Microsoft Office User" w:date="2026-10-20T16:47:00Z" w16du:dateUtc="2026-10-20T15:47:00Z">
+      <w:ins w:id="182" w:author="Microsoft Office User" w:date="2026-10-20T16:47:00Z" w16du:dateUtc="2026-10-20T15:47:00Z">
         <w:r>
           <w:t xml:space="preserve"> and </w:t>
         </w:r>
       </w:ins>
-      <w:ins w:id="71" w:author="Microsoft Office User" w:date="2026-10-20T16:48:00Z" w16du:dateUtc="2026-10-20T15:48:00Z">
+      <w:ins w:id="183" w:author="Microsoft Office User" w:date="2026-10-20T16:48:00Z" w16du:dateUtc="2026-10-20T15:48:00Z">
         <w:r>
           <w:t>business</w:t>
         </w:r>
       </w:ins>
-      <w:ins w:id="72" w:author="Microsoft Office User" w:date="2026-10-20T16:47:00Z" w16du:dateUtc="2026-10-20T15:47:00Z">
+      <w:ins w:id="184" w:author="Microsoft Office User" w:date="2026-10-20T16:47:00Z" w16du:dateUtc="2026-10-20T15:47:00Z">
         <w:r>
           <w:t>-orientated interpretation.</w:t>
         </w:r>
@@ -1809,71 +3449,79 @@
         <w:ind w:firstLine="720"/>
         <w:jc w:val="both"/>
         <w:rPr>
-          <w:ins w:id="73" w:author="Microsoft Office User" w:date="2026-10-21T16:36:00Z" w16du:dateUtc="2026-10-21T15:36:00Z"/>
-        </w:rPr>
-      </w:pPr>
-      <w:ins w:id="74" w:author="Microsoft Office User" w:date="2026-10-20T16:48:00Z" w16du:dateUtc="2026-10-20T15:48:00Z">
+          <w:ins w:id="185" w:author="Microsoft Office User" w:date="2026-10-21T16:36:00Z" w16du:dateUtc="2026-10-21T15:36:00Z"/>
+        </w:rPr>
+      </w:pPr>
+      <w:ins w:id="186" w:author="Microsoft Office User" w:date="2026-10-20T16:48:00Z" w16du:dateUtc="2026-10-20T15:48:00Z">
         <w:r>
           <w:lastRenderedPageBreak/>
           <w:t>Certain elements lie outside the scope of the project. Real-time data streams will not be incorporated, nor will indivi</w:t>
         </w:r>
       </w:ins>
-      <w:ins w:id="75" w:author="Microsoft Office User" w:date="2026-10-20T16:49:00Z" w16du:dateUtc="2026-10-20T15:49:00Z">
+      <w:ins w:id="187" w:author="Microsoft Office User" w:date="2026-10-20T16:49:00Z" w16du:dateUtc="2026-10-20T15:49:00Z">
         <w:r>
           <w:t xml:space="preserve">dual-level microdata, which are not presented in the chosen dataset. Detailed expenditure forecasting and the development of a full production system or </w:t>
         </w:r>
       </w:ins>
-      <w:ins w:id="76" w:author="Microsoft Office User" w:date="2026-10-20T16:50:00Z" w16du:dateUtc="2026-10-20T15:50:00Z">
+      <w:ins w:id="188" w:author="Microsoft Office User" w:date="2026-10-20T16:50:00Z" w16du:dateUtc="2026-10-20T15:50:00Z">
         <w:r>
           <w:t>mobile</w:t>
         </w:r>
       </w:ins>
-      <w:ins w:id="77" w:author="Microsoft Office User" w:date="2026-10-20T16:49:00Z" w16du:dateUtc="2026-10-20T15:49:00Z">
+      <w:ins w:id="189" w:author="Microsoft Office User" w:date="2026-10-20T16:49:00Z" w16du:dateUtc="2026-10-20T15:49:00Z">
         <w:r>
           <w:t xml:space="preserve"> app</w:t>
         </w:r>
       </w:ins>
-      <w:ins w:id="78" w:author="Microsoft Office User" w:date="2026-10-20T16:50:00Z" w16du:dateUtc="2026-10-20T15:50:00Z">
+      <w:ins w:id="190" w:author="Microsoft Office User" w:date="2026-10-20T16:50:00Z" w16du:dateUtc="2026-10-20T15:50:00Z">
         <w:r>
           <w:t xml:space="preserve">lication are also excluded. Analysis will remain within the geographic and categorical </w:t>
         </w:r>
       </w:ins>
-      <w:ins w:id="79" w:author="Microsoft Office User" w:date="2026-10-20T16:51:00Z" w16du:dateUtc="2026-10-20T15:51:00Z">
+      <w:ins w:id="191" w:author="Microsoft Office User" w:date="2026-10-20T16:51:00Z" w16du:dateUtc="2026-10-20T15:51:00Z">
         <w:r>
           <w:t>boundaries</w:t>
         </w:r>
       </w:ins>
-      <w:ins w:id="80" w:author="Microsoft Office User" w:date="2026-10-20T16:50:00Z" w16du:dateUtc="2026-10-20T15:50:00Z">
+      <w:ins w:id="192" w:author="Microsoft Office User" w:date="2026-10-20T16:50:00Z" w16du:dateUtc="2026-10-20T15:50:00Z">
         <w:r>
           <w:t xml:space="preserve"> of the Eurostat data. These </w:t>
         </w:r>
       </w:ins>
-      <w:ins w:id="81" w:author="Microsoft Office User" w:date="2026-10-20T16:51:00Z" w16du:dateUtc="2026-10-20T15:51:00Z">
+      <w:ins w:id="193" w:author="Microsoft Office User" w:date="2026-10-20T16:51:00Z" w16du:dateUtc="2026-10-20T15:51:00Z">
         <w:r>
           <w:t>boundaries</w:t>
         </w:r>
       </w:ins>
-      <w:ins w:id="82" w:author="Microsoft Office User" w:date="2026-10-20T16:50:00Z" w16du:dateUtc="2026-10-20T15:50:00Z">
+      <w:ins w:id="194" w:author="Microsoft Office User" w:date="2026-10-20T16:50:00Z" w16du:dateUtc="2026-10-20T15:50:00Z">
         <w:r>
           <w:t xml:space="preserve"> </w:t>
         </w:r>
       </w:ins>
-      <w:ins w:id="83" w:author="Microsoft Office User" w:date="2026-10-21T16:36:00Z" w16du:dateUtc="2026-10-21T15:36:00Z">
+      <w:ins w:id="195" w:author="Microsoft Office User" w:date="2026-10-21T16:36:00Z" w16du:dateUtc="2026-10-21T15:36:00Z">
         <w:r>
           <w:t>leave sufficient</w:t>
         </w:r>
       </w:ins>
-      <w:ins w:id="84" w:author="Microsoft Office User" w:date="2026-10-20T16:50:00Z" w16du:dateUtc="2026-10-20T15:50:00Z">
+      <w:ins w:id="196" w:author="Microsoft Office User" w:date="2026-10-20T16:50:00Z" w16du:dateUtc="2026-10-20T15:50:00Z">
         <w:r>
           <w:t xml:space="preserve"> scope</w:t>
         </w:r>
       </w:ins>
-      <w:ins w:id="85" w:author="Microsoft Office User" w:date="2026-10-20T16:51:00Z" w16du:dateUtc="2026-10-20T15:51:00Z">
-        <w:r>
-          <w:t xml:space="preserve"> for substantial investigation  across two semesters: data preparation, exploratory anal</w:t>
-        </w:r>
-      </w:ins>
-      <w:ins w:id="86" w:author="Microsoft Office User" w:date="2026-10-20T16:52:00Z" w16du:dateUtc="2026-10-20T15:52:00Z">
+      <w:ins w:id="197" w:author="Microsoft Office User" w:date="2026-10-20T16:51:00Z" w16du:dateUtc="2026-10-20T15:51:00Z">
+        <w:r>
+          <w:t xml:space="preserve"> for substantial </w:t>
+        </w:r>
+        <w:proofErr w:type="gramStart"/>
+        <w:r>
+          <w:t>investigation  across</w:t>
+        </w:r>
+        <w:proofErr w:type="gramEnd"/>
+        <w:r>
+          <w:t xml:space="preserve"> two semesters: data preparation, exploratory anal</w:t>
+        </w:r>
+      </w:ins>
+      <w:ins w:id="198" w:author="Microsoft Office User" w:date="2026-10-20T16:52:00Z" w16du:dateUtc="2026-10-20T15:52:00Z">
         <w:r>
           <w:t>ysis and initial modelling will be completed in the first semester, while model refinement, evaluation and the preparation of final deliverables will take place in the second.</w:t>
         </w:r>
@@ -1886,7 +3534,7 @@
         <w:spacing w:before="480" w:after="0"/>
         <w:outlineLvl w:val="0"/>
         <w:rPr>
-          <w:ins w:id="87" w:author="Microsoft Office User" w:date="2026-10-21T16:37:00Z" w16du:dateUtc="2026-10-21T15:37:00Z"/>
+          <w:ins w:id="199" w:author="Microsoft Office User" w:date="2026-10-21T16:37:00Z" w16du:dateUtc="2026-10-21T15:37:00Z"/>
           <w:rFonts w:ascii="Calibri" w:eastAsia="MS Gothic" w:hAnsi="Calibri" w:cs="Times New Roman"/>
           <w:b/>
           <w:bCs/>
@@ -1895,8 +3543,8 @@
           <w:szCs w:val="28"/>
         </w:rPr>
       </w:pPr>
-      <w:bookmarkStart w:id="88" w:name="_Toc243051551"/>
-      <w:ins w:id="89" w:author="Microsoft Office User" w:date="2026-10-21T16:37:00Z" w16du:dateUtc="2026-10-21T15:37:00Z">
+      <w:bookmarkStart w:id="200" w:name="_Toc243051551"/>
+      <w:ins w:id="201" w:author="Microsoft Office User" w:date="2026-10-21T16:37:00Z" w16du:dateUtc="2026-10-21T15:37:00Z">
         <w:r>
           <w:rPr>
             <w:rFonts w:ascii="Calibri" w:eastAsia="MS Gothic" w:hAnsi="Calibri" w:cs="Times New Roman"/>
@@ -1908,7 +3556,7 @@
           </w:rPr>
           <w:t>6. Methodology</w:t>
         </w:r>
-        <w:bookmarkEnd w:id="88"/>
+        <w:bookmarkEnd w:id="200"/>
       </w:ins>
     </w:p>
     <w:p>
@@ -1917,50 +3565,50 @@
         <w:ind w:firstLine="720"/>
         <w:jc w:val="both"/>
         <w:rPr>
-          <w:ins w:id="90" w:author="Microsoft Office User" w:date="2026-10-21T16:45:00Z" w16du:dateUtc="2026-10-21T15:45:00Z"/>
-        </w:rPr>
-      </w:pPr>
-      <w:ins w:id="91" w:author="Microsoft Office User" w:date="2026-10-21T16:38:00Z" w16du:dateUtc="2026-10-21T15:38:00Z">
+          <w:ins w:id="202" w:author="Microsoft Office User" w:date="2026-10-21T16:45:00Z" w16du:dateUtc="2026-10-21T15:45:00Z"/>
+        </w:rPr>
+      </w:pPr>
+      <w:ins w:id="203" w:author="Microsoft Office User" w:date="2026-10-21T16:38:00Z" w16du:dateUtc="2026-10-21T15:38:00Z">
         <w:r>
           <w:t>The project will follow a conventional data science workflow</w:t>
         </w:r>
       </w:ins>
-      <w:ins w:id="92" w:author="Microsoft Office User" w:date="2026-10-21T16:39:00Z" w16du:dateUtc="2026-10-21T15:39:00Z">
+      <w:ins w:id="204" w:author="Microsoft Office User" w:date="2026-10-21T16:39:00Z" w16du:dateUtc="2026-10-21T15:39:00Z">
         <w:r>
           <w:t>, with particular attention to the data preparation and model planning stages noted in the assessment guidelines</w:t>
         </w:r>
       </w:ins>
-      <w:ins w:id="93" w:author="Microsoft Office User" w:date="2026-10-21T16:41:00Z" w16du:dateUtc="2026-10-21T15:41:00Z">
+      <w:ins w:id="205" w:author="Microsoft Office User" w:date="2026-10-21T16:41:00Z" w16du:dateUtc="2026-10-21T15:41:00Z">
         <w:r>
           <w:t>. After a short review of Eurostat t</w:t>
         </w:r>
       </w:ins>
-      <w:ins w:id="94" w:author="Microsoft Office User" w:date="2026-10-21T16:42:00Z" w16du:dateUtc="2026-10-21T15:42:00Z">
+      <w:ins w:id="206" w:author="Microsoft Office User" w:date="2026-10-21T16:42:00Z" w16du:dateUtc="2026-10-21T15:42:00Z">
         <w:r>
           <w:t>ourism methodology and the relevant forecasting literature, the bulk dataset will be downloaded and imported. Cleaning will address missing val</w:t>
         </w:r>
       </w:ins>
-      <w:ins w:id="95" w:author="Microsoft Office User" w:date="2026-10-21T16:43:00Z" w16du:dateUtc="2026-10-21T15:43:00Z">
+      <w:ins w:id="207" w:author="Microsoft Office User" w:date="2026-10-21T16:43:00Z" w16du:dateUtc="2026-10-21T15:43:00Z">
         <w:r>
           <w:t>ues, observation flags and the multi-dimensional structure of the original table so that the data can be reshaped into a long-format time series. Lagged variab</w:t>
         </w:r>
       </w:ins>
-      <w:ins w:id="96" w:author="Microsoft Office User" w:date="2026-10-21T16:44:00Z" w16du:dateUtc="2026-10-21T15:44:00Z">
+      <w:ins w:id="208" w:author="Microsoft Office User" w:date="2026-10-21T16:44:00Z" w16du:dateUtc="2026-10-21T15:44:00Z">
         <w:r>
           <w:t>les, seasonal indicators and simple growth rates will then be created as features. The resulting analysis-ready file</w:t>
         </w:r>
       </w:ins>
-      <w:ins w:id="97" w:author="Microsoft Office User" w:date="2026-10-21T16:45:00Z" w16du:dateUtc="2026-10-21T15:45:00Z">
+      <w:ins w:id="209" w:author="Microsoft Office User" w:date="2026-10-21T16:45:00Z" w16du:dateUtc="2026-10-21T15:45:00Z">
         <w:r>
           <w:t xml:space="preserve"> </w:t>
         </w:r>
       </w:ins>
-      <w:ins w:id="98" w:author="Microsoft Office User" w:date="2026-10-21T16:44:00Z" w16du:dateUtc="2026-10-21T15:44:00Z">
+      <w:ins w:id="210" w:author="Microsoft Office User" w:date="2026-10-21T16:44:00Z" w16du:dateUtc="2026-10-21T15:44:00Z">
         <w:r>
           <w:t xml:space="preserve">is expected to contain well over 20,000 </w:t>
         </w:r>
       </w:ins>
-      <w:ins w:id="99" w:author="Microsoft Office User" w:date="2026-10-21T16:45:00Z" w16du:dateUtc="2026-10-21T15:45:00Z">
+      <w:ins w:id="211" w:author="Microsoft Office User" w:date="2026-10-21T16:45:00Z" w16du:dateUtc="2026-10-21T15:45:00Z">
         <w:r>
           <w:t>records and approximately ten useful columns.</w:t>
         </w:r>
@@ -1972,20 +3620,20 @@
         <w:ind w:firstLine="720"/>
         <w:jc w:val="both"/>
         <w:rPr>
-          <w:ins w:id="100" w:author="Microsoft Office User" w:date="2026-10-21T16:52:00Z" w16du:dateUtc="2026-10-21T15:52:00Z"/>
-        </w:rPr>
-      </w:pPr>
-      <w:ins w:id="101" w:author="Microsoft Office User" w:date="2026-10-21T16:45:00Z" w16du:dateUtc="2026-10-21T15:45:00Z">
+          <w:ins w:id="212" w:author="Microsoft Office User" w:date="2026-10-21T16:52:00Z" w16du:dateUtc="2026-10-21T15:52:00Z"/>
+        </w:rPr>
+      </w:pPr>
+      <w:ins w:id="213" w:author="Microsoft Office User" w:date="2026-10-21T16:45:00Z" w16du:dateUtc="2026-10-21T15:45:00Z">
         <w:r>
           <w:t>Because the target is a</w:t>
         </w:r>
       </w:ins>
-      <w:ins w:id="102" w:author="Microsoft Office User" w:date="2026-10-21T16:46:00Z" w16du:dateUtc="2026-10-21T15:46:00Z">
+      <w:ins w:id="214" w:author="Microsoft Office User" w:date="2026-10-21T16:46:00Z" w16du:dateUtc="2026-10-21T15:46:00Z">
         <w:r>
           <w:t xml:space="preserve"> future numeric vale derived from time-ordered history, forecasting methods are the most appropriate choice. Classical seasonal ARIMA models </w:t>
         </w:r>
       </w:ins>
-      <w:ins w:id="103" w:author="Microsoft Office User" w:date="2026-10-21T16:47:00Z" w16du:dateUtc="2026-10-21T15:47:00Z">
+      <w:ins w:id="215" w:author="Microsoft Office User" w:date="2026-10-21T16:47:00Z" w16du:dateUtc="2026-10-21T15:47:00Z">
         <w:r>
           <w:t>will be used to capture autocorrelation and regular seasonal cycles. Prophet will be applied for its abilit</w:t>
         </w:r>
@@ -1993,37 +3641,37 @@
           <w:t xml:space="preserve">y to handle multiple </w:t>
         </w:r>
       </w:ins>
-      <w:ins w:id="104" w:author="Microsoft Office User" w:date="2026-10-21T16:48:00Z" w16du:dateUtc="2026-10-21T15:48:00Z">
+      <w:ins w:id="216" w:author="Microsoft Office User" w:date="2026-10-21T16:48:00Z" w16du:dateUtc="2026-10-21T15:48:00Z">
         <w:r>
           <w:t xml:space="preserve">seasonality in a transparent way. Recurrent neural networks, in particular LSTM or GRU architectures, together </w:t>
         </w:r>
       </w:ins>
-      <w:ins w:id="105" w:author="Microsoft Office User" w:date="2026-10-21T16:49:00Z" w16du:dateUtc="2026-10-21T15:49:00Z">
+      <w:ins w:id="217" w:author="Microsoft Office User" w:date="2026-10-21T16:49:00Z" w16du:dateUtc="2026-10-21T15:49:00Z">
         <w:r>
           <w:t>with gradient-boosted trees that incorporate lag features, will be examined for their capacity to model non-linear relationship. An e</w:t>
         </w:r>
       </w:ins>
-      <w:ins w:id="106" w:author="Microsoft Office User" w:date="2026-10-21T16:50:00Z" w16du:dateUtc="2026-10-21T15:50:00Z">
+      <w:ins w:id="218" w:author="Microsoft Office User" w:date="2026-10-21T16:50:00Z" w16du:dateUtc="2026-10-21T15:50:00Z">
         <w:r>
           <w:t>nsem</w:t>
         </w:r>
       </w:ins>
-      <w:ins w:id="107" w:author="Microsoft Office User" w:date="2026-10-21T16:52:00Z" w16du:dateUtc="2026-10-21T15:52:00Z">
+      <w:ins w:id="219" w:author="Microsoft Office User" w:date="2026-10-21T16:52:00Z" w16du:dateUtc="2026-10-21T15:52:00Z">
         <w:r>
           <w:t>b</w:t>
         </w:r>
       </w:ins>
-      <w:ins w:id="108" w:author="Microsoft Office User" w:date="2026-10-21T16:50:00Z" w16du:dateUtc="2026-10-21T15:50:00Z">
+      <w:ins w:id="220" w:author="Microsoft Office User" w:date="2026-10-21T16:50:00Z" w16du:dateUtc="2026-10-21T15:50:00Z">
         <w:r>
           <w:t>le of the stronger individual models may also be considered. All work will be caried out</w:t>
         </w:r>
       </w:ins>
-      <w:ins w:id="109" w:author="Microsoft Office User" w:date="2026-10-21T16:51:00Z" w16du:dateUtc="2026-10-21T15:51:00Z">
+      <w:ins w:id="221" w:author="Microsoft Office User" w:date="2026-10-21T16:51:00Z" w16du:dateUtc="2026-10-21T15:51:00Z">
         <w:r>
           <w:t xml:space="preserve"> in Python using pandas, stats models, Prophet, scikit-learn with Jupiter</w:t>
         </w:r>
       </w:ins>
-      <w:ins w:id="110" w:author="Microsoft Office User" w:date="2026-10-21T16:52:00Z" w16du:dateUtc="2026-10-21T15:52:00Z">
+      <w:ins w:id="222" w:author="Microsoft Office User" w:date="2026-10-21T16:52:00Z" w16du:dateUtc="2026-10-21T15:52:00Z">
         <w:r>
           <w:t xml:space="preserve"> notebook for development and reproducibility.</w:t>
         </w:r>
@@ -2035,55 +3683,55 @@
         <w:ind w:firstLine="720"/>
         <w:jc w:val="both"/>
         <w:rPr>
-          <w:ins w:id="111" w:author="Microsoft Office User" w:date="2026-10-21T16:55:00Z" w16du:dateUtc="2026-10-21T15:55:00Z"/>
-        </w:rPr>
-      </w:pPr>
-      <w:ins w:id="112" w:author="Microsoft Office User" w:date="2026-10-21T16:52:00Z" w16du:dateUtc="2026-10-21T15:52:00Z">
+          <w:ins w:id="223" w:author="Microsoft Office User" w:date="2026-10-21T16:55:00Z" w16du:dateUtc="2026-10-21T15:55:00Z"/>
+        </w:rPr>
+      </w:pPr>
+      <w:ins w:id="224" w:author="Microsoft Office User" w:date="2026-10-21T16:52:00Z" w16du:dateUtc="2026-10-21T15:52:00Z">
         <w:r>
           <w:t>The overall work</w:t>
         </w:r>
       </w:ins>
-      <w:ins w:id="113" w:author="Microsoft Office User" w:date="2026-10-21T16:53:00Z" w16du:dateUtc="2026-10-21T15:53:00Z">
+      <w:ins w:id="225" w:author="Microsoft Office User" w:date="2026-10-21T16:53:00Z" w16du:dateUtc="2026-10-21T15:53:00Z">
         <w:r>
           <w:t>flow moves from data ingestion and cleaning through exploratory analysis, model training on time-aware splits, evaluation with residual dia</w:t>
         </w:r>
       </w:ins>
-      <w:ins w:id="114" w:author="Microsoft Office User" w:date="2026-10-21T16:54:00Z" w16du:dateUtc="2026-10-21T15:54:00Z">
+      <w:ins w:id="226" w:author="Microsoft Office User" w:date="2026-10-21T16:54:00Z" w16du:dateUtc="2026-10-21T15:54:00Z">
         <w:r>
           <w:t xml:space="preserve">gnostics, and finally the generation of forecasts and business insights. </w:t>
         </w:r>
       </w:ins>
-      <w:ins w:id="115" w:author="Microsoft Office User" w:date="2026-10-21T16:55:00Z" w16du:dateUtc="2026-10-21T15:55:00Z">
+      <w:ins w:id="227" w:author="Microsoft Office User" w:date="2026-10-21T16:55:00Z" w16du:dateUtc="2026-10-21T15:55:00Z">
         <w:r>
           <w:t>Visualizations</w:t>
         </w:r>
       </w:ins>
-      <w:ins w:id="116" w:author="Microsoft Office User" w:date="2026-10-21T16:54:00Z" w16du:dateUtc="2026-10-21T15:54:00Z">
+      <w:ins w:id="228" w:author="Microsoft Office User" w:date="2026-10-21T16:54:00Z" w16du:dateUtc="2026-10-21T15:54:00Z">
         <w:r>
           <w:t xml:space="preserve"> and a </w:t>
         </w:r>
       </w:ins>
-      <w:ins w:id="117" w:author="Microsoft Office User" w:date="2026-10-21T16:55:00Z" w16du:dateUtc="2026-10-21T15:55:00Z">
+      <w:ins w:id="229" w:author="Microsoft Office User" w:date="2026-10-21T16:55:00Z" w16du:dateUtc="2026-10-21T15:55:00Z">
         <w:r>
           <w:t>high</w:t>
         </w:r>
       </w:ins>
-      <w:ins w:id="118" w:author="Microsoft Office User" w:date="2026-10-21T16:54:00Z" w16du:dateUtc="2026-10-21T15:54:00Z">
+      <w:ins w:id="230" w:author="Microsoft Office User" w:date="2026-10-21T16:54:00Z" w16du:dateUtc="2026-10-21T15:54:00Z">
         <w:r>
           <w:t>-</w:t>
         </w:r>
       </w:ins>
-      <w:ins w:id="119" w:author="Microsoft Office User" w:date="2026-10-21T16:55:00Z" w16du:dateUtc="2026-10-21T15:55:00Z">
+      <w:ins w:id="231" w:author="Microsoft Office User" w:date="2026-10-21T16:55:00Z" w16du:dateUtc="2026-10-21T15:55:00Z">
         <w:r>
           <w:t>l</w:t>
         </w:r>
       </w:ins>
-      <w:ins w:id="120" w:author="Microsoft Office User" w:date="2026-10-21T16:54:00Z" w16du:dateUtc="2026-10-21T15:54:00Z">
+      <w:ins w:id="232" w:author="Microsoft Office User" w:date="2026-10-21T16:54:00Z" w16du:dateUtc="2026-10-21T15:54:00Z">
         <w:r>
           <w:t>evel dashboard concept will prese</w:t>
         </w:r>
       </w:ins>
-      <w:ins w:id="121" w:author="Microsoft Office User" w:date="2026-10-21T16:55:00Z" w16du:dateUtc="2026-10-21T15:55:00Z">
+      <w:ins w:id="233" w:author="Microsoft Office User" w:date="2026-10-21T16:55:00Z" w16du:dateUtc="2026-10-21T15:55:00Z">
         <w:r>
           <w:t>nt the historical series, the selected forecasts and the principal performance metrics.</w:t>
         </w:r>
@@ -2095,10 +3743,10 @@
         <w:ind w:firstLine="720"/>
         <w:jc w:val="both"/>
         <w:rPr>
-          <w:ins w:id="122" w:author="Microsoft Office User" w:date="2026-10-21T19:19:00Z" w16du:dateUtc="2026-10-21T18:19:00Z"/>
-        </w:rPr>
-      </w:pPr>
-      <w:ins w:id="123" w:author="Microsoft Office User" w:date="2026-10-21T16:55:00Z" w16du:dateUtc="2026-10-21T15:55:00Z">
+          <w:ins w:id="234" w:author="Microsoft Office User" w:date="2026-10-21T19:19:00Z" w16du:dateUtc="2026-10-21T18:19:00Z"/>
+        </w:rPr>
+      </w:pPr>
+      <w:ins w:id="235" w:author="Microsoft Office User" w:date="2026-10-21T16:55:00Z" w16du:dateUtc="2026-10-21T15:55:00Z">
         <w:r>
           <w:rPr>
             <w:noProof/>
@@ -2149,7 +3797,7 @@
         <w:spacing w:before="480" w:after="0"/>
         <w:outlineLvl w:val="0"/>
         <w:rPr>
-          <w:ins w:id="124" w:author="Microsoft Office User" w:date="2026-10-21T19:19:00Z" w16du:dateUtc="2026-10-21T18:19:00Z"/>
+          <w:ins w:id="236" w:author="Microsoft Office User" w:date="2026-10-21T19:19:00Z" w16du:dateUtc="2026-10-21T18:19:00Z"/>
           <w:rFonts w:ascii="Calibri" w:eastAsia="MS Gothic" w:hAnsi="Calibri" w:cs="Times New Roman"/>
           <w:b/>
           <w:bCs/>
@@ -2158,8 +3806,8 @@
           <w:szCs w:val="28"/>
         </w:rPr>
       </w:pPr>
-      <w:bookmarkStart w:id="125" w:name="_Toc243051552"/>
-      <w:ins w:id="126" w:author="Microsoft Office User" w:date="2026-10-21T19:19:00Z" w16du:dateUtc="2026-10-21T18:19:00Z">
+      <w:bookmarkStart w:id="237" w:name="_Toc243051552"/>
+      <w:ins w:id="238" w:author="Microsoft Office User" w:date="2026-10-21T19:19:00Z" w16du:dateUtc="2026-10-21T18:19:00Z">
         <w:r>
           <w:rPr>
             <w:rFonts w:ascii="Calibri" w:eastAsia="MS Gothic" w:hAnsi="Calibri" w:cs="Times New Roman"/>
@@ -2171,7 +3819,7 @@
           </w:rPr>
           <w:t>7. Data Sources</w:t>
         </w:r>
-        <w:bookmarkEnd w:id="125"/>
+        <w:bookmarkEnd w:id="237"/>
       </w:ins>
     </w:p>
     <w:p>
@@ -2180,35 +3828,37 @@
         <w:ind w:firstLine="720"/>
         <w:jc w:val="both"/>
         <w:rPr>
-          <w:ins w:id="127" w:author="Microsoft Office User" w:date="2026-10-21T19:29:00Z" w16du:dateUtc="2026-10-21T18:29:00Z"/>
-        </w:rPr>
-      </w:pPr>
-      <w:ins w:id="128" w:author="Microsoft Office User" w:date="2026-10-21T19:25:00Z" w16du:dateUtc="2026-10-21T18:25:00Z">
-        <w:r>
-          <w:t xml:space="preserve">The primary  source is the Eurostat dataset “Trips by month of departure” (online data code </w:t>
-        </w:r>
-      </w:ins>
-      <w:ins w:id="129" w:author="Microsoft Office User" w:date="2026-10-21T19:26:00Z" w16du:dateUtc="2026-10-21T18:26:00Z">
+          <w:ins w:id="239" w:author="Microsoft Office User" w:date="2026-10-21T19:29:00Z" w16du:dateUtc="2026-10-21T18:29:00Z"/>
+        </w:rPr>
+      </w:pPr>
+      <w:ins w:id="240" w:author="Microsoft Office User" w:date="2026-10-21T19:25:00Z" w16du:dateUtc="2026-10-21T18:25:00Z">
+        <w:r>
+          <w:t xml:space="preserve">The primary source is the Eurostat dataset “Trips by month of departure” (online data code </w:t>
+        </w:r>
+      </w:ins>
+      <w:proofErr w:type="spellStart"/>
+      <w:ins w:id="241" w:author="Microsoft Office User" w:date="2026-10-21T19:26:00Z" w16du:dateUtc="2026-10-21T18:26:00Z">
         <w:r>
           <w:t>tour_dem_ttmd</w:t>
         </w:r>
       </w:ins>
-      <w:ins w:id="130" w:author="Microsoft Office User" w:date="2026-10-21T19:25:00Z" w16du:dateUtc="2026-10-21T18:25:00Z">
+      <w:proofErr w:type="spellEnd"/>
+      <w:ins w:id="242" w:author="Microsoft Office User" w:date="2026-10-21T19:25:00Z" w16du:dateUtc="2026-10-21T18:25:00Z">
         <w:r>
           <w:t>)</w:t>
         </w:r>
       </w:ins>
-      <w:ins w:id="131" w:author="Microsoft Office User" w:date="2026-10-21T19:26:00Z" w16du:dateUtc="2026-10-21T18:26:00Z">
+      <w:ins w:id="243" w:author="Microsoft Office User" w:date="2026-10-21T19:26:00Z" w16du:dateUtc="2026-10-21T18:26:00Z">
         <w:r>
           <w:t xml:space="preserve"> which can be accessed through the Eurostat data browser or via bulk download. The series covers</w:t>
         </w:r>
       </w:ins>
-      <w:ins w:id="132" w:author="Microsoft Office User" w:date="2026-10-21T19:27:00Z" w16du:dateUtc="2026-10-21T18:27:00Z">
+      <w:ins w:id="244" w:author="Microsoft Office User" w:date="2026-10-21T19:27:00Z" w16du:dateUtc="2026-10-21T18:27:00Z">
         <w:r>
           <w:t xml:space="preserve"> the years 2012-2024 and, when fully expanded, contains approximately 200,</w:t>
         </w:r>
       </w:ins>
-      <w:ins w:id="133" w:author="Microsoft Office User" w:date="2026-10-21T19:28:00Z" w16du:dateUtc="2026-10-21T18:28:00Z">
+      <w:ins w:id="245" w:author="Microsoft Office User" w:date="2026-10-21T19:28:00Z" w16du:dateUtc="2026-10-21T18:28:00Z">
         <w:r>
           <w:t xml:space="preserve">000 records. The principal dimensions are reporting </w:t>
         </w:r>
@@ -2222,7 +3872,7 @@
           <w:t>, month of departure, purpose of the trip, and the number of trips.</w:t>
         </w:r>
       </w:ins>
-      <w:ins w:id="134" w:author="Microsoft Office User" w:date="2026-10-21T19:29:00Z" w16du:dateUtc="2026-10-21T18:29:00Z">
+      <w:ins w:id="246" w:author="Microsoft Office User" w:date="2026-10-21T19:29:00Z" w16du:dateUtc="2026-10-21T18:29:00Z">
         <w:r>
           <w:t xml:space="preserve"> After filtering and reshaping, a clean working dataset of more than 20,000 records with roughly ten will be available.</w:t>
         </w:r>
@@ -2234,81 +3884,89 @@
         <w:ind w:firstLine="720"/>
         <w:jc w:val="both"/>
         <w:rPr>
-          <w:ins w:id="135" w:author="Microsoft Office User" w:date="2026-10-21T19:34:00Z" w16du:dateUtc="2026-10-21T18:34:00Z"/>
-        </w:rPr>
-      </w:pPr>
-      <w:ins w:id="136" w:author="Microsoft Office User" w:date="2026-10-21T19:29:00Z" w16du:dateUtc="2026-10-21T18:29:00Z">
+          <w:ins w:id="247" w:author="Microsoft Office User" w:date="2026-10-21T19:34:00Z" w16du:dateUtc="2026-10-21T18:34:00Z"/>
+        </w:rPr>
+      </w:pPr>
+      <w:ins w:id="248" w:author="Microsoft Office User" w:date="2026-10-21T19:29:00Z" w16du:dateUtc="2026-10-21T18:29:00Z">
         <w:r>
           <w:t>These dat</w:t>
         </w:r>
       </w:ins>
-      <w:ins w:id="137" w:author="Microsoft Office User" w:date="2026-10-21T19:30:00Z" w16du:dateUtc="2026-10-21T18:30:00Z">
+      <w:ins w:id="249" w:author="Microsoft Office User" w:date="2026-10-21T19:30:00Z" w16du:dateUtc="2026-10-21T18:30:00Z">
         <w:r>
           <w:t xml:space="preserve">a measure </w:t>
         </w:r>
       </w:ins>
-      <w:ins w:id="138" w:author="Microsoft Office User" w:date="2026-10-21T19:31:00Z" w16du:dateUtc="2026-10-21T18:31:00Z">
+      <w:ins w:id="250" w:author="Microsoft Office User" w:date="2026-10-21T19:31:00Z" w16du:dateUtc="2026-10-21T18:31:00Z">
         <w:r>
           <w:t>tourism</w:t>
         </w:r>
       </w:ins>
-      <w:ins w:id="139" w:author="Microsoft Office User" w:date="2026-10-21T19:30:00Z" w16du:dateUtc="2026-10-21T18:30:00Z">
+      <w:ins w:id="251" w:author="Microsoft Office User" w:date="2026-10-21T19:30:00Z" w16du:dateUtc="2026-10-21T18:30:00Z">
         <w:r>
           <w:t xml:space="preserve"> demand directly and therefore match the project title and the </w:t>
         </w:r>
       </w:ins>
-      <w:ins w:id="140" w:author="Microsoft Office User" w:date="2026-10-21T19:31:00Z" w16du:dateUtc="2026-10-21T18:31:00Z">
+      <w:ins w:id="252" w:author="Microsoft Office User" w:date="2026-10-21T19:31:00Z" w16du:dateUtc="2026-10-21T18:31:00Z">
         <w:r>
           <w:t>business</w:t>
         </w:r>
       </w:ins>
-      <w:ins w:id="141" w:author="Microsoft Office User" w:date="2026-10-21T19:30:00Z" w16du:dateUtc="2026-10-21T18:30:00Z">
+      <w:ins w:id="253" w:author="Microsoft Office User" w:date="2026-10-21T19:30:00Z" w16du:dateUtc="2026-10-21T18:30:00Z">
         <w:r>
           <w:t xml:space="preserve"> problem.</w:t>
         </w:r>
       </w:ins>
-      <w:ins w:id="142" w:author="Microsoft Office User" w:date="2026-10-21T19:31:00Z" w16du:dateUtc="2026-10-21T18:31:00Z">
+      <w:ins w:id="254" w:author="Microsoft Office User" w:date="2026-10-21T19:31:00Z" w16du:dateUtc="2026-10-21T18:31:00Z">
         <w:r>
           <w:t xml:space="preserve"> They are official European statistics released under open-data terms; academic use is </w:t>
         </w:r>
       </w:ins>
-      <w:ins w:id="143" w:author="Microsoft Office User" w:date="2026-10-21T19:33:00Z" w16du:dateUtc="2026-10-21T18:33:00Z">
+      <w:ins w:id="255" w:author="Microsoft Office User" w:date="2026-10-21T19:33:00Z" w16du:dateUtc="2026-10-21T18:33:00Z">
         <w:r>
           <w:t>permitted</w:t>
         </w:r>
       </w:ins>
-      <w:ins w:id="144" w:author="Microsoft Office User" w:date="2026-10-21T19:31:00Z" w16du:dateUtc="2026-10-21T18:31:00Z">
+      <w:ins w:id="256" w:author="Microsoft Office User" w:date="2026-10-21T19:31:00Z" w16du:dateUtc="2026-10-21T18:31:00Z">
         <w:r>
           <w:t xml:space="preserve"> provided </w:t>
         </w:r>
       </w:ins>
-      <w:ins w:id="145" w:author="Microsoft Office User" w:date="2026-10-21T19:33:00Z" w16du:dateUtc="2026-10-21T18:33:00Z">
+      <w:ins w:id="257" w:author="Microsoft Office User" w:date="2026-10-21T19:33:00Z" w16du:dateUtc="2026-10-21T18:33:00Z">
         <w:r>
           <w:t>the source</w:t>
         </w:r>
       </w:ins>
-      <w:ins w:id="146" w:author="Microsoft Office User" w:date="2026-10-21T19:32:00Z" w16du:dateUtc="2026-10-21T18:32:00Z">
+      <w:ins w:id="258" w:author="Microsoft Office User" w:date="2026-10-21T19:32:00Z" w16du:dateUtc="2026-10-21T18:32:00Z">
         <w:r>
           <w:t xml:space="preserve"> is acknowledged </w:t>
         </w:r>
         <w:r>
-          <w:t>(DOI 10.2908/tour_dem_ttmd).</w:t>
+          <w:t>(DOI 10.2908/</w:t>
+        </w:r>
+        <w:proofErr w:type="spellStart"/>
+        <w:r>
+          <w:t>tour_dem_ttmd</w:t>
+        </w:r>
+        <w:proofErr w:type="spellEnd"/>
+        <w:r>
+          <w:t>).</w:t>
         </w:r>
         <w:r>
           <w:t xml:space="preserve"> Because the figures are </w:t>
         </w:r>
       </w:ins>
-      <w:ins w:id="147" w:author="Microsoft Office User" w:date="2026-10-21T19:33:00Z" w16du:dateUtc="2026-10-21T18:33:00Z">
+      <w:ins w:id="259" w:author="Microsoft Office User" w:date="2026-10-21T19:33:00Z" w16du:dateUtc="2026-10-21T18:33:00Z">
         <w:r>
           <w:t>aggregated,</w:t>
         </w:r>
       </w:ins>
-      <w:ins w:id="148" w:author="Microsoft Office User" w:date="2026-10-21T19:32:00Z" w16du:dateUtc="2026-10-21T18:32:00Z">
+      <w:ins w:id="260" w:author="Microsoft Office User" w:date="2026-10-21T19:32:00Z" w16du:dateUtc="2026-10-21T18:32:00Z">
         <w:r>
           <w:t xml:space="preserve"> the dataset contains no personal info and raises no GD</w:t>
         </w:r>
       </w:ins>
-      <w:ins w:id="149" w:author="Microsoft Office User" w:date="2026-10-21T19:33:00Z" w16du:dateUtc="2026-10-21T18:33:00Z">
+      <w:ins w:id="261" w:author="Microsoft Office User" w:date="2026-10-21T19:33:00Z" w16du:dateUtc="2026-10-21T18:33:00Z">
         <w:r>
           <w:t>PR concerns related to individual travelers.</w:t>
         </w:r>
@@ -2321,7 +3979,7 @@
         <w:spacing w:before="480" w:after="0"/>
         <w:outlineLvl w:val="0"/>
         <w:rPr>
-          <w:ins w:id="150" w:author="Microsoft Office User" w:date="2026-10-21T19:34:00Z" w16du:dateUtc="2026-10-21T18:34:00Z"/>
+          <w:ins w:id="262" w:author="Microsoft Office User" w:date="2026-10-21T19:34:00Z" w16du:dateUtc="2026-10-21T18:34:00Z"/>
           <w:rFonts w:ascii="Calibri" w:eastAsia="MS Gothic" w:hAnsi="Calibri" w:cs="Times New Roman"/>
           <w:b/>
           <w:bCs/>
@@ -2330,8 +3988,8 @@
           <w:szCs w:val="28"/>
         </w:rPr>
       </w:pPr>
-      <w:bookmarkStart w:id="151" w:name="_Toc243051553"/>
-      <w:ins w:id="152" w:author="Microsoft Office User" w:date="2026-10-21T19:34:00Z" w16du:dateUtc="2026-10-21T18:34:00Z">
+      <w:bookmarkStart w:id="263" w:name="_Toc243051553"/>
+      <w:ins w:id="264" w:author="Microsoft Office User" w:date="2026-10-21T19:34:00Z" w16du:dateUtc="2026-10-21T18:34:00Z">
         <w:r>
           <w:rPr>
             <w:rFonts w:ascii="Calibri" w:eastAsia="MS Gothic" w:hAnsi="Calibri" w:cs="Times New Roman"/>
@@ -2343,7 +4001,7 @@
           </w:rPr>
           <w:t>8. Expected Deliverables</w:t>
         </w:r>
-        <w:bookmarkEnd w:id="151"/>
+        <w:bookmarkEnd w:id="263"/>
       </w:ins>
     </w:p>
     <w:p>
@@ -2351,7 +4009,1090 @@
         <w:spacing w:line="360" w:lineRule="auto"/>
         <w:ind w:firstLine="720"/>
         <w:jc w:val="both"/>
-        <w:pPrChange w:id="153" w:author="Microsoft Office User" w:date="2026-10-21T19:29:00Z" w16du:dateUtc="2026-10-21T18:29:00Z">
+        <w:rPr>
+          <w:ins w:id="265" w:author="Microsoft Office User" w:date="2026-10-22T13:09:00Z" w16du:dateUtc="2026-10-22T12:09:00Z"/>
+        </w:rPr>
+      </w:pPr>
+      <w:ins w:id="266" w:author="Microsoft Office User" w:date="2026-10-22T13:06:00Z" w16du:dateUtc="2026-10-22T12:06:00Z">
+        <w:r>
+          <w:t xml:space="preserve">By the end of the second semester the project will produce a clean and </w:t>
+        </w:r>
+      </w:ins>
+      <w:ins w:id="267" w:author="Microsoft Office User" w:date="2026-10-22T13:08:00Z" w16du:dateUtc="2026-10-22T12:08:00Z">
+        <w:r>
+          <w:t>documents</w:t>
+        </w:r>
+      </w:ins>
+      <w:ins w:id="268" w:author="Microsoft Office User" w:date="2026-10-22T13:06:00Z" w16du:dateUtc="2026-10-22T12:06:00Z">
+        <w:r>
+          <w:t xml:space="preserve"> CSV dataset with a short data dictionary. A set of exploratory </w:t>
+        </w:r>
+      </w:ins>
+      <w:ins w:id="269" w:author="Microsoft Office User" w:date="2026-10-22T13:08:00Z" w16du:dateUtc="2026-10-22T12:08:00Z">
+        <w:r>
+          <w:t>visualizations</w:t>
+        </w:r>
+      </w:ins>
+      <w:ins w:id="270" w:author="Microsoft Office User" w:date="2026-10-22T13:07:00Z" w16du:dateUtc="2026-10-22T12:07:00Z">
+        <w:r>
+          <w:t xml:space="preserve"> will illustrate seasonality, trends and the main relationship in the data. Trained models from at least three different approaches will be retained, accom</w:t>
+        </w:r>
+      </w:ins>
+      <w:ins w:id="271" w:author="Microsoft Office User" w:date="2026-10-22T13:08:00Z" w16du:dateUtc="2026-10-22T12:08:00Z">
+        <w:r>
+          <w:t>panied by evaluation results expressed through MAE, RMS and MAPE and by residual diagnostics.</w:t>
+        </w:r>
+      </w:ins>
+    </w:p>
+    <w:p>
+      <w:pPr>
+        <w:spacing w:line="360" w:lineRule="auto"/>
+        <w:ind w:firstLine="720"/>
+        <w:jc w:val="both"/>
+        <w:rPr>
+          <w:ins w:id="272" w:author="Microsoft Office User" w:date="2026-10-22T13:08:00Z" w16du:dateUtc="2026-10-22T12:08:00Z"/>
+        </w:rPr>
+      </w:pPr>
+      <w:ins w:id="273" w:author="Microsoft Office User" w:date="2026-10-22T13:09:00Z" w16du:dateUtc="2026-10-22T12:09:00Z">
+        <w:r>
+          <w:t xml:space="preserve">Forecast for subsequent </w:t>
+        </w:r>
+      </w:ins>
+      <w:ins w:id="274" w:author="Microsoft Office User" w:date="2026-10-22T13:10:00Z" w16du:dateUtc="2026-10-22T12:10:00Z">
+        <w:r>
+          <w:t>twelve months will be generated for selected</w:t>
+        </w:r>
+      </w:ins>
+      <w:ins w:id="275" w:author="Microsoft Office User" w:date="2026-10-22T13:11:00Z" w16du:dateUtc="2026-10-22T12:11:00Z">
+        <w:r>
+          <w:t xml:space="preserve"> </w:t>
+        </w:r>
+      </w:ins>
+      <w:ins w:id="276" w:author="Microsoft Office User" w:date="2026-10-22T13:12:00Z" w16du:dateUtc="2026-10-22T12:12:00Z">
+        <w:r>
+          <w:t xml:space="preserve">destinations and reporting countries, and </w:t>
+        </w:r>
+      </w:ins>
+      <w:ins w:id="277" w:author="Microsoft Office User" w:date="2026-10-22T13:32:00Z" w16du:dateUtc="2026-10-22T12:32:00Z">
+        <w:r>
+          <w:t>these predictions</w:t>
+        </w:r>
+      </w:ins>
+      <w:ins w:id="278" w:author="Microsoft Office User" w:date="2026-10-22T13:12:00Z" w16du:dateUtc="2026-10-22T12:12:00Z">
+        <w:r>
+          <w:t xml:space="preserve"> will be accompanied by concise business </w:t>
+        </w:r>
+        <w:r>
+          <w:lastRenderedPageBreak/>
+          <w:t xml:space="preserve">recommendations. Supporting visual material and a high-level </w:t>
+        </w:r>
+      </w:ins>
+      <w:ins w:id="279" w:author="Microsoft Office User" w:date="2026-10-22T13:15:00Z" w16du:dateUtc="2026-10-22T12:15:00Z">
+        <w:r>
+          <w:t>interactive</w:t>
+        </w:r>
+      </w:ins>
+      <w:ins w:id="280" w:author="Microsoft Office User" w:date="2026-10-22T13:13:00Z" w16du:dateUtc="2026-10-22T12:13:00Z">
+        <w:r>
+          <w:t xml:space="preserve"> dashboard concept (for example a </w:t>
+        </w:r>
+        <w:proofErr w:type="spellStart"/>
+        <w:r>
+          <w:t>Streamlit</w:t>
+        </w:r>
+        <w:proofErr w:type="spellEnd"/>
+        <w:r>
+          <w:t xml:space="preserve"> prototype or a Power BI mock-up) will </w:t>
+        </w:r>
+        <w:proofErr w:type="gramStart"/>
+        <w:r>
+          <w:t>display  the</w:t>
+        </w:r>
+        <w:proofErr w:type="gramEnd"/>
+        <w:r>
+          <w:t xml:space="preserve"> historical series, the forecasts and the keys </w:t>
+        </w:r>
+      </w:ins>
+      <w:ins w:id="281" w:author="Microsoft Office User" w:date="2026-10-22T13:14:00Z" w16du:dateUtc="2026-10-22T12:14:00Z">
+        <w:r>
+          <w:t xml:space="preserve"> metrics. The work will be </w:t>
+        </w:r>
+      </w:ins>
+      <w:ins w:id="282" w:author="Microsoft Office User" w:date="2026-10-22T13:15:00Z" w16du:dateUtc="2026-10-22T12:15:00Z">
+        <w:r>
+          <w:t>summarized</w:t>
+        </w:r>
+      </w:ins>
+      <w:ins w:id="283" w:author="Microsoft Office User" w:date="2026-10-22T13:14:00Z" w16du:dateUtc="2026-10-22T12:14:00Z">
+        <w:r>
+          <w:t xml:space="preserve"> in a final report tha</w:t>
+        </w:r>
+      </w:ins>
+      <w:ins w:id="284" w:author="Microsoft Office User" w:date="2026-10-22T13:15:00Z" w16du:dateUtc="2026-10-22T12:15:00Z">
+        <w:r>
+          <w:t>t</w:t>
+        </w:r>
+      </w:ins>
+      <w:ins w:id="285" w:author="Microsoft Office User" w:date="2026-10-22T13:14:00Z" w16du:dateUtc="2026-10-22T12:14:00Z">
+        <w:r>
+          <w:t xml:space="preserve"> follows Harvard referencing, and the underlying notebooks will be placed in a repository so that </w:t>
+        </w:r>
+      </w:ins>
+      <w:ins w:id="286" w:author="Microsoft Office User" w:date="2026-10-22T13:15:00Z" w16du:dateUtc="2026-10-22T12:15:00Z">
+        <w:r>
+          <w:t>the analysis can be reported.</w:t>
+        </w:r>
+      </w:ins>
+    </w:p>
+    <w:p>
+      <w:pPr>
+        <w:keepNext/>
+        <w:keepLines/>
+        <w:spacing w:before="480" w:after="0"/>
+        <w:outlineLvl w:val="0"/>
+        <w:rPr>
+          <w:ins w:id="287" w:author="Microsoft Office User" w:date="2026-10-22T13:16:00Z" w16du:dateUtc="2026-10-22T12:16:00Z"/>
+          <w:rFonts w:ascii="Calibri" w:eastAsia="MS Gothic" w:hAnsi="Calibri" w:cs="Times New Roman"/>
+          <w:b/>
+          <w:bCs/>
+          <w:color w:val="003366"/>
+          <w:sz w:val="28"/>
+          <w:szCs w:val="28"/>
+        </w:rPr>
+      </w:pPr>
+      <w:bookmarkStart w:id="288" w:name="_Toc243051554"/>
+      <w:ins w:id="289" w:author="Microsoft Office User" w:date="2026-10-22T13:16:00Z" w16du:dateUtc="2026-10-22T12:16:00Z">
+        <w:r>
+          <w:rPr>
+            <w:rFonts w:ascii="Calibri" w:eastAsia="MS Gothic" w:hAnsi="Calibri" w:cs="Times New Roman"/>
+            <w:b/>
+            <w:bCs/>
+            <w:color w:val="003366"/>
+            <w:sz w:val="28"/>
+            <w:szCs w:val="28"/>
+          </w:rPr>
+          <w:t>9. Project Timeline</w:t>
+        </w:r>
+        <w:bookmarkEnd w:id="288"/>
+      </w:ins>
+    </w:p>
+    <w:p>
+      <w:pPr>
+        <w:spacing w:line="360" w:lineRule="auto"/>
+        <w:ind w:firstLine="720"/>
+        <w:jc w:val="both"/>
+        <w:rPr>
+          <w:ins w:id="290" w:author="Microsoft Office User" w:date="2026-10-22T13:18:00Z" w16du:dateUtc="2026-10-22T12:18:00Z"/>
+        </w:rPr>
+      </w:pPr>
+      <w:ins w:id="291" w:author="Microsoft Office User" w:date="2026-10-22T13:16:00Z" w16du:dateUtc="2026-10-22T12:16:00Z">
+        <w:r>
+          <w:t>The project planned across two semesters</w:t>
+        </w:r>
+        <w:r>
+          <w:t>. I</w:t>
+        </w:r>
+      </w:ins>
+      <w:ins w:id="292" w:author="Microsoft Office User" w:date="2026-10-22T13:17:00Z" w16du:dateUtc="2026-10-22T12:17:00Z">
+        <w:r>
+          <w:t>n the first semester the focus will be on discovery and the preparation of the proposal, followed by data collection, cleaning and feature eng</w:t>
+        </w:r>
+      </w:ins>
+      <w:ins w:id="293" w:author="Microsoft Office User" w:date="2026-10-22T13:18:00Z" w16du:dateUtc="2026-10-22T12:18:00Z">
+        <w:r>
+          <w:t>ineering, and then exploratory analysis together with the first model prototypes.</w:t>
+        </w:r>
+      </w:ins>
+    </w:p>
+    <w:p>
+      <w:pPr>
+        <w:spacing w:line="360" w:lineRule="auto"/>
+        <w:ind w:firstLine="720"/>
+        <w:jc w:val="both"/>
+        <w:rPr>
+          <w:ins w:id="294" w:author="Microsoft Office User" w:date="2026-10-22T13:20:00Z" w16du:dateUtc="2026-10-22T12:20:00Z"/>
+        </w:rPr>
+      </w:pPr>
+      <w:ins w:id="295" w:author="Microsoft Office User" w:date="2026-10-22T13:18:00Z" w16du:dateUtc="2026-10-22T12:18:00Z">
+        <w:r>
+          <w:t xml:space="preserve">The second semester will </w:t>
+        </w:r>
+      </w:ins>
+      <w:ins w:id="296" w:author="Microsoft Office User" w:date="2026-10-22T13:23:00Z" w16du:dateUtc="2026-10-22T12:23:00Z">
+        <w:r>
+          <w:t>be devoted</w:t>
+        </w:r>
+      </w:ins>
+      <w:ins w:id="297" w:author="Microsoft Office User" w:date="2026-10-22T13:18:00Z" w16du:dateUtc="2026-10-22T12:18:00Z">
+        <w:r>
+          <w:t xml:space="preserve"> to the </w:t>
+        </w:r>
+      </w:ins>
+      <w:ins w:id="298" w:author="Microsoft Office User" w:date="2026-10-22T13:20:00Z" w16du:dateUtc="2026-10-22T12:20:00Z">
+        <w:r>
+          <w:t>full development</w:t>
+        </w:r>
+      </w:ins>
+      <w:ins w:id="299" w:author="Microsoft Office User" w:date="2026-10-22T13:19:00Z" w16du:dateUtc="2026-10-22T12:19:00Z">
+        <w:r>
+          <w:t xml:space="preserve"> and comparison of the chosen models, their </w:t>
+        </w:r>
+      </w:ins>
+      <w:ins w:id="300" w:author="Microsoft Office User" w:date="2026-10-22T13:20:00Z" w16du:dateUtc="2026-10-22T12:20:00Z">
+        <w:r>
+          <w:t>evaluation, the</w:t>
+        </w:r>
+      </w:ins>
+      <w:ins w:id="301" w:author="Microsoft Office User" w:date="2026-10-22T13:19:00Z" w16du:dateUtc="2026-10-22T12:19:00Z">
+        <w:r>
+          <w:t xml:space="preserve"> production of forecasting and recommendations, and finally the preparation of the dashboard concept and the fi</w:t>
+        </w:r>
+      </w:ins>
+      <w:ins w:id="302" w:author="Microsoft Office User" w:date="2026-10-22T13:20:00Z" w16du:dateUtc="2026-10-22T12:20:00Z">
+        <w:r>
+          <w:t>nal report.</w:t>
+        </w:r>
+      </w:ins>
+    </w:p>
+    <w:tbl>
+      <w:tblPr>
+        <w:tblStyle w:val="TableGrid"/>
+        <w:tblW w:w="0" w:type="auto"/>
+        <w:tblLook w:val="04A0" w:firstRow="1" w:lastRow="0" w:firstColumn="1" w:lastColumn="0" w:noHBand="0" w:noVBand="1"/>
+      </w:tblPr>
+      <w:tblGrid>
+        <w:gridCol w:w="2160"/>
+        <w:gridCol w:w="2160"/>
+        <w:gridCol w:w="2160"/>
+        <w:gridCol w:w="2160"/>
+      </w:tblGrid>
+      <w:tr>
+        <w:trPr>
+          <w:ins w:id="303" w:author="Microsoft Office User" w:date="2026-10-22T13:20:00Z" w16du:dateUtc="2026-10-22T12:20:00Z"/>
+        </w:trPr>
+        <w:tc>
+          <w:tcPr>
+            <w:tcW w:w="2160" w:type="dxa"/>
+          </w:tcPr>
+          <w:p>
+            <w:pPr>
+              <w:rPr>
+                <w:ins w:id="304" w:author="Microsoft Office User" w:date="2026-10-22T13:20:00Z" w16du:dateUtc="2026-10-22T12:20:00Z"/>
+              </w:rPr>
+            </w:pPr>
+            <w:ins w:id="305" w:author="Microsoft Office User" w:date="2026-10-22T13:20:00Z" w16du:dateUtc="2026-10-22T12:20:00Z">
+              <w:r>
+                <w:t>Phase</w:t>
+              </w:r>
+            </w:ins>
+          </w:p>
+        </w:tc>
+        <w:tc>
+          <w:tcPr>
+            <w:tcW w:w="2160" w:type="dxa"/>
+          </w:tcPr>
+          <w:p>
+            <w:pPr>
+              <w:rPr>
+                <w:ins w:id="306" w:author="Microsoft Office User" w:date="2026-10-22T13:20:00Z" w16du:dateUtc="2026-10-22T12:20:00Z"/>
+              </w:rPr>
+            </w:pPr>
+            <w:ins w:id="307" w:author="Microsoft Office User" w:date="2026-10-22T13:20:00Z" w16du:dateUtc="2026-10-22T12:20:00Z">
+              <w:r>
+                <w:t>Main activities</w:t>
+              </w:r>
+            </w:ins>
+          </w:p>
+        </w:tc>
+        <w:tc>
+          <w:tcPr>
+            <w:tcW w:w="2160" w:type="dxa"/>
+          </w:tcPr>
+          <w:p>
+            <w:pPr>
+              <w:rPr>
+                <w:ins w:id="308" w:author="Microsoft Office User" w:date="2026-10-22T13:20:00Z" w16du:dateUtc="2026-10-22T12:20:00Z"/>
+              </w:rPr>
+            </w:pPr>
+            <w:ins w:id="309" w:author="Microsoft Office User" w:date="2026-10-22T13:20:00Z" w16du:dateUtc="2026-10-22T12:20:00Z">
+              <w:r>
+                <w:t>Semester</w:t>
+              </w:r>
+            </w:ins>
+          </w:p>
+        </w:tc>
+        <w:tc>
+          <w:tcPr>
+            <w:tcW w:w="2160" w:type="dxa"/>
+          </w:tcPr>
+          <w:p>
+            <w:pPr>
+              <w:rPr>
+                <w:ins w:id="310" w:author="Microsoft Office User" w:date="2026-10-22T13:20:00Z" w16du:dateUtc="2026-10-22T12:20:00Z"/>
+              </w:rPr>
+            </w:pPr>
+            <w:ins w:id="311" w:author="Microsoft Office User" w:date="2026-10-22T13:20:00Z" w16du:dateUtc="2026-10-22T12:20:00Z">
+              <w:r>
+                <w:t>Indicative timing</w:t>
+              </w:r>
+            </w:ins>
+          </w:p>
+        </w:tc>
+      </w:tr>
+      <w:tr>
+        <w:trPr>
+          <w:ins w:id="312" w:author="Microsoft Office User" w:date="2026-10-22T13:20:00Z" w16du:dateUtc="2026-10-22T12:20:00Z"/>
+        </w:trPr>
+        <w:tc>
+          <w:tcPr>
+            <w:tcW w:w="2160" w:type="dxa"/>
+          </w:tcPr>
+          <w:p>
+            <w:pPr>
+              <w:rPr>
+                <w:ins w:id="313" w:author="Microsoft Office User" w:date="2026-10-22T13:20:00Z" w16du:dateUtc="2026-10-22T12:20:00Z"/>
+              </w:rPr>
+            </w:pPr>
+            <w:ins w:id="314" w:author="Microsoft Office User" w:date="2026-10-22T13:20:00Z" w16du:dateUtc="2026-10-22T12:20:00Z">
+              <w:r>
+                <w:t>Discovery and proposal</w:t>
+              </w:r>
+            </w:ins>
+          </w:p>
+        </w:tc>
+        <w:tc>
+          <w:tcPr>
+            <w:tcW w:w="2160" w:type="dxa"/>
+          </w:tcPr>
+          <w:p>
+            <w:pPr>
+              <w:rPr>
+                <w:ins w:id="315" w:author="Microsoft Office User" w:date="2026-10-22T13:20:00Z" w16du:dateUtc="2026-10-22T12:20:00Z"/>
+              </w:rPr>
+            </w:pPr>
+            <w:ins w:id="316" w:author="Microsoft Office User" w:date="2026-10-22T13:20:00Z" w16du:dateUtc="2026-10-22T12:20:00Z">
+              <w:r>
+                <w:t>Literature review, requirements, proposal</w:t>
+              </w:r>
+            </w:ins>
+          </w:p>
+        </w:tc>
+        <w:tc>
+          <w:tcPr>
+            <w:tcW w:w="2160" w:type="dxa"/>
+          </w:tcPr>
+          <w:p>
+            <w:pPr>
+              <w:rPr>
+                <w:ins w:id="317" w:author="Microsoft Office User" w:date="2026-10-22T13:20:00Z" w16du:dateUtc="2026-10-22T12:20:00Z"/>
+              </w:rPr>
+            </w:pPr>
+            <w:ins w:id="318" w:author="Microsoft Office User" w:date="2026-10-22T13:20:00Z" w16du:dateUtc="2026-10-22T12:20:00Z">
+              <w:r>
+                <w:t>1</w:t>
+              </w:r>
+            </w:ins>
+          </w:p>
+        </w:tc>
+        <w:tc>
+          <w:tcPr>
+            <w:tcW w:w="2160" w:type="dxa"/>
+          </w:tcPr>
+          <w:p>
+            <w:pPr>
+              <w:rPr>
+                <w:ins w:id="319" w:author="Microsoft Office User" w:date="2026-10-22T13:20:00Z" w16du:dateUtc="2026-10-22T12:20:00Z"/>
+              </w:rPr>
+            </w:pPr>
+            <w:ins w:id="320" w:author="Microsoft Office User" w:date="2026-10-22T13:20:00Z" w16du:dateUtc="2026-10-22T12:20:00Z">
+              <w:r>
+                <w:t>Weeks 1–4</w:t>
+              </w:r>
+            </w:ins>
+          </w:p>
+        </w:tc>
+      </w:tr>
+      <w:tr>
+        <w:trPr>
+          <w:ins w:id="321" w:author="Microsoft Office User" w:date="2026-10-22T13:20:00Z" w16du:dateUtc="2026-10-22T12:20:00Z"/>
+        </w:trPr>
+        <w:tc>
+          <w:tcPr>
+            <w:tcW w:w="2160" w:type="dxa"/>
+          </w:tcPr>
+          <w:p>
+            <w:pPr>
+              <w:rPr>
+                <w:ins w:id="322" w:author="Microsoft Office User" w:date="2026-10-22T13:20:00Z" w16du:dateUtc="2026-10-22T12:20:00Z"/>
+              </w:rPr>
+            </w:pPr>
+            <w:ins w:id="323" w:author="Microsoft Office User" w:date="2026-10-22T13:20:00Z" w16du:dateUtc="2026-10-22T12:20:00Z">
+              <w:r>
+                <w:t>Data preparation</w:t>
+              </w:r>
+            </w:ins>
+          </w:p>
+        </w:tc>
+        <w:tc>
+          <w:tcPr>
+            <w:tcW w:w="2160" w:type="dxa"/>
+          </w:tcPr>
+          <w:p>
+            <w:pPr>
+              <w:rPr>
+                <w:ins w:id="324" w:author="Microsoft Office User" w:date="2026-10-22T13:20:00Z" w16du:dateUtc="2026-10-22T12:20:00Z"/>
+              </w:rPr>
+            </w:pPr>
+            <w:ins w:id="325" w:author="Microsoft Office User" w:date="2026-10-22T13:20:00Z" w16du:dateUtc="2026-10-22T12:20:00Z">
+              <w:r>
+                <w:t>Download, cleaning, reshaping, features</w:t>
+              </w:r>
+            </w:ins>
+          </w:p>
+        </w:tc>
+        <w:tc>
+          <w:tcPr>
+            <w:tcW w:w="2160" w:type="dxa"/>
+          </w:tcPr>
+          <w:p>
+            <w:pPr>
+              <w:rPr>
+                <w:ins w:id="326" w:author="Microsoft Office User" w:date="2026-10-22T13:20:00Z" w16du:dateUtc="2026-10-22T12:20:00Z"/>
+              </w:rPr>
+            </w:pPr>
+            <w:ins w:id="327" w:author="Microsoft Office User" w:date="2026-10-22T13:20:00Z" w16du:dateUtc="2026-10-22T12:20:00Z">
+              <w:r>
+                <w:t>1</w:t>
+              </w:r>
+            </w:ins>
+          </w:p>
+        </w:tc>
+        <w:tc>
+          <w:tcPr>
+            <w:tcW w:w="2160" w:type="dxa"/>
+          </w:tcPr>
+          <w:p>
+            <w:pPr>
+              <w:rPr>
+                <w:ins w:id="328" w:author="Microsoft Office User" w:date="2026-10-22T13:20:00Z" w16du:dateUtc="2026-10-22T12:20:00Z"/>
+              </w:rPr>
+            </w:pPr>
+            <w:ins w:id="329" w:author="Microsoft Office User" w:date="2026-10-22T13:20:00Z" w16du:dateUtc="2026-10-22T12:20:00Z">
+              <w:r>
+                <w:t>Weeks 5–8</w:t>
+              </w:r>
+            </w:ins>
+          </w:p>
+        </w:tc>
+      </w:tr>
+      <w:tr>
+        <w:trPr>
+          <w:ins w:id="330" w:author="Microsoft Office User" w:date="2026-10-22T13:20:00Z" w16du:dateUtc="2026-10-22T12:20:00Z"/>
+        </w:trPr>
+        <w:tc>
+          <w:tcPr>
+            <w:tcW w:w="2160" w:type="dxa"/>
+          </w:tcPr>
+          <w:p>
+            <w:pPr>
+              <w:rPr>
+                <w:ins w:id="331" w:author="Microsoft Office User" w:date="2026-10-22T13:20:00Z" w16du:dateUtc="2026-10-22T12:20:00Z"/>
+              </w:rPr>
+            </w:pPr>
+            <w:ins w:id="332" w:author="Microsoft Office User" w:date="2026-10-22T13:20:00Z" w16du:dateUtc="2026-10-22T12:20:00Z">
+              <w:r>
+                <w:t>EDA and initial modelling</w:t>
+              </w:r>
+            </w:ins>
+          </w:p>
+        </w:tc>
+        <w:tc>
+          <w:tcPr>
+            <w:tcW w:w="2160" w:type="dxa"/>
+          </w:tcPr>
+          <w:p>
+            <w:pPr>
+              <w:rPr>
+                <w:ins w:id="333" w:author="Microsoft Office User" w:date="2026-10-22T13:20:00Z" w16du:dateUtc="2026-10-22T12:20:00Z"/>
+              </w:rPr>
+            </w:pPr>
+            <w:ins w:id="334" w:author="Microsoft Office User" w:date="2026-10-22T13:20:00Z" w16du:dateUtc="2026-10-22T12:20:00Z">
+              <w:r>
+                <w:t>Exploratory analysis and first prototypes</w:t>
+              </w:r>
+            </w:ins>
+          </w:p>
+        </w:tc>
+        <w:tc>
+          <w:tcPr>
+            <w:tcW w:w="2160" w:type="dxa"/>
+          </w:tcPr>
+          <w:p>
+            <w:pPr>
+              <w:rPr>
+                <w:ins w:id="335" w:author="Microsoft Office User" w:date="2026-10-22T13:20:00Z" w16du:dateUtc="2026-10-22T12:20:00Z"/>
+              </w:rPr>
+            </w:pPr>
+            <w:ins w:id="336" w:author="Microsoft Office User" w:date="2026-10-22T13:20:00Z" w16du:dateUtc="2026-10-22T12:20:00Z">
+              <w:r>
+                <w:t>1</w:t>
+              </w:r>
+            </w:ins>
+          </w:p>
+        </w:tc>
+        <w:tc>
+          <w:tcPr>
+            <w:tcW w:w="2160" w:type="dxa"/>
+          </w:tcPr>
+          <w:p>
+            <w:pPr>
+              <w:rPr>
+                <w:ins w:id="337" w:author="Microsoft Office User" w:date="2026-10-22T13:20:00Z" w16du:dateUtc="2026-10-22T12:20:00Z"/>
+              </w:rPr>
+            </w:pPr>
+            <w:ins w:id="338" w:author="Microsoft Office User" w:date="2026-10-22T13:20:00Z" w16du:dateUtc="2026-10-22T12:20:00Z">
+              <w:r>
+                <w:t>Weeks 9–12</w:t>
+              </w:r>
+            </w:ins>
+          </w:p>
+        </w:tc>
+      </w:tr>
+      <w:tr>
+        <w:trPr>
+          <w:ins w:id="339" w:author="Microsoft Office User" w:date="2026-10-22T13:20:00Z" w16du:dateUtc="2026-10-22T12:20:00Z"/>
+        </w:trPr>
+        <w:tc>
+          <w:tcPr>
+            <w:tcW w:w="2160" w:type="dxa"/>
+          </w:tcPr>
+          <w:p>
+            <w:pPr>
+              <w:rPr>
+                <w:ins w:id="340" w:author="Microsoft Office User" w:date="2026-10-22T13:20:00Z" w16du:dateUtc="2026-10-22T12:20:00Z"/>
+              </w:rPr>
+            </w:pPr>
+            <w:ins w:id="341" w:author="Microsoft Office User" w:date="2026-10-22T13:20:00Z" w16du:dateUtc="2026-10-22T12:20:00Z">
+              <w:r>
+                <w:t>Model development</w:t>
+              </w:r>
+            </w:ins>
+          </w:p>
+        </w:tc>
+        <w:tc>
+          <w:tcPr>
+            <w:tcW w:w="2160" w:type="dxa"/>
+          </w:tcPr>
+          <w:p>
+            <w:pPr>
+              <w:rPr>
+                <w:ins w:id="342" w:author="Microsoft Office User" w:date="2026-10-22T13:20:00Z" w16du:dateUtc="2026-10-22T12:20:00Z"/>
+              </w:rPr>
+            </w:pPr>
+            <w:ins w:id="343" w:author="Microsoft Office User" w:date="2026-10-22T13:20:00Z" w16du:dateUtc="2026-10-22T12:20:00Z">
+              <w:r>
+                <w:t>Full implementation, tuning and comparison</w:t>
+              </w:r>
+            </w:ins>
+          </w:p>
+        </w:tc>
+        <w:tc>
+          <w:tcPr>
+            <w:tcW w:w="2160" w:type="dxa"/>
+          </w:tcPr>
+          <w:p>
+            <w:pPr>
+              <w:rPr>
+                <w:ins w:id="344" w:author="Microsoft Office User" w:date="2026-10-22T13:20:00Z" w16du:dateUtc="2026-10-22T12:20:00Z"/>
+              </w:rPr>
+            </w:pPr>
+            <w:ins w:id="345" w:author="Microsoft Office User" w:date="2026-10-22T13:20:00Z" w16du:dateUtc="2026-10-22T12:20:00Z">
+              <w:r>
+                <w:t>2</w:t>
+              </w:r>
+            </w:ins>
+          </w:p>
+        </w:tc>
+        <w:tc>
+          <w:tcPr>
+            <w:tcW w:w="2160" w:type="dxa"/>
+          </w:tcPr>
+          <w:p>
+            <w:pPr>
+              <w:rPr>
+                <w:ins w:id="346" w:author="Microsoft Office User" w:date="2026-10-22T13:20:00Z" w16du:dateUtc="2026-10-22T12:20:00Z"/>
+              </w:rPr>
+            </w:pPr>
+            <w:ins w:id="347" w:author="Microsoft Office User" w:date="2026-10-22T13:20:00Z" w16du:dateUtc="2026-10-22T12:20:00Z">
+              <w:r>
+                <w:t>Weeks 1–6</w:t>
+              </w:r>
+            </w:ins>
+          </w:p>
+        </w:tc>
+      </w:tr>
+      <w:tr>
+        <w:trPr>
+          <w:ins w:id="348" w:author="Microsoft Office User" w:date="2026-10-22T13:20:00Z" w16du:dateUtc="2026-10-22T12:20:00Z"/>
+        </w:trPr>
+        <w:tc>
+          <w:tcPr>
+            <w:tcW w:w="2160" w:type="dxa"/>
+          </w:tcPr>
+          <w:p>
+            <w:pPr>
+              <w:rPr>
+                <w:ins w:id="349" w:author="Microsoft Office User" w:date="2026-10-22T13:20:00Z" w16du:dateUtc="2026-10-22T12:20:00Z"/>
+              </w:rPr>
+            </w:pPr>
+            <w:ins w:id="350" w:author="Microsoft Office User" w:date="2026-10-22T13:20:00Z" w16du:dateUtc="2026-10-22T12:20:00Z">
+              <w:r>
+                <w:t>Evaluation and insights</w:t>
+              </w:r>
+            </w:ins>
+          </w:p>
+        </w:tc>
+        <w:tc>
+          <w:tcPr>
+            <w:tcW w:w="2160" w:type="dxa"/>
+          </w:tcPr>
+          <w:p>
+            <w:pPr>
+              <w:rPr>
+                <w:ins w:id="351" w:author="Microsoft Office User" w:date="2026-10-22T13:20:00Z" w16du:dateUtc="2026-10-22T12:20:00Z"/>
+              </w:rPr>
+            </w:pPr>
+            <w:ins w:id="352" w:author="Microsoft Office User" w:date="2026-10-22T13:20:00Z" w16du:dateUtc="2026-10-22T12:20:00Z">
+              <w:r>
+                <w:t>Performance assessment and recommendations</w:t>
+              </w:r>
+            </w:ins>
+          </w:p>
+        </w:tc>
+        <w:tc>
+          <w:tcPr>
+            <w:tcW w:w="2160" w:type="dxa"/>
+          </w:tcPr>
+          <w:p>
+            <w:pPr>
+              <w:rPr>
+                <w:ins w:id="353" w:author="Microsoft Office User" w:date="2026-10-22T13:20:00Z" w16du:dateUtc="2026-10-22T12:20:00Z"/>
+              </w:rPr>
+            </w:pPr>
+            <w:ins w:id="354" w:author="Microsoft Office User" w:date="2026-10-22T13:20:00Z" w16du:dateUtc="2026-10-22T12:20:00Z">
+              <w:r>
+                <w:t>2</w:t>
+              </w:r>
+            </w:ins>
+          </w:p>
+        </w:tc>
+        <w:tc>
+          <w:tcPr>
+            <w:tcW w:w="2160" w:type="dxa"/>
+          </w:tcPr>
+          <w:p>
+            <w:pPr>
+              <w:rPr>
+                <w:ins w:id="355" w:author="Microsoft Office User" w:date="2026-10-22T13:20:00Z" w16du:dateUtc="2026-10-22T12:20:00Z"/>
+              </w:rPr>
+            </w:pPr>
+            <w:ins w:id="356" w:author="Microsoft Office User" w:date="2026-10-22T13:20:00Z" w16du:dateUtc="2026-10-22T12:20:00Z">
+              <w:r>
+                <w:t>Weeks 7–10</w:t>
+              </w:r>
+            </w:ins>
+          </w:p>
+        </w:tc>
+      </w:tr>
+      <w:tr>
+        <w:trPr>
+          <w:ins w:id="357" w:author="Microsoft Office User" w:date="2026-10-22T13:20:00Z" w16du:dateUtc="2026-10-22T12:20:00Z"/>
+        </w:trPr>
+        <w:tc>
+          <w:tcPr>
+            <w:tcW w:w="2160" w:type="dxa"/>
+          </w:tcPr>
+          <w:p>
+            <w:pPr>
+              <w:rPr>
+                <w:ins w:id="358" w:author="Microsoft Office User" w:date="2026-10-22T13:20:00Z" w16du:dateUtc="2026-10-22T12:20:00Z"/>
+              </w:rPr>
+            </w:pPr>
+            <w:ins w:id="359" w:author="Microsoft Office User" w:date="2026-10-22T13:20:00Z" w16du:dateUtc="2026-10-22T12:20:00Z">
+              <w:r>
+                <w:t>Reporting</w:t>
+              </w:r>
+            </w:ins>
+          </w:p>
+        </w:tc>
+        <w:tc>
+          <w:tcPr>
+            <w:tcW w:w="2160" w:type="dxa"/>
+          </w:tcPr>
+          <w:p>
+            <w:pPr>
+              <w:rPr>
+                <w:ins w:id="360" w:author="Microsoft Office User" w:date="2026-10-22T13:20:00Z" w16du:dateUtc="2026-10-22T12:20:00Z"/>
+              </w:rPr>
+            </w:pPr>
+            <w:ins w:id="361" w:author="Microsoft Office User" w:date="2026-10-22T13:20:00Z" w16du:dateUtc="2026-10-22T12:20:00Z">
+              <w:r>
+                <w:t>Dashboard concept, final report, documentation</w:t>
+              </w:r>
+            </w:ins>
+          </w:p>
+        </w:tc>
+        <w:tc>
+          <w:tcPr>
+            <w:tcW w:w="2160" w:type="dxa"/>
+          </w:tcPr>
+          <w:p>
+            <w:pPr>
+              <w:rPr>
+                <w:ins w:id="362" w:author="Microsoft Office User" w:date="2026-10-22T13:20:00Z" w16du:dateUtc="2026-10-22T12:20:00Z"/>
+              </w:rPr>
+            </w:pPr>
+            <w:ins w:id="363" w:author="Microsoft Office User" w:date="2026-10-22T13:20:00Z" w16du:dateUtc="2026-10-22T12:20:00Z">
+              <w:r>
+                <w:t>2</w:t>
+              </w:r>
+            </w:ins>
+          </w:p>
+        </w:tc>
+        <w:tc>
+          <w:tcPr>
+            <w:tcW w:w="2160" w:type="dxa"/>
+          </w:tcPr>
+          <w:p>
+            <w:pPr>
+              <w:rPr>
+                <w:ins w:id="364" w:author="Microsoft Office User" w:date="2026-10-22T13:20:00Z" w16du:dateUtc="2026-10-22T12:20:00Z"/>
+              </w:rPr>
+            </w:pPr>
+            <w:ins w:id="365" w:author="Microsoft Office User" w:date="2026-10-22T13:20:00Z" w16du:dateUtc="2026-10-22T12:20:00Z">
+              <w:r>
+                <w:t>Weeks 11–14</w:t>
+              </w:r>
+            </w:ins>
+          </w:p>
+        </w:tc>
+      </w:tr>
+    </w:tbl>
+    <w:p>
+      <w:pPr>
+        <w:spacing w:line="360" w:lineRule="auto"/>
+        <w:ind w:firstLine="720"/>
+        <w:jc w:val="both"/>
+        <w:rPr>
+          <w:ins w:id="366" w:author="Microsoft Office User" w:date="2026-10-22T13:23:00Z" w16du:dateUtc="2026-10-22T12:23:00Z"/>
+        </w:rPr>
+      </w:pPr>
+      <w:ins w:id="367" w:author="Microsoft Office User" w:date="2026-10-22T13:20:00Z" w16du:dateUtc="2026-10-22T12:20:00Z">
+        <w:r>
+          <w:t>Key mil</w:t>
+        </w:r>
+      </w:ins>
+      <w:ins w:id="368" w:author="Microsoft Office User" w:date="2026-10-22T13:21:00Z" w16du:dateUtc="2026-10-22T12:21:00Z">
+        <w:r>
+          <w:t xml:space="preserve">estones include the completion of the cleaned dataset at the end of the first semester, the selection of the best-performing model around the middle of the second semester, and </w:t>
+        </w:r>
+      </w:ins>
+      <w:ins w:id="369" w:author="Microsoft Office User" w:date="2026-10-22T13:22:00Z" w16du:dateUtc="2026-10-22T12:22:00Z">
+        <w:r>
+          <w:t>the submission of the final report and dashboard concept at the end of the second semester.</w:t>
+        </w:r>
+      </w:ins>
+    </w:p>
+    <w:p>
+      <w:pPr>
+        <w:keepNext/>
+        <w:keepLines/>
+        <w:spacing w:before="480" w:after="0"/>
+        <w:outlineLvl w:val="0"/>
+        <w:rPr>
+          <w:ins w:id="370" w:author="Microsoft Office User" w:date="2026-10-22T13:23:00Z" w16du:dateUtc="2026-10-22T12:23:00Z"/>
+          <w:rFonts w:ascii="Calibri" w:eastAsia="MS Gothic" w:hAnsi="Calibri" w:cs="Times New Roman"/>
+          <w:b/>
+          <w:bCs/>
+          <w:color w:val="003366"/>
+          <w:sz w:val="28"/>
+          <w:szCs w:val="28"/>
+        </w:rPr>
+      </w:pPr>
+      <w:bookmarkStart w:id="371" w:name="_Toc243051555"/>
+      <w:ins w:id="372" w:author="Microsoft Office User" w:date="2026-10-22T13:23:00Z" w16du:dateUtc="2026-10-22T12:23:00Z">
+        <w:r>
+          <w:rPr>
+            <w:rFonts w:ascii="Calibri" w:eastAsia="MS Gothic" w:hAnsi="Calibri" w:cs="Times New Roman"/>
+            <w:b/>
+            <w:bCs/>
+            <w:color w:val="003366"/>
+            <w:sz w:val="28"/>
+            <w:szCs w:val="28"/>
+          </w:rPr>
+          <w:t>10. Ethical and Legal Considerations</w:t>
+        </w:r>
+        <w:bookmarkEnd w:id="371"/>
+      </w:ins>
+    </w:p>
+    <w:p>
+      <w:pPr>
+        <w:spacing w:line="360" w:lineRule="auto"/>
+        <w:ind w:firstLine="720"/>
+        <w:jc w:val="both"/>
+        <w:rPr>
+          <w:ins w:id="373" w:author="Microsoft Office User" w:date="2026-10-22T13:25:00Z" w16du:dateUtc="2026-10-22T12:25:00Z"/>
+        </w:rPr>
+      </w:pPr>
+      <w:ins w:id="374" w:author="Microsoft Office User" w:date="2026-10-22T13:24:00Z" w16du:dateUtc="2026-10-22T12:24:00Z">
+        <w:r>
+          <w:t>Only publicity available aggregated statistics from Eurostat will be used. There are no personal data in the file, so ordinary privac</w:t>
+        </w:r>
+      </w:ins>
+      <w:ins w:id="375" w:author="Microsoft Office User" w:date="2026-10-22T13:25:00Z" w16du:dateUtc="2026-10-22T12:25:00Z">
+        <w:r>
+          <w:t xml:space="preserve">y and GDPR concerns that arise with individual </w:t>
+        </w:r>
+        <w:r>
+          <w:lastRenderedPageBreak/>
+          <w:t>records do not apply here. The data may be used for academic work provided the source is acknowledged.</w:t>
+        </w:r>
+      </w:ins>
+    </w:p>
+    <w:p>
+      <w:pPr>
+        <w:spacing w:line="360" w:lineRule="auto"/>
+        <w:ind w:firstLine="720"/>
+        <w:jc w:val="both"/>
+        <w:rPr>
+          <w:ins w:id="376" w:author="Microsoft Office User" w:date="2026-10-22T13:29:00Z" w16du:dateUtc="2026-10-22T12:29:00Z"/>
+        </w:rPr>
+      </w:pPr>
+      <w:ins w:id="377" w:author="Microsoft Office User" w:date="2026-10-22T13:25:00Z" w16du:dateUtc="2026-10-22T12:25:00Z">
+        <w:r>
+          <w:t>An</w:t>
+        </w:r>
+      </w:ins>
+      <w:ins w:id="378" w:author="Microsoft Office User" w:date="2026-10-22T13:26:00Z" w16du:dateUtc="2026-10-22T12:26:00Z">
+        <w:r>
+          <w:t>y forecast will be presented with a clear indication of their uncertainty and of the limitations of the models, so that they are not treated as precise predictions.</w:t>
+        </w:r>
+      </w:ins>
+      <w:ins w:id="379" w:author="Microsoft Office User" w:date="2026-10-22T13:27:00Z" w16du:dateUtc="2026-10-22T12:27:00Z">
+        <w:r>
+          <w:t xml:space="preserve"> The steps taken to clean the data and the assumptions behind the models will be described so that </w:t>
+        </w:r>
+      </w:ins>
+      <w:ins w:id="380" w:author="Microsoft Office User" w:date="2026-10-22T13:29:00Z" w16du:dateUtc="2026-10-22T12:29:00Z">
+        <w:r>
+          <w:t>the</w:t>
+        </w:r>
+      </w:ins>
+      <w:ins w:id="381" w:author="Microsoft Office User" w:date="2026-10-22T13:27:00Z" w16du:dateUtc="2026-10-22T12:27:00Z">
+        <w:r>
+          <w:t xml:space="preserve"> work can be checked. Results will be discussed in context </w:t>
+        </w:r>
+      </w:ins>
+      <w:ins w:id="382" w:author="Microsoft Office User" w:date="2026-10-22T13:28:00Z" w16du:dateUtc="2026-10-22T12:28:00Z">
+        <w:r>
+          <w:t xml:space="preserve">rather than as simple rankings of destinations. Normal academic </w:t>
+        </w:r>
+      </w:ins>
+      <w:ins w:id="383" w:author="Microsoft Office User" w:date="2026-10-22T13:29:00Z" w16du:dateUtc="2026-10-22T12:29:00Z">
+        <w:r>
+          <w:t>referencing</w:t>
+        </w:r>
+      </w:ins>
+      <w:ins w:id="384" w:author="Microsoft Office User" w:date="2026-10-22T13:28:00Z" w16du:dateUtc="2026-10-22T12:28:00Z">
+        <w:r>
+          <w:t xml:space="preserve"> practice will be followed throughout.</w:t>
+        </w:r>
+      </w:ins>
+    </w:p>
+    <w:p>
+      <w:pPr>
+        <w:keepNext/>
+        <w:keepLines/>
+        <w:spacing w:before="480" w:after="0"/>
+        <w:outlineLvl w:val="0"/>
+        <w:rPr>
+          <w:ins w:id="385" w:author="Microsoft Office User" w:date="2026-10-22T13:29:00Z" w16du:dateUtc="2026-10-22T12:29:00Z"/>
+          <w:rFonts w:ascii="Calibri" w:eastAsia="MS Gothic" w:hAnsi="Calibri" w:cs="Times New Roman"/>
+          <w:b/>
+          <w:bCs/>
+          <w:color w:val="003366"/>
+          <w:sz w:val="28"/>
+          <w:szCs w:val="28"/>
+        </w:rPr>
+      </w:pPr>
+      <w:bookmarkStart w:id="386" w:name="_Toc243051556"/>
+      <w:ins w:id="387" w:author="Microsoft Office User" w:date="2026-10-22T13:29:00Z" w16du:dateUtc="2026-10-22T12:29:00Z">
+        <w:r>
+          <w:rPr>
+            <w:rFonts w:ascii="Calibri" w:eastAsia="MS Gothic" w:hAnsi="Calibri" w:cs="Times New Roman"/>
+            <w:b/>
+            <w:bCs/>
+            <w:color w:val="003366"/>
+            <w:sz w:val="28"/>
+            <w:szCs w:val="28"/>
+          </w:rPr>
+          <w:t>References</w:t>
+        </w:r>
+        <w:bookmarkEnd w:id="386"/>
+      </w:ins>
+    </w:p>
+    <w:p>
+      <w:pPr>
+        <w:spacing w:line="360" w:lineRule="auto"/>
+        <w:ind w:left="720" w:hanging="720"/>
+        <w:jc w:val="both"/>
+        <w:rPr>
+          <w:ins w:id="388" w:author="Microsoft Office User" w:date="2026-10-22T13:29:00Z" w16du:dateUtc="2026-10-22T12:29:00Z"/>
+          <w:rFonts w:eastAsia="MS Mincho" w:cs="Times New Roman"/>
+        </w:rPr>
+      </w:pPr>
+      <w:ins w:id="389" w:author="Microsoft Office User" w:date="2026-10-22T13:29:00Z" w16du:dateUtc="2026-10-22T12:29:00Z">
+        <w:r>
+          <w:rPr>
+            <w:rFonts w:eastAsia="MS Mincho" w:cs="Times New Roman"/>
+          </w:rPr>
+          <w:t>Eurostat (2026) Trips by month of departure [</w:t>
+        </w:r>
+        <w:proofErr w:type="spellStart"/>
+        <w:r>
+          <w:rPr>
+            <w:rFonts w:eastAsia="MS Mincho" w:cs="Times New Roman"/>
+          </w:rPr>
+          <w:t>tour_dem_ttmd</w:t>
+        </w:r>
+        <w:proofErr w:type="spellEnd"/>
+        <w:r>
+          <w:rPr>
+            <w:rFonts w:eastAsia="MS Mincho" w:cs="Times New Roman"/>
+          </w:rPr>
+          <w:t>]. Available at: https://ec.europa.eu/eurostat/databrowser/view/tour_dem_ttmd/default/table?lang=en (Accessed: 16 October 2026). DOI: 10.2908/</w:t>
+        </w:r>
+        <w:proofErr w:type="spellStart"/>
+        <w:r>
+          <w:rPr>
+            <w:rFonts w:eastAsia="MS Mincho" w:cs="Times New Roman"/>
+          </w:rPr>
+          <w:t>tour_dem_ttmd</w:t>
+        </w:r>
+        <w:proofErr w:type="spellEnd"/>
+        <w:r>
+          <w:rPr>
+            <w:rFonts w:eastAsia="MS Mincho" w:cs="Times New Roman"/>
+          </w:rPr>
+          <w:t>.</w:t>
+        </w:r>
+      </w:ins>
+    </w:p>
+    <w:p>
+      <w:pPr>
+        <w:spacing w:line="360" w:lineRule="auto"/>
+        <w:ind w:left="720" w:hanging="720"/>
+        <w:jc w:val="both"/>
+        <w:rPr>
+          <w:ins w:id="390" w:author="Microsoft Office User" w:date="2026-10-22T13:29:00Z" w16du:dateUtc="2026-10-22T12:29:00Z"/>
+          <w:rFonts w:eastAsia="MS Mincho" w:cs="Times New Roman"/>
+        </w:rPr>
+      </w:pPr>
+      <w:ins w:id="391" w:author="Microsoft Office User" w:date="2026-10-22T13:29:00Z" w16du:dateUtc="2026-10-22T12:29:00Z">
+        <w:r>
+          <w:rPr>
+            <w:rFonts w:eastAsia="MS Mincho" w:cs="Times New Roman"/>
+          </w:rPr>
+          <w:t>Eurostat (2025) Tourism statistics – Statistics Explained. Available at: https://ec.europa.eu/eurostat/statistics-explained/index.php?title=Tourism_statistics (Accessed: 16 October 2026).</w:t>
+        </w:r>
+      </w:ins>
+    </w:p>
+    <w:p>
+      <w:pPr>
+        <w:spacing w:line="360" w:lineRule="auto"/>
+        <w:ind w:left="720" w:hanging="720"/>
+        <w:jc w:val="both"/>
+        <w:rPr>
+          <w:ins w:id="392" w:author="Microsoft Office User" w:date="2026-10-22T13:29:00Z" w16du:dateUtc="2026-10-22T12:29:00Z"/>
+          <w:rFonts w:eastAsia="MS Mincho" w:cs="Times New Roman"/>
+        </w:rPr>
+      </w:pPr>
+      <w:ins w:id="393" w:author="Microsoft Office User" w:date="2026-10-22T13:29:00Z" w16du:dateUtc="2026-10-22T12:29:00Z">
+        <w:r>
+          <w:rPr>
+            <w:rFonts w:eastAsia="MS Mincho" w:cs="Times New Roman"/>
+          </w:rPr>
+          <w:t xml:space="preserve">Hyndman, R.J. and </w:t>
+        </w:r>
+        <w:proofErr w:type="spellStart"/>
+        <w:r>
+          <w:rPr>
+            <w:rFonts w:eastAsia="MS Mincho" w:cs="Times New Roman"/>
+          </w:rPr>
+          <w:t>Athanasopoulos</w:t>
+        </w:r>
+        <w:proofErr w:type="spellEnd"/>
+        <w:r>
+          <w:rPr>
+            <w:rFonts w:eastAsia="MS Mincho" w:cs="Times New Roman"/>
+          </w:rPr>
+          <w:t xml:space="preserve">, G. (2021) Forecasting: Principles and Practice. 3rd </w:t>
+        </w:r>
+        <w:proofErr w:type="spellStart"/>
+        <w:r>
+          <w:rPr>
+            <w:rFonts w:eastAsia="MS Mincho" w:cs="Times New Roman"/>
+          </w:rPr>
+          <w:t>edn</w:t>
+        </w:r>
+        <w:proofErr w:type="spellEnd"/>
+        <w:r>
+          <w:rPr>
+            <w:rFonts w:eastAsia="MS Mincho" w:cs="Times New Roman"/>
+          </w:rPr>
+          <w:t xml:space="preserve">. </w:t>
+        </w:r>
+        <w:proofErr w:type="spellStart"/>
+        <w:r>
+          <w:rPr>
+            <w:rFonts w:eastAsia="MS Mincho" w:cs="Times New Roman"/>
+          </w:rPr>
+          <w:t>OTexts</w:t>
+        </w:r>
+        <w:proofErr w:type="spellEnd"/>
+        <w:r>
+          <w:rPr>
+            <w:rFonts w:eastAsia="MS Mincho" w:cs="Times New Roman"/>
+          </w:rPr>
+          <w:t>.</w:t>
+        </w:r>
+      </w:ins>
+    </w:p>
+    <w:p>
+      <w:pPr>
+        <w:spacing w:line="360" w:lineRule="auto"/>
+        <w:ind w:left="720" w:hanging="720"/>
+        <w:jc w:val="both"/>
+        <w:rPr>
+          <w:ins w:id="394" w:author="Microsoft Office User" w:date="2026-10-22T13:29:00Z" w16du:dateUtc="2026-10-22T12:29:00Z"/>
+          <w:rFonts w:eastAsia="MS Mincho" w:cs="Times New Roman"/>
+        </w:rPr>
+      </w:pPr>
+      <w:ins w:id="395" w:author="Microsoft Office User" w:date="2026-10-22T13:29:00Z" w16du:dateUtc="2026-10-22T12:29:00Z">
+        <w:r>
+          <w:rPr>
+            <w:rFonts w:eastAsia="MS Mincho" w:cs="Times New Roman"/>
+          </w:rPr>
+          <w:t>Taylor, S.J. and Letham, B. (2018) ‘Forecasting at scale’, The American Statistician, 72(1), pp. 37–45.</w:t>
+        </w:r>
+      </w:ins>
+    </w:p>
+    <w:p>
+      <w:pPr>
+        <w:spacing w:line="360" w:lineRule="auto"/>
+        <w:ind w:firstLine="720"/>
+        <w:jc w:val="both"/>
+        <w:pPrChange w:id="396" w:author="Microsoft Office User" w:date="2026-10-21T19:29:00Z" w16du:dateUtc="2026-10-21T18:29:00Z">
           <w:pPr/>
         </w:pPrChange>
       </w:pPr>
@@ -2548,7 +5289,7 @@
     <w:lsdException w:name="Table Web 2" w:semiHidden="1" w:unhideWhenUsed="1"/>
     <w:lsdException w:name="Table Web 3" w:semiHidden="1" w:unhideWhenUsed="1"/>
     <w:lsdException w:name="Balloon Text" w:semiHidden="1" w:unhideWhenUsed="1"/>
-    <w:lsdException w:name="Table Grid" w:uiPriority="39"/>
+    <w:lsdException w:name="Table Grid" w:uiPriority="59"/>
     <w:lsdException w:name="Table Theme" w:semiHidden="1" w:unhideWhenUsed="1"/>
     <w:lsdException w:name="Placeholder Text" w:semiHidden="1"/>
     <w:lsdException w:name="No Spacing" w:uiPriority="1" w:qFormat="1"/>
@@ -3319,6 +6060,56 @@
       <w14:ligatures w14:val="none"/>
     </w:rPr>
   </w:style>
+  <w:style w:type="table" w:styleId="TableGrid">
+    <w:name w:val="Table Grid"/>
+    <w:basedOn w:val="TableNormal"/>
+    <w:uiPriority w:val="59"/>
+    <w:rsid w:val="00030886"/>
+    <w:pPr>
+      <w:spacing w:after="0" w:line="240" w:lineRule="auto"/>
+    </w:pPr>
+    <w:rPr>
+      <w:rFonts w:eastAsiaTheme="minorEastAsia"/>
+      <w:kern w:val="0"/>
+      <w:sz w:val="22"/>
+      <w:szCs w:val="22"/>
+      <w:lang w:val="en-US"/>
+      <w14:ligatures w14:val="none"/>
+    </w:rPr>
+    <w:tblPr>
+      <w:tblBorders>
+        <w:top w:val="single" w:sz="4" w:space="0" w:color="auto"/>
+        <w:left w:val="single" w:sz="4" w:space="0" w:color="auto"/>
+        <w:bottom w:val="single" w:sz="4" w:space="0" w:color="auto"/>
+        <w:right w:val="single" w:sz="4" w:space="0" w:color="auto"/>
+        <w:insideH w:val="single" w:sz="4" w:space="0" w:color="auto"/>
+        <w:insideV w:val="single" w:sz="4" w:space="0" w:color="auto"/>
+      </w:tblBorders>
+    </w:tblPr>
+  </w:style>
+  <w:style w:type="paragraph" w:styleId="TOC1">
+    <w:name w:val="toc 1"/>
+    <w:basedOn w:val="Normal"/>
+    <w:next w:val="Normal"/>
+    <w:autoRedefine/>
+    <w:uiPriority w:val="39"/>
+    <w:unhideWhenUsed/>
+    <w:rsid w:val="003D3572"/>
+    <w:pPr>
+      <w:spacing w:after="100"/>
+    </w:pPr>
+  </w:style>
+  <w:style w:type="character" w:styleId="Hyperlink">
+    <w:name w:val="Hyperlink"/>
+    <w:basedOn w:val="DefaultParagraphFont"/>
+    <w:uiPriority w:val="99"/>
+    <w:unhideWhenUsed/>
+    <w:rsid w:val="003D3572"/>
+    <w:rPr>
+      <w:color w:val="467886" w:themeColor="hyperlink"/>
+      <w:u w:val="single"/>
+    </w:rPr>
+  </w:style>
 </w:styles>
 </file>
 
@@ -3622,7 +6413,7 @@
 </file>
 
 <file path=customXml/itemProps1.xml><?xml version="1.0" encoding="utf-8"?>
-<ds:datastoreItem xmlns:ds="http://schemas.openxmlformats.org/officeDocument/2006/customXml" ds:itemID="{113713E3-63A1-8445-A92E-71CFB53140E6}">
+<ds:datastoreItem xmlns:ds="http://schemas.openxmlformats.org/officeDocument/2006/customXml" ds:itemID="{D5B1CF3E-18D0-6240-B83E-EAB27EA6355D}">
   <ds:schemaRefs>
     <ds:schemaRef ds:uri="http://schemas.openxmlformats.org/officeDocument/2006/bibliography"/>
   </ds:schemaRefs>

</xml_diff>